<commit_message>
Fix: paraIds duplicados quebravam abertura no Word
Loops {%p for %} e Subdocs gerados via python-docx introduziam
parágrafos com w14:paraId duplicados (32 colisões no demo). Word é
estrito sobre paraId únicos e rejeita o arquivo com "Erro ao abrir".

Mudanças:
- pmra/template_engine.py: nova etapa _dedupe_para_ids() no pós-processo
  que regenera paraIds duplicados para valores únicos
- scripts/update_template.py: troca {{r hon.subdoc}} → {{p hon.subdoc}}
  ({{r}} insere subdoc DENTRO de <w:p> mas subdoc tem tabelas — bloco
   de bloco inválido; {{p}} substitui o parágrafo inteiro)
- Proposta_Demo_Multi_Escopo.docx regenerada com fix
- Proposta_Teste_Simples.docx adicionada (1 escopo, sem multi) para
  isolar comportamento

https://claude.ai/code/session_012AQuGGrkZo1QrHGcyvhfSB
</commit_message>
<xml_diff>
--- a/Proposta_Demo_Multi_Escopo.docx
+++ b/Proposta_Demo_Multi_Escopo.docx
@@ -804,406 +804,340 @@
       </w:pPr>
     </w:p>
     <w:p>
-      <w:pPr>
-        <w:spacing w:line="276" w:lineRule="auto"/>
-        <w:rPr>
-          <w:rFonts w:ascii="Arvo" w:hAnsi="Arvo"/>
-          <w:sz w:val="20"/>
-          <w:szCs w:val="20"/>
-        </w:rPr>
+      <w:r>
+        <w:rPr>
+          <w:rFonts w:ascii="Arvo" w:hAnsi="Arvo"/>
+          <w:b/>
+          <w:sz w:val="20"/>
+        </w:rPr>
+        <w:t>Honorários — Escopo Consultivo A</w:t>
+      </w:r>
+    </w:p>
+    <w:p>
+      <w:pPr>
         <w:jc w:val="both"/>
       </w:pPr>
       <w:r>
         <w:rPr>
           <w:rFonts w:ascii="Arvo" w:hAnsi="Arvo"/>
           <w:sz w:val="20"/>
-          <w:szCs w:val="20"/>
-        </w:rPr>
-        <w:t xml:space="preserve"/>
-      </w:r>
-      <w:p>
-        <w:r>
-          <w:rPr>
-            <w:rFonts w:ascii="Arvo" w:hAnsi="Arvo"/>
-            <w:b/>
-            <w:sz w:val="20"/>
-          </w:rPr>
-          <w:t>Honorários — Escopo Consultivo A</w:t>
-        </w:r>
-      </w:p>
-      <w:p>
-        <w:pPr>
-          <w:jc w:val="both"/>
-        </w:pPr>
-        <w:r>
-          <w:rPr>
-            <w:rFonts w:ascii="Arvo" w:hAnsi="Arvo"/>
-            <w:sz w:val="20"/>
-          </w:rPr>
-          <w:t>Os honorários serão apurados conforme a tabela de senioridade abaixo, com base em relatório mensal de horas executadas.</w:t>
-        </w:r>
-      </w:p>
-      <w:tbl>
-        <w:tblPr>
-          <w:tblW w:type="auto" w:w="0"/>
-          <w:tblLook w:firstColumn="1" w:firstRow="1" w:lastColumn="0" w:lastRow="0" w:noHBand="0" w:noVBand="1" w:val="04A0"/>
-          <w:tblBorders>
-            <w:top w:val="single" w:sz="4" w:space="0" w:color="auto"/>
-            <w:left w:val="single" w:sz="4" w:space="0" w:color="auto"/>
-            <w:right w:val="single" w:sz="4" w:space="0" w:color="auto"/>
-            <w:insideH w:val="single" w:sz="4" w:space="0" w:color="auto"/>
-            <w:insideV w:val="single" w:sz="4" w:space="0" w:color="auto"/>
-          </w:tblBorders>
-        </w:tblPr>
-        <w:tblGrid>
-          <w:gridCol w:w="4320"/>
-          <w:gridCol w:w="4320"/>
-        </w:tblGrid>
-        <w:tr>
-          <w:tc>
-            <w:tcPr>
-              <w:tcW w:type="dxa" w:w="4320"/>
-            </w:tcPr>
-            <w:p>
-              <w:pPr>
-                <w:jc w:val="left"/>
-              </w:pPr>
-              <w:r/>
-              <w:r>
-                <w:rPr>
-                  <w:rFonts w:ascii="Arvo" w:hAnsi="Arvo"/>
-                  <w:b/>
-                  <w:sz w:val="20"/>
-                </w:rPr>
-                <w:t>Categoria</w:t>
-              </w:r>
-            </w:p>
-          </w:tc>
-          <w:tc>
-            <w:tcPr>
-              <w:tcW w:type="dxa" w:w="4320"/>
-            </w:tcPr>
-            <w:p>
-              <w:pPr>
-                <w:jc w:val="left"/>
-              </w:pPr>
-              <w:r/>
-              <w:r>
-                <w:rPr>
-                  <w:rFonts w:ascii="Arvo" w:hAnsi="Arvo"/>
-                  <w:b/>
-                  <w:sz w:val="20"/>
-                </w:rPr>
-                <w:t>Valor por hora</w:t>
-              </w:r>
-            </w:p>
-          </w:tc>
-        </w:tr>
-        <w:tr>
-          <w:tc>
-            <w:tcPr>
-              <w:tcW w:type="dxa" w:w="4320"/>
-            </w:tcPr>
-            <w:p>
-              <w:pPr>
-                <w:jc w:val="left"/>
-              </w:pPr>
-              <w:r/>
-              <w:r>
-                <w:rPr>
-                  <w:rFonts w:ascii="Arvo" w:hAnsi="Arvo"/>
-                  <w:sz w:val="20"/>
-                </w:rPr>
-                <w:t>Sócio</w:t>
-              </w:r>
-            </w:p>
-          </w:tc>
-          <w:tc>
-            <w:tcPr>
-              <w:tcW w:type="dxa" w:w="4320"/>
-            </w:tcPr>
-            <w:p>
-              <w:pPr>
-                <w:jc w:val="left"/>
-              </w:pPr>
-              <w:r/>
-              <w:r>
-                <w:rPr>
-                  <w:rFonts w:ascii="Arvo" w:hAnsi="Arvo"/>
-                  <w:sz w:val="20"/>
-                </w:rPr>
-                <w:t>R$ 1.200,00</w:t>
-              </w:r>
-            </w:p>
-          </w:tc>
-        </w:tr>
-        <w:tr>
-          <w:tc>
-            <w:tcPr>
-              <w:tcW w:type="dxa" w:w="4320"/>
-            </w:tcPr>
-            <w:p>
-              <w:pPr>
-                <w:jc w:val="left"/>
-              </w:pPr>
-              <w:r/>
-              <w:r>
-                <w:rPr>
-                  <w:rFonts w:ascii="Arvo" w:hAnsi="Arvo"/>
-                  <w:sz w:val="20"/>
-                </w:rPr>
-                <w:t>Associado Sênior</w:t>
-              </w:r>
-            </w:p>
-          </w:tc>
-          <w:tc>
-            <w:tcPr>
-              <w:tcW w:type="dxa" w:w="4320"/>
-            </w:tcPr>
-            <w:p>
-              <w:pPr>
-                <w:jc w:val="left"/>
-              </w:pPr>
-              <w:r/>
-              <w:r>
-                <w:rPr>
-                  <w:rFonts w:ascii="Arvo" w:hAnsi="Arvo"/>
-                  <w:sz w:val="20"/>
-                </w:rPr>
-                <w:t>R$ 950,00</w:t>
-              </w:r>
-            </w:p>
-          </w:tc>
-        </w:tr>
-        <w:tr>
-          <w:tc>
-            <w:tcPr>
-              <w:tcW w:type="dxa" w:w="4320"/>
-            </w:tcPr>
-            <w:p>
-              <w:pPr>
-                <w:jc w:val="left"/>
-              </w:pPr>
-              <w:r/>
-              <w:r>
-                <w:rPr>
-                  <w:rFonts w:ascii="Arvo" w:hAnsi="Arvo"/>
-                  <w:sz w:val="20"/>
-                </w:rPr>
-                <w:t>Associado Pleno</w:t>
-              </w:r>
-            </w:p>
-          </w:tc>
-          <w:tc>
-            <w:tcPr>
-              <w:tcW w:type="dxa" w:w="4320"/>
-            </w:tcPr>
-            <w:p>
-              <w:pPr>
-                <w:jc w:val="left"/>
-              </w:pPr>
-              <w:r/>
-              <w:r>
-                <w:rPr>
-                  <w:rFonts w:ascii="Arvo" w:hAnsi="Arvo"/>
-                  <w:sz w:val="20"/>
-                </w:rPr>
-                <w:t>R$ 750,00</w:t>
-              </w:r>
-            </w:p>
-          </w:tc>
-        </w:tr>
-        <w:tr>
-          <w:tc>
-            <w:tcPr>
-              <w:tcW w:type="dxa" w:w="4320"/>
-            </w:tcPr>
-            <w:p>
-              <w:pPr>
-                <w:jc w:val="left"/>
-              </w:pPr>
-              <w:r/>
-              <w:r>
-                <w:rPr>
-                  <w:rFonts w:ascii="Arvo" w:hAnsi="Arvo"/>
-                  <w:sz w:val="20"/>
-                </w:rPr>
-                <w:t>Associado Júnior</w:t>
-              </w:r>
-            </w:p>
-          </w:tc>
-          <w:tc>
-            <w:tcPr>
-              <w:tcW w:type="dxa" w:w="4320"/>
-            </w:tcPr>
-            <w:p>
-              <w:pPr>
-                <w:jc w:val="left"/>
-              </w:pPr>
-              <w:r/>
-              <w:r>
-                <w:rPr>
-                  <w:rFonts w:ascii="Arvo" w:hAnsi="Arvo"/>
-                  <w:sz w:val="20"/>
-                </w:rPr>
-                <w:t>R$ 500,00</w:t>
-              </w:r>
-            </w:p>
-          </w:tc>
-        </w:tr>
-        <w:tr>
-          <w:tc>
-            <w:tcPr>
-              <w:tcW w:type="dxa" w:w="4320"/>
-            </w:tcPr>
-            <w:p>
-              <w:pPr>
-                <w:jc w:val="left"/>
-              </w:pPr>
-              <w:r/>
-              <w:r>
-                <w:rPr>
-                  <w:rFonts w:ascii="Arvo" w:hAnsi="Arvo"/>
-                  <w:sz w:val="20"/>
-                </w:rPr>
-                <w:t>Estagiário/Paralegal</w:t>
-              </w:r>
-            </w:p>
-          </w:tc>
-          <w:tc>
-            <w:tcPr>
-              <w:tcW w:type="dxa" w:w="4320"/>
-            </w:tcPr>
-            <w:p>
-              <w:pPr>
-                <w:jc w:val="left"/>
-              </w:pPr>
-              <w:r/>
-              <w:r>
-                <w:rPr>
-                  <w:rFonts w:ascii="Arvo" w:hAnsi="Arvo"/>
-                  <w:sz w:val="20"/>
-                </w:rPr>
-                <w:t>R$ 280,00</w:t>
-              </w:r>
-            </w:p>
-          </w:tc>
-        </w:tr>
-      </w:tbl>
-      <w:p>
-        <w:r>
-          <w:rPr>
-            <w:rFonts w:ascii="Arvo" w:hAnsi="Arvo"/>
-            <w:sz w:val="20"/>
-          </w:rPr>
-        </w:r>
-      </w:p>
-      <w:r>
-        <w:t xml:space="preserve"/>
-      </w:r>
-    </w:p>
-    <w:p>
-      <w:pPr>
-        <w:spacing w:line="276" w:lineRule="auto"/>
-        <w:rPr>
-          <w:rFonts w:ascii="Arvo" w:hAnsi="Arvo"/>
-          <w:sz w:val="20"/>
-          <w:szCs w:val="20"/>
-        </w:rPr>
+        </w:rPr>
+        <w:t>Os honorários serão apurados conforme a tabela de senioridade abaixo, com base em relatório mensal de horas executadas.</w:t>
+      </w:r>
+    </w:p>
+    <w:tbl>
+      <w:tblPr>
+        <w:tblW w:type="auto" w:w="0"/>
+        <w:tblLook w:firstColumn="1" w:firstRow="1" w:lastColumn="0" w:lastRow="0" w:noHBand="0" w:noVBand="1" w:val="04A0"/>
+        <w:tblBorders>
+          <w:top w:val="single" w:sz="4" w:space="0" w:color="auto"/>
+          <w:left w:val="single" w:sz="4" w:space="0" w:color="auto"/>
+          <w:right w:val="single" w:sz="4" w:space="0" w:color="auto"/>
+          <w:insideH w:val="single" w:sz="4" w:space="0" w:color="auto"/>
+          <w:insideV w:val="single" w:sz="4" w:space="0" w:color="auto"/>
+        </w:tblBorders>
+      </w:tblPr>
+      <w:tblGrid>
+        <w:gridCol w:w="4320"/>
+        <w:gridCol w:w="4320"/>
+      </w:tblGrid>
+      <w:tr>
+        <w:tc>
+          <w:tcPr>
+            <w:tcW w:type="dxa" w:w="4320"/>
+          </w:tcPr>
+          <w:p>
+            <w:pPr>
+              <w:jc w:val="left"/>
+            </w:pPr>
+            <w:r/>
+            <w:r>
+              <w:rPr>
+                <w:rFonts w:ascii="Arvo" w:hAnsi="Arvo"/>
+                <w:b/>
+                <w:sz w:val="20"/>
+              </w:rPr>
+              <w:t>Categoria</w:t>
+            </w:r>
+          </w:p>
+        </w:tc>
+        <w:tc>
+          <w:tcPr>
+            <w:tcW w:type="dxa" w:w="4320"/>
+          </w:tcPr>
+          <w:p>
+            <w:pPr>
+              <w:jc w:val="left"/>
+            </w:pPr>
+            <w:r/>
+            <w:r>
+              <w:rPr>
+                <w:rFonts w:ascii="Arvo" w:hAnsi="Arvo"/>
+                <w:b/>
+                <w:sz w:val="20"/>
+              </w:rPr>
+              <w:t>Valor por hora</w:t>
+            </w:r>
+          </w:p>
+        </w:tc>
+      </w:tr>
+      <w:tr>
+        <w:tc>
+          <w:tcPr>
+            <w:tcW w:type="dxa" w:w="4320"/>
+          </w:tcPr>
+          <w:p>
+            <w:pPr>
+              <w:jc w:val="left"/>
+            </w:pPr>
+            <w:r/>
+            <w:r>
+              <w:rPr>
+                <w:rFonts w:ascii="Arvo" w:hAnsi="Arvo"/>
+                <w:sz w:val="20"/>
+              </w:rPr>
+              <w:t>Sócio</w:t>
+            </w:r>
+          </w:p>
+        </w:tc>
+        <w:tc>
+          <w:tcPr>
+            <w:tcW w:type="dxa" w:w="4320"/>
+          </w:tcPr>
+          <w:p>
+            <w:pPr>
+              <w:jc w:val="left"/>
+            </w:pPr>
+            <w:r/>
+            <w:r>
+              <w:rPr>
+                <w:rFonts w:ascii="Arvo" w:hAnsi="Arvo"/>
+                <w:sz w:val="20"/>
+              </w:rPr>
+              <w:t>R$ 1.200,00</w:t>
+            </w:r>
+          </w:p>
+        </w:tc>
+      </w:tr>
+      <w:tr>
+        <w:tc>
+          <w:tcPr>
+            <w:tcW w:type="dxa" w:w="4320"/>
+          </w:tcPr>
+          <w:p>
+            <w:pPr>
+              <w:jc w:val="left"/>
+            </w:pPr>
+            <w:r/>
+            <w:r>
+              <w:rPr>
+                <w:rFonts w:ascii="Arvo" w:hAnsi="Arvo"/>
+                <w:sz w:val="20"/>
+              </w:rPr>
+              <w:t>Associado Sênior</w:t>
+            </w:r>
+          </w:p>
+        </w:tc>
+        <w:tc>
+          <w:tcPr>
+            <w:tcW w:type="dxa" w:w="4320"/>
+          </w:tcPr>
+          <w:p>
+            <w:pPr>
+              <w:jc w:val="left"/>
+            </w:pPr>
+            <w:r/>
+            <w:r>
+              <w:rPr>
+                <w:rFonts w:ascii="Arvo" w:hAnsi="Arvo"/>
+                <w:sz w:val="20"/>
+              </w:rPr>
+              <w:t>R$ 950,00</w:t>
+            </w:r>
+          </w:p>
+        </w:tc>
+      </w:tr>
+      <w:tr>
+        <w:tc>
+          <w:tcPr>
+            <w:tcW w:type="dxa" w:w="4320"/>
+          </w:tcPr>
+          <w:p>
+            <w:pPr>
+              <w:jc w:val="left"/>
+            </w:pPr>
+            <w:r/>
+            <w:r>
+              <w:rPr>
+                <w:rFonts w:ascii="Arvo" w:hAnsi="Arvo"/>
+                <w:sz w:val="20"/>
+              </w:rPr>
+              <w:t>Associado Pleno</w:t>
+            </w:r>
+          </w:p>
+        </w:tc>
+        <w:tc>
+          <w:tcPr>
+            <w:tcW w:type="dxa" w:w="4320"/>
+          </w:tcPr>
+          <w:p>
+            <w:pPr>
+              <w:jc w:val="left"/>
+            </w:pPr>
+            <w:r/>
+            <w:r>
+              <w:rPr>
+                <w:rFonts w:ascii="Arvo" w:hAnsi="Arvo"/>
+                <w:sz w:val="20"/>
+              </w:rPr>
+              <w:t>R$ 750,00</w:t>
+            </w:r>
+          </w:p>
+        </w:tc>
+      </w:tr>
+      <w:tr>
+        <w:tc>
+          <w:tcPr>
+            <w:tcW w:type="dxa" w:w="4320"/>
+          </w:tcPr>
+          <w:p>
+            <w:pPr>
+              <w:jc w:val="left"/>
+            </w:pPr>
+            <w:r/>
+            <w:r>
+              <w:rPr>
+                <w:rFonts w:ascii="Arvo" w:hAnsi="Arvo"/>
+                <w:sz w:val="20"/>
+              </w:rPr>
+              <w:t>Associado Júnior</w:t>
+            </w:r>
+          </w:p>
+        </w:tc>
+        <w:tc>
+          <w:tcPr>
+            <w:tcW w:type="dxa" w:w="4320"/>
+          </w:tcPr>
+          <w:p>
+            <w:pPr>
+              <w:jc w:val="left"/>
+            </w:pPr>
+            <w:r/>
+            <w:r>
+              <w:rPr>
+                <w:rFonts w:ascii="Arvo" w:hAnsi="Arvo"/>
+                <w:sz w:val="20"/>
+              </w:rPr>
+              <w:t>R$ 500,00</w:t>
+            </w:r>
+          </w:p>
+        </w:tc>
+      </w:tr>
+      <w:tr>
+        <w:tc>
+          <w:tcPr>
+            <w:tcW w:type="dxa" w:w="4320"/>
+          </w:tcPr>
+          <w:p>
+            <w:pPr>
+              <w:jc w:val="left"/>
+            </w:pPr>
+            <w:r/>
+            <w:r>
+              <w:rPr>
+                <w:rFonts w:ascii="Arvo" w:hAnsi="Arvo"/>
+                <w:sz w:val="20"/>
+              </w:rPr>
+              <w:t>Estagiário/Paralegal</w:t>
+            </w:r>
+          </w:p>
+        </w:tc>
+        <w:tc>
+          <w:tcPr>
+            <w:tcW w:type="dxa" w:w="4320"/>
+          </w:tcPr>
+          <w:p>
+            <w:pPr>
+              <w:jc w:val="left"/>
+            </w:pPr>
+            <w:r/>
+            <w:r>
+              <w:rPr>
+                <w:rFonts w:ascii="Arvo" w:hAnsi="Arvo"/>
+                <w:sz w:val="20"/>
+              </w:rPr>
+              <w:t>R$ 280,00</w:t>
+            </w:r>
+          </w:p>
+        </w:tc>
+      </w:tr>
+    </w:tbl>
+    <w:p>
+      <w:r>
+        <w:rPr>
+          <w:rFonts w:ascii="Arvo" w:hAnsi="Arvo"/>
+          <w:sz w:val="20"/>
+        </w:rPr>
+      </w:r>
+    </w:p>
+    <w:p>
+      <w:r>
+        <w:rPr>
+          <w:rFonts w:ascii="Arvo" w:hAnsi="Arvo"/>
+          <w:b/>
+          <w:sz w:val="20"/>
+        </w:rPr>
+        <w:t>Honorários — Escopo Consultivo B</w:t>
+      </w:r>
+    </w:p>
+    <w:p>
+      <w:pPr>
         <w:jc w:val="both"/>
       </w:pPr>
       <w:r>
         <w:rPr>
           <w:rFonts w:ascii="Arvo" w:hAnsi="Arvo"/>
           <w:sz w:val="20"/>
-          <w:szCs w:val="20"/>
-        </w:rPr>
-        <w:t xml:space="preserve"/>
-      </w:r>
-      <w:p>
-        <w:r>
-          <w:rPr>
-            <w:rFonts w:ascii="Arvo" w:hAnsi="Arvo"/>
-            <w:b/>
-            <w:sz w:val="20"/>
-          </w:rPr>
-          <w:t>Honorários — Escopo Consultivo B</w:t>
-        </w:r>
-      </w:p>
-      <w:p>
-        <w:pPr>
-          <w:jc w:val="both"/>
-        </w:pPr>
-        <w:r>
-          <w:rPr>
-            <w:rFonts w:ascii="Arvo" w:hAnsi="Arvo"/>
-            <w:sz w:val="20"/>
-          </w:rPr>
-          <w:t>Os honorários serão apurados com base em valor horário único, aplicável indistintamente a qualquer profissional alocado na prestação dos serviços consultivos, ao valor de R$ 700,00 por hora.</w:t>
-        </w:r>
-      </w:p>
-      <w:p>
-        <w:r>
-          <w:rPr>
-            <w:rFonts w:ascii="Arvo" w:hAnsi="Arvo"/>
-            <w:sz w:val="20"/>
-          </w:rPr>
-        </w:r>
-      </w:p>
-      <w:r>
-        <w:t xml:space="preserve"/>
-      </w:r>
-    </w:p>
-    <w:p>
-      <w:pPr>
-        <w:spacing w:line="276" w:lineRule="auto"/>
-        <w:rPr>
-          <w:rFonts w:ascii="Arvo" w:hAnsi="Arvo"/>
-          <w:sz w:val="20"/>
-          <w:szCs w:val="20"/>
-        </w:rPr>
+        </w:rPr>
+        <w:t>Os honorários serão apurados com base em valor horário único, aplicável indistintamente a qualquer profissional alocado na prestação dos serviços consultivos, ao valor de R$ 700,00 por hora.</w:t>
+      </w:r>
+    </w:p>
+    <w:p>
+      <w:r>
+        <w:rPr>
+          <w:rFonts w:ascii="Arvo" w:hAnsi="Arvo"/>
+          <w:sz w:val="20"/>
+        </w:rPr>
+      </w:r>
+    </w:p>
+    <w:p>
+      <w:r>
+        <w:rPr>
+          <w:rFonts w:ascii="Arvo" w:hAnsi="Arvo"/>
+          <w:b/>
+          <w:sz w:val="20"/>
+        </w:rPr>
+        <w:t>Honorários — Escopo Consultivo C</w:t>
+      </w:r>
+    </w:p>
+    <w:p>
+      <w:pPr>
         <w:jc w:val="both"/>
       </w:pPr>
       <w:r>
         <w:rPr>
           <w:rFonts w:ascii="Arvo" w:hAnsi="Arvo"/>
           <w:sz w:val="20"/>
-          <w:szCs w:val="20"/>
-        </w:rPr>
-        <w:t xml:space="preserve"/>
-      </w:r>
-      <w:p>
-        <w:r>
-          <w:rPr>
-            <w:rFonts w:ascii="Arvo" w:hAnsi="Arvo"/>
-            <w:b/>
-            <w:sz w:val="20"/>
-          </w:rPr>
-          <w:t>Honorários — Escopo Consultivo C</w:t>
-        </w:r>
-      </w:p>
-      <w:p>
-        <w:pPr>
-          <w:jc w:val="both"/>
-        </w:pPr>
-        <w:r>
-          <w:rPr>
-            <w:rFonts w:ascii="Arvo" w:hAnsi="Arvo"/>
-            <w:sz w:val="20"/>
-          </w:rPr>
-          <w:t>Honorários fixos mensais de R$ 18.500,00, abrangendo até 35 horas de trabalho consultivo por mês. Horas excedentes ao cap serão cobradas a R$ 650,00 por hora.</w:t>
-        </w:r>
-      </w:p>
-      <w:p>
-        <w:r>
-          <w:rPr>
-            <w:rFonts w:ascii="Arvo" w:hAnsi="Arvo"/>
-            <w:sz w:val="20"/>
-          </w:rPr>
-        </w:r>
-      </w:p>
-      <w:r>
-        <w:t xml:space="preserve"/>
+        </w:rPr>
+        <w:t>Honorários fixos mensais de R$ 18.500,00, abrangendo até 35 horas de trabalho consultivo por mês. Horas excedentes ao cap serão cobradas a R$ 650,00 por hora.</w:t>
+      </w:r>
+    </w:p>
+    <w:p>
+      <w:r>
+        <w:rPr>
+          <w:rFonts w:ascii="Arvo" w:hAnsi="Arvo"/>
+          <w:sz w:val="20"/>
+        </w:rPr>
       </w:r>
     </w:p>
     <w:p>
@@ -2081,1009 +2015,943 @@
       </w:pPr>
     </w:p>
     <w:p>
-      <w:pPr>
-        <w:spacing w:line="276" w:lineRule="auto"/>
-        <w:rPr>
-          <w:rFonts w:ascii="Arvo" w:hAnsi="Arvo"/>
-          <w:sz w:val="20"/>
-          <w:szCs w:val="20"/>
-        </w:rPr>
+      <w:r>
+        <w:rPr>
+          <w:rFonts w:ascii="Arvo" w:hAnsi="Arvo"/>
+          <w:b/>
+          <w:sz w:val="20"/>
+        </w:rPr>
+        <w:t>Honorários — Escopo Contencioso A</w:t>
+      </w:r>
+    </w:p>
+    <w:p>
+      <w:pPr>
         <w:jc w:val="both"/>
       </w:pPr>
       <w:r>
         <w:rPr>
           <w:rFonts w:ascii="Arvo" w:hAnsi="Arvo"/>
           <w:sz w:val="20"/>
-          <w:szCs w:val="20"/>
-        </w:rPr>
-        <w:t xml:space="preserve"/>
-      </w:r>
-      <w:p>
-        <w:r>
-          <w:rPr>
-            <w:rFonts w:ascii="Arvo" w:hAnsi="Arvo"/>
-            <w:b/>
-            <w:sz w:val="20"/>
-          </w:rPr>
-          <w:t>Honorários — Escopo Contencioso A</w:t>
-        </w:r>
-      </w:p>
-      <w:p>
-        <w:pPr>
-          <w:jc w:val="both"/>
-        </w:pPr>
-        <w:r>
-          <w:rPr>
-            <w:rFonts w:ascii="Arvo" w:hAnsi="Arvo"/>
-            <w:sz w:val="20"/>
-          </w:rPr>
-          <w:t>Os honorários serão apurados em valor mensal por processo, conforme natureza e fase, de acordo com a tabela abaixo:</w:t>
-        </w:r>
-      </w:p>
-      <w:tbl>
-        <w:tblPr>
-          <w:tblW w:type="auto" w:w="0"/>
-          <w:tblLook w:firstColumn="1" w:firstRow="1" w:lastColumn="0" w:lastRow="0" w:noHBand="0" w:noVBand="1" w:val="04A0"/>
-          <w:tblBorders>
-            <w:top w:val="single" w:sz="4" w:space="0" w:color="auto"/>
-            <w:left w:val="single" w:sz="4" w:space="0" w:color="auto"/>
-            <w:right w:val="single" w:sz="4" w:space="0" w:color="auto"/>
-            <w:insideH w:val="single" w:sz="4" w:space="0" w:color="auto"/>
-            <w:insideV w:val="single" w:sz="4" w:space="0" w:color="auto"/>
-          </w:tblBorders>
-        </w:tblPr>
-        <w:tblGrid>
-          <w:gridCol w:w="2880"/>
-          <w:gridCol w:w="2880"/>
-          <w:gridCol w:w="2880"/>
-        </w:tblGrid>
-        <w:tr>
-          <w:tc>
-            <w:tcPr>
-              <w:tcW w:type="dxa" w:w="2880"/>
-            </w:tcPr>
-            <w:p>
-              <w:pPr>
-                <w:jc w:val="left"/>
-              </w:pPr>
-              <w:r/>
-              <w:r>
-                <w:rPr>
-                  <w:rFonts w:ascii="Arvo" w:hAnsi="Arvo"/>
-                  <w:b/>
-                  <w:sz w:val="20"/>
-                </w:rPr>
-                <w:t>Natureza da ação</w:t>
-              </w:r>
-            </w:p>
-          </w:tc>
-          <w:tc>
-            <w:tcPr>
-              <w:tcW w:type="dxa" w:w="2880"/>
-            </w:tcPr>
-            <w:p>
-              <w:pPr>
-                <w:jc w:val="left"/>
-              </w:pPr>
-              <w:r/>
-              <w:r>
-                <w:rPr>
-                  <w:rFonts w:ascii="Arvo" w:hAnsi="Arvo"/>
-                  <w:b/>
-                  <w:sz w:val="20"/>
-                </w:rPr>
-                <w:t>Instâncias de Atuação</w:t>
-              </w:r>
-            </w:p>
-          </w:tc>
-          <w:tc>
-            <w:tcPr>
-              <w:tcW w:type="dxa" w:w="2880"/>
-            </w:tcPr>
-            <w:p>
-              <w:pPr>
-                <w:jc w:val="left"/>
-              </w:pPr>
-              <w:r/>
-              <w:r>
-                <w:rPr>
-                  <w:rFonts w:ascii="Arvo" w:hAnsi="Arvo"/>
-                  <w:b/>
-                  <w:sz w:val="20"/>
-                </w:rPr>
-                <w:t>Valor</w:t>
-              </w:r>
-            </w:p>
-          </w:tc>
-        </w:tr>
-        <w:tr>
-          <w:tc>
-            <w:tcPr>
-              <w:tcW w:type="dxa" w:w="2880"/>
-            </w:tcPr>
-            <w:p>
-              <w:pPr>
-                <w:jc w:val="left"/>
-              </w:pPr>
-              <w:r/>
-              <w:r>
-                <w:rPr>
-                  <w:rFonts w:ascii="Arvo" w:hAnsi="Arvo"/>
-                  <w:sz w:val="20"/>
-                </w:rPr>
-                <w:t>Trabalhista</w:t>
-              </w:r>
-            </w:p>
-          </w:tc>
-          <w:tc>
-            <w:tcPr>
-              <w:tcW w:type="dxa" w:w="2880"/>
-            </w:tcPr>
-            <w:p>
-              <w:pPr>
-                <w:jc w:val="left"/>
-              </w:pPr>
-              <w:r/>
-              <w:r>
-                <w:rPr>
-                  <w:rFonts w:ascii="Arvo" w:hAnsi="Arvo"/>
-                  <w:sz w:val="20"/>
-                </w:rPr>
-                <w:t>Conhecimento</w:t>
-              </w:r>
-            </w:p>
-          </w:tc>
-          <w:tc>
-            <w:tcPr>
-              <w:tcW w:type="dxa" w:w="2880"/>
-            </w:tcPr>
-            <w:p>
-              <w:pPr>
-                <w:jc w:val="left"/>
-              </w:pPr>
-              <w:r/>
-              <w:r>
-                <w:rPr>
-                  <w:rFonts w:ascii="Arvo" w:hAnsi="Arvo"/>
-                  <w:sz w:val="20"/>
-                </w:rPr>
-                <w:t>R$ 5.500,00</w:t>
-              </w:r>
-            </w:p>
-          </w:tc>
-        </w:tr>
-        <w:tr>
-          <w:tc>
-            <w:tcPr>
-              <w:tcW w:type="dxa" w:w="2880"/>
-            </w:tcPr>
-            <w:p>
-              <w:pPr>
-                <w:jc w:val="left"/>
-              </w:pPr>
-              <w:r/>
-              <w:r>
-                <w:rPr>
-                  <w:rFonts w:ascii="Arvo" w:hAnsi="Arvo"/>
-                  <w:sz w:val="20"/>
-                </w:rPr>
-                <w:t>Trabalhista</w:t>
-              </w:r>
-            </w:p>
-          </w:tc>
-          <w:tc>
-            <w:tcPr>
-              <w:tcW w:type="dxa" w:w="2880"/>
-            </w:tcPr>
-            <w:p>
-              <w:pPr>
-                <w:jc w:val="left"/>
-              </w:pPr>
-              <w:r/>
-              <w:r>
-                <w:rPr>
-                  <w:rFonts w:ascii="Arvo" w:hAnsi="Arvo"/>
-                  <w:sz w:val="20"/>
-                </w:rPr>
-                <w:t>Execução</w:t>
-              </w:r>
-            </w:p>
-          </w:tc>
-          <w:tc>
-            <w:tcPr>
-              <w:tcW w:type="dxa" w:w="2880"/>
-            </w:tcPr>
-            <w:p>
-              <w:pPr>
-                <w:jc w:val="left"/>
-              </w:pPr>
-              <w:r/>
-              <w:r>
-                <w:rPr>
-                  <w:rFonts w:ascii="Arvo" w:hAnsi="Arvo"/>
-                  <w:sz w:val="20"/>
-                </w:rPr>
-                <w:t>R$ 3.800,00</w:t>
-              </w:r>
-            </w:p>
-          </w:tc>
-        </w:tr>
-        <w:tr>
-          <w:tc>
-            <w:tcPr>
-              <w:tcW w:type="dxa" w:w="2880"/>
-            </w:tcPr>
-            <w:p>
-              <w:pPr>
-                <w:jc w:val="left"/>
-              </w:pPr>
-              <w:r/>
-              <w:r>
-                <w:rPr>
-                  <w:rFonts w:ascii="Arvo" w:hAnsi="Arvo"/>
-                  <w:sz w:val="20"/>
-                </w:rPr>
-                <w:t>Cível</w:t>
-              </w:r>
-            </w:p>
-          </w:tc>
-          <w:tc>
-            <w:tcPr>
-              <w:tcW w:type="dxa" w:w="2880"/>
-            </w:tcPr>
-            <w:p>
-              <w:pPr>
-                <w:jc w:val="left"/>
-              </w:pPr>
-              <w:r/>
-              <w:r>
-                <w:rPr>
-                  <w:rFonts w:ascii="Arvo" w:hAnsi="Arvo"/>
-                  <w:sz w:val="20"/>
-                </w:rPr>
-                <w:t>Conhecimento</w:t>
-              </w:r>
-            </w:p>
-          </w:tc>
-          <w:tc>
-            <w:tcPr>
-              <w:tcW w:type="dxa" w:w="2880"/>
-            </w:tcPr>
-            <w:p>
-              <w:pPr>
-                <w:jc w:val="left"/>
-              </w:pPr>
-              <w:r/>
-              <w:r>
-                <w:rPr>
-                  <w:rFonts w:ascii="Arvo" w:hAnsi="Arvo"/>
-                  <w:sz w:val="20"/>
-                </w:rPr>
-                <w:t>R$ 7.200,00</w:t>
-              </w:r>
-            </w:p>
-          </w:tc>
-        </w:tr>
-        <w:tr>
-          <w:tc>
-            <w:tcPr>
-              <w:tcW w:type="dxa" w:w="2880"/>
-            </w:tcPr>
-            <w:p>
-              <w:pPr>
-                <w:jc w:val="left"/>
-              </w:pPr>
-              <w:r/>
-              <w:r>
-                <w:rPr>
-                  <w:rFonts w:ascii="Arvo" w:hAnsi="Arvo"/>
-                  <w:sz w:val="20"/>
-                </w:rPr>
-                <w:t>Tributária</w:t>
-              </w:r>
-            </w:p>
-          </w:tc>
-          <w:tc>
-            <w:tcPr>
-              <w:tcW w:type="dxa" w:w="2880"/>
-            </w:tcPr>
-            <w:p>
-              <w:pPr>
-                <w:jc w:val="left"/>
-              </w:pPr>
-              <w:r/>
-              <w:r>
-                <w:rPr>
-                  <w:rFonts w:ascii="Arvo" w:hAnsi="Arvo"/>
-                  <w:sz w:val="20"/>
-                </w:rPr>
-                <w:t>Conhecimento</w:t>
-              </w:r>
-            </w:p>
-          </w:tc>
-          <w:tc>
-            <w:tcPr>
-              <w:tcW w:type="dxa" w:w="2880"/>
-            </w:tcPr>
-            <w:p>
-              <w:pPr>
-                <w:jc w:val="left"/>
-              </w:pPr>
-              <w:r/>
-              <w:r>
-                <w:rPr>
-                  <w:rFonts w:ascii="Arvo" w:hAnsi="Arvo"/>
-                  <w:sz w:val="20"/>
-                </w:rPr>
-                <w:t>R$ 9.500,00</w:t>
-              </w:r>
-            </w:p>
-          </w:tc>
-        </w:tr>
-      </w:tbl>
-      <w:p>
-        <w:r>
-          <w:rPr>
-            <w:rFonts w:ascii="Arvo" w:hAnsi="Arvo"/>
-            <w:sz w:val="20"/>
-          </w:rPr>
-        </w:r>
-      </w:p>
-      <w:r>
-        <w:t xml:space="preserve"/>
-      </w:r>
-    </w:p>
-    <w:p>
-      <w:pPr>
-        <w:spacing w:line="276" w:lineRule="auto"/>
-        <w:rPr>
-          <w:rFonts w:ascii="Arvo" w:hAnsi="Arvo"/>
-          <w:sz w:val="20"/>
-          <w:szCs w:val="20"/>
-        </w:rPr>
+        </w:rPr>
+        <w:t>Os honorários serão apurados em valor mensal por processo, conforme natureza e fase, de acordo com a tabela abaixo:</w:t>
+      </w:r>
+    </w:p>
+    <w:tbl>
+      <w:tblPr>
+        <w:tblW w:type="auto" w:w="0"/>
+        <w:tblLook w:firstColumn="1" w:firstRow="1" w:lastColumn="0" w:lastRow="0" w:noHBand="0" w:noVBand="1" w:val="04A0"/>
+        <w:tblBorders>
+          <w:top w:val="single" w:sz="4" w:space="0" w:color="auto"/>
+          <w:left w:val="single" w:sz="4" w:space="0" w:color="auto"/>
+          <w:right w:val="single" w:sz="4" w:space="0" w:color="auto"/>
+          <w:insideH w:val="single" w:sz="4" w:space="0" w:color="auto"/>
+          <w:insideV w:val="single" w:sz="4" w:space="0" w:color="auto"/>
+        </w:tblBorders>
+      </w:tblPr>
+      <w:tblGrid>
+        <w:gridCol w:w="2880"/>
+        <w:gridCol w:w="2880"/>
+        <w:gridCol w:w="2880"/>
+      </w:tblGrid>
+      <w:tr>
+        <w:tc>
+          <w:tcPr>
+            <w:tcW w:type="dxa" w:w="2880"/>
+          </w:tcPr>
+          <w:p>
+            <w:pPr>
+              <w:jc w:val="left"/>
+            </w:pPr>
+            <w:r/>
+            <w:r>
+              <w:rPr>
+                <w:rFonts w:ascii="Arvo" w:hAnsi="Arvo"/>
+                <w:b/>
+                <w:sz w:val="20"/>
+              </w:rPr>
+              <w:t>Natureza da ação</w:t>
+            </w:r>
+          </w:p>
+        </w:tc>
+        <w:tc>
+          <w:tcPr>
+            <w:tcW w:type="dxa" w:w="2880"/>
+          </w:tcPr>
+          <w:p>
+            <w:pPr>
+              <w:jc w:val="left"/>
+            </w:pPr>
+            <w:r/>
+            <w:r>
+              <w:rPr>
+                <w:rFonts w:ascii="Arvo" w:hAnsi="Arvo"/>
+                <w:b/>
+                <w:sz w:val="20"/>
+              </w:rPr>
+              <w:t>Instâncias de Atuação</w:t>
+            </w:r>
+          </w:p>
+        </w:tc>
+        <w:tc>
+          <w:tcPr>
+            <w:tcW w:type="dxa" w:w="2880"/>
+          </w:tcPr>
+          <w:p>
+            <w:pPr>
+              <w:jc w:val="left"/>
+            </w:pPr>
+            <w:r/>
+            <w:r>
+              <w:rPr>
+                <w:rFonts w:ascii="Arvo" w:hAnsi="Arvo"/>
+                <w:b/>
+                <w:sz w:val="20"/>
+              </w:rPr>
+              <w:t>Valor</w:t>
+            </w:r>
+          </w:p>
+        </w:tc>
+      </w:tr>
+      <w:tr>
+        <w:tc>
+          <w:tcPr>
+            <w:tcW w:type="dxa" w:w="2880"/>
+          </w:tcPr>
+          <w:p>
+            <w:pPr>
+              <w:jc w:val="left"/>
+            </w:pPr>
+            <w:r/>
+            <w:r>
+              <w:rPr>
+                <w:rFonts w:ascii="Arvo" w:hAnsi="Arvo"/>
+                <w:sz w:val="20"/>
+              </w:rPr>
+              <w:t>Trabalhista</w:t>
+            </w:r>
+          </w:p>
+        </w:tc>
+        <w:tc>
+          <w:tcPr>
+            <w:tcW w:type="dxa" w:w="2880"/>
+          </w:tcPr>
+          <w:p>
+            <w:pPr>
+              <w:jc w:val="left"/>
+            </w:pPr>
+            <w:r/>
+            <w:r>
+              <w:rPr>
+                <w:rFonts w:ascii="Arvo" w:hAnsi="Arvo"/>
+                <w:sz w:val="20"/>
+              </w:rPr>
+              <w:t>Conhecimento</w:t>
+            </w:r>
+          </w:p>
+        </w:tc>
+        <w:tc>
+          <w:tcPr>
+            <w:tcW w:type="dxa" w:w="2880"/>
+          </w:tcPr>
+          <w:p>
+            <w:pPr>
+              <w:jc w:val="left"/>
+            </w:pPr>
+            <w:r/>
+            <w:r>
+              <w:rPr>
+                <w:rFonts w:ascii="Arvo" w:hAnsi="Arvo"/>
+                <w:sz w:val="20"/>
+              </w:rPr>
+              <w:t>R$ 5.500,00</w:t>
+            </w:r>
+          </w:p>
+        </w:tc>
+      </w:tr>
+      <w:tr>
+        <w:tc>
+          <w:tcPr>
+            <w:tcW w:type="dxa" w:w="2880"/>
+          </w:tcPr>
+          <w:p>
+            <w:pPr>
+              <w:jc w:val="left"/>
+            </w:pPr>
+            <w:r/>
+            <w:r>
+              <w:rPr>
+                <w:rFonts w:ascii="Arvo" w:hAnsi="Arvo"/>
+                <w:sz w:val="20"/>
+              </w:rPr>
+              <w:t>Trabalhista</w:t>
+            </w:r>
+          </w:p>
+        </w:tc>
+        <w:tc>
+          <w:tcPr>
+            <w:tcW w:type="dxa" w:w="2880"/>
+          </w:tcPr>
+          <w:p>
+            <w:pPr>
+              <w:jc w:val="left"/>
+            </w:pPr>
+            <w:r/>
+            <w:r>
+              <w:rPr>
+                <w:rFonts w:ascii="Arvo" w:hAnsi="Arvo"/>
+                <w:sz w:val="20"/>
+              </w:rPr>
+              <w:t>Execução</w:t>
+            </w:r>
+          </w:p>
+        </w:tc>
+        <w:tc>
+          <w:tcPr>
+            <w:tcW w:type="dxa" w:w="2880"/>
+          </w:tcPr>
+          <w:p>
+            <w:pPr>
+              <w:jc w:val="left"/>
+            </w:pPr>
+            <w:r/>
+            <w:r>
+              <w:rPr>
+                <w:rFonts w:ascii="Arvo" w:hAnsi="Arvo"/>
+                <w:sz w:val="20"/>
+              </w:rPr>
+              <w:t>R$ 3.800,00</w:t>
+            </w:r>
+          </w:p>
+        </w:tc>
+      </w:tr>
+      <w:tr>
+        <w:tc>
+          <w:tcPr>
+            <w:tcW w:type="dxa" w:w="2880"/>
+          </w:tcPr>
+          <w:p>
+            <w:pPr>
+              <w:jc w:val="left"/>
+            </w:pPr>
+            <w:r/>
+            <w:r>
+              <w:rPr>
+                <w:rFonts w:ascii="Arvo" w:hAnsi="Arvo"/>
+                <w:sz w:val="20"/>
+              </w:rPr>
+              <w:t>Cível</w:t>
+            </w:r>
+          </w:p>
+        </w:tc>
+        <w:tc>
+          <w:tcPr>
+            <w:tcW w:type="dxa" w:w="2880"/>
+          </w:tcPr>
+          <w:p>
+            <w:pPr>
+              <w:jc w:val="left"/>
+            </w:pPr>
+            <w:r/>
+            <w:r>
+              <w:rPr>
+                <w:rFonts w:ascii="Arvo" w:hAnsi="Arvo"/>
+                <w:sz w:val="20"/>
+              </w:rPr>
+              <w:t>Conhecimento</w:t>
+            </w:r>
+          </w:p>
+        </w:tc>
+        <w:tc>
+          <w:tcPr>
+            <w:tcW w:type="dxa" w:w="2880"/>
+          </w:tcPr>
+          <w:p>
+            <w:pPr>
+              <w:jc w:val="left"/>
+            </w:pPr>
+            <w:r/>
+            <w:r>
+              <w:rPr>
+                <w:rFonts w:ascii="Arvo" w:hAnsi="Arvo"/>
+                <w:sz w:val="20"/>
+              </w:rPr>
+              <w:t>R$ 7.200,00</w:t>
+            </w:r>
+          </w:p>
+        </w:tc>
+      </w:tr>
+      <w:tr>
+        <w:tc>
+          <w:tcPr>
+            <w:tcW w:type="dxa" w:w="2880"/>
+          </w:tcPr>
+          <w:p>
+            <w:pPr>
+              <w:jc w:val="left"/>
+            </w:pPr>
+            <w:r/>
+            <w:r>
+              <w:rPr>
+                <w:rFonts w:ascii="Arvo" w:hAnsi="Arvo"/>
+                <w:sz w:val="20"/>
+              </w:rPr>
+              <w:t>Tributária</w:t>
+            </w:r>
+          </w:p>
+        </w:tc>
+        <w:tc>
+          <w:tcPr>
+            <w:tcW w:type="dxa" w:w="2880"/>
+          </w:tcPr>
+          <w:p>
+            <w:pPr>
+              <w:jc w:val="left"/>
+            </w:pPr>
+            <w:r/>
+            <w:r>
+              <w:rPr>
+                <w:rFonts w:ascii="Arvo" w:hAnsi="Arvo"/>
+                <w:sz w:val="20"/>
+              </w:rPr>
+              <w:t>Conhecimento</w:t>
+            </w:r>
+          </w:p>
+        </w:tc>
+        <w:tc>
+          <w:tcPr>
+            <w:tcW w:type="dxa" w:w="2880"/>
+          </w:tcPr>
+          <w:p>
+            <w:pPr>
+              <w:jc w:val="left"/>
+            </w:pPr>
+            <w:r/>
+            <w:r>
+              <w:rPr>
+                <w:rFonts w:ascii="Arvo" w:hAnsi="Arvo"/>
+                <w:sz w:val="20"/>
+              </w:rPr>
+              <w:t>R$ 9.500,00</w:t>
+            </w:r>
+          </w:p>
+        </w:tc>
+      </w:tr>
+    </w:tbl>
+    <w:p>
+      <w:r>
+        <w:rPr>
+          <w:rFonts w:ascii="Arvo" w:hAnsi="Arvo"/>
+          <w:sz w:val="20"/>
+        </w:rPr>
+      </w:r>
+    </w:p>
+    <w:p>
+      <w:r>
+        <w:rPr>
+          <w:rFonts w:ascii="Arvo" w:hAnsi="Arvo"/>
+          <w:b/>
+          <w:sz w:val="20"/>
+        </w:rPr>
+        <w:t>Honorários — Escopo Contencioso B</w:t>
+      </w:r>
+    </w:p>
+    <w:p>
+      <w:pPr>
         <w:jc w:val="both"/>
       </w:pPr>
       <w:r>
         <w:rPr>
           <w:rFonts w:ascii="Arvo" w:hAnsi="Arvo"/>
           <w:sz w:val="20"/>
-          <w:szCs w:val="20"/>
-        </w:rPr>
-        <w:t xml:space="preserve"/>
-      </w:r>
-      <w:p>
-        <w:r>
-          <w:rPr>
-            <w:rFonts w:ascii="Arvo" w:hAnsi="Arvo"/>
-            <w:b/>
-            <w:sz w:val="20"/>
-          </w:rPr>
-          <w:t>Honorários — Escopo Contencioso B</w:t>
-        </w:r>
-      </w:p>
-      <w:p>
-        <w:pPr>
-          <w:jc w:val="both"/>
-        </w:pPr>
-        <w:r>
-          <w:rPr>
-            <w:rFonts w:ascii="Arvo" w:hAnsi="Arvo"/>
-            <w:sz w:val="20"/>
-          </w:rPr>
-          <w:t>Os honorários serão apurados por ato processual efetivamente praticado, conforme tabela:</w:t>
-        </w:r>
-      </w:p>
-      <w:tbl>
-        <w:tblPr>
-          <w:tblW w:type="auto" w:w="0"/>
-          <w:tblLook w:firstColumn="1" w:firstRow="1" w:lastColumn="0" w:lastRow="0" w:noHBand="0" w:noVBand="1" w:val="04A0"/>
-          <w:tblBorders>
-            <w:top w:val="single" w:sz="4" w:space="0" w:color="auto"/>
-            <w:left w:val="single" w:sz="4" w:space="0" w:color="auto"/>
-            <w:right w:val="single" w:sz="4" w:space="0" w:color="auto"/>
-            <w:insideH w:val="single" w:sz="4" w:space="0" w:color="auto"/>
-            <w:insideV w:val="single" w:sz="4" w:space="0" w:color="auto"/>
-          </w:tblBorders>
-        </w:tblPr>
-        <w:tblGrid>
-          <w:gridCol w:w="2880"/>
-          <w:gridCol w:w="2880"/>
-          <w:gridCol w:w="2880"/>
-        </w:tblGrid>
-        <w:tr>
-          <w:tc>
-            <w:tcPr>
-              <w:tcW w:type="dxa" w:w="2880"/>
-            </w:tcPr>
-            <w:p>
-              <w:pPr>
-                <w:jc w:val="left"/>
-              </w:pPr>
-              <w:r/>
-              <w:r>
-                <w:rPr>
-                  <w:rFonts w:ascii="Arvo" w:hAnsi="Arvo"/>
-                  <w:b/>
-                  <w:sz w:val="20"/>
-                </w:rPr>
-                <w:t>Ato processual</w:t>
-              </w:r>
-            </w:p>
-          </w:tc>
-          <w:tc>
-            <w:tcPr>
-              <w:tcW w:type="dxa" w:w="2880"/>
-            </w:tcPr>
-            <w:p>
-              <w:pPr>
-                <w:jc w:val="left"/>
-              </w:pPr>
-              <w:r/>
-              <w:r>
-                <w:rPr>
-                  <w:rFonts w:ascii="Arvo" w:hAnsi="Arvo"/>
-                  <w:b/>
-                  <w:sz w:val="20"/>
-                </w:rPr>
-                <w:t>Descrição</w:t>
-              </w:r>
-            </w:p>
-          </w:tc>
-          <w:tc>
-            <w:tcPr>
-              <w:tcW w:type="dxa" w:w="2880"/>
-            </w:tcPr>
-            <w:p>
-              <w:pPr>
-                <w:jc w:val="left"/>
-              </w:pPr>
-              <w:r/>
-              <w:r>
-                <w:rPr>
-                  <w:rFonts w:ascii="Arvo" w:hAnsi="Arvo"/>
-                  <w:b/>
-                  <w:sz w:val="20"/>
-                </w:rPr>
-                <w:t>Valor</w:t>
-              </w:r>
-            </w:p>
-          </w:tc>
-        </w:tr>
-        <w:tr>
-          <w:tc>
-            <w:tcPr>
-              <w:tcW w:type="dxa" w:w="2880"/>
-            </w:tcPr>
-            <w:p>
-              <w:pPr>
-                <w:jc w:val="left"/>
-              </w:pPr>
-              <w:r/>
-              <w:r>
-                <w:rPr>
-                  <w:rFonts w:ascii="Arvo" w:hAnsi="Arvo"/>
-                  <w:sz w:val="20"/>
-                </w:rPr>
-                <w:t>Petição Inicial</w:t>
-              </w:r>
-            </w:p>
-          </w:tc>
-          <w:tc>
-            <w:tcPr>
-              <w:tcW w:type="dxa" w:w="2880"/>
-            </w:tcPr>
-            <w:p>
-              <w:pPr>
-                <w:jc w:val="left"/>
-              </w:pPr>
-              <w:r/>
-              <w:r>
-                <w:rPr>
-                  <w:rFonts w:ascii="Arvo" w:hAnsi="Arvo"/>
-                  <w:sz w:val="20"/>
-                </w:rPr>
-                <w:t>Elaboração e protocolo da peça inaugural.</w:t>
-              </w:r>
-            </w:p>
-          </w:tc>
-          <w:tc>
-            <w:tcPr>
-              <w:tcW w:type="dxa" w:w="2880"/>
-            </w:tcPr>
-            <w:p>
-              <w:pPr>
-                <w:jc w:val="left"/>
-              </w:pPr>
-              <w:r/>
-              <w:r>
-                <w:rPr>
-                  <w:rFonts w:ascii="Arvo" w:hAnsi="Arvo"/>
-                  <w:sz w:val="20"/>
-                </w:rPr>
-                <w:t>R$ 2.500,00</w:t>
-              </w:r>
-            </w:p>
-          </w:tc>
-        </w:tr>
-        <w:tr>
-          <w:tc>
-            <w:tcPr>
-              <w:tcW w:type="dxa" w:w="2880"/>
-            </w:tcPr>
-            <w:p>
-              <w:pPr>
-                <w:jc w:val="left"/>
-              </w:pPr>
-              <w:r/>
-              <w:r>
-                <w:rPr>
-                  <w:rFonts w:ascii="Arvo" w:hAnsi="Arvo"/>
-                  <w:sz w:val="20"/>
-                </w:rPr>
-                <w:t>Contestação</w:t>
-              </w:r>
-            </w:p>
-          </w:tc>
-          <w:tc>
-            <w:tcPr>
-              <w:tcW w:type="dxa" w:w="2880"/>
-            </w:tcPr>
-            <w:p>
-              <w:pPr>
-                <w:jc w:val="left"/>
-              </w:pPr>
-              <w:r/>
-              <w:r>
-                <w:rPr>
-                  <w:rFonts w:ascii="Arvo" w:hAnsi="Arvo"/>
-                  <w:sz w:val="20"/>
-                </w:rPr>
-                <w:t>Elaboração e protocolo de defesa em processo judicial.</w:t>
-              </w:r>
-            </w:p>
-          </w:tc>
-          <w:tc>
-            <w:tcPr>
-              <w:tcW w:type="dxa" w:w="2880"/>
-            </w:tcPr>
-            <w:p>
-              <w:pPr>
-                <w:jc w:val="left"/>
-              </w:pPr>
-              <w:r/>
-              <w:r>
-                <w:rPr>
-                  <w:rFonts w:ascii="Arvo" w:hAnsi="Arvo"/>
-                  <w:sz w:val="20"/>
-                </w:rPr>
-                <w:t>R$ 2.200,00</w:t>
-              </w:r>
-            </w:p>
-          </w:tc>
-        </w:tr>
-        <w:tr>
-          <w:tc>
-            <w:tcPr>
-              <w:tcW w:type="dxa" w:w="2880"/>
-            </w:tcPr>
-            <w:p>
-              <w:pPr>
-                <w:jc w:val="left"/>
-              </w:pPr>
-              <w:r/>
-              <w:r>
-                <w:rPr>
-                  <w:rFonts w:ascii="Arvo" w:hAnsi="Arvo"/>
-                  <w:sz w:val="20"/>
-                </w:rPr>
-                <w:t>Recurso Ordinário</w:t>
-              </w:r>
-            </w:p>
-          </w:tc>
-          <w:tc>
-            <w:tcPr>
-              <w:tcW w:type="dxa" w:w="2880"/>
-            </w:tcPr>
-            <w:p>
-              <w:pPr>
-                <w:jc w:val="left"/>
-              </w:pPr>
-              <w:r/>
-              <w:r>
-                <w:rPr>
-                  <w:rFonts w:ascii="Arvo" w:hAnsi="Arvo"/>
-                  <w:sz w:val="20"/>
-                </w:rPr>
-                <w:t>Elaboração e protocolo de recurso ordinário na Justiça do Trabalho.</w:t>
-              </w:r>
-            </w:p>
-          </w:tc>
-          <w:tc>
-            <w:tcPr>
-              <w:tcW w:type="dxa" w:w="2880"/>
-            </w:tcPr>
-            <w:p>
-              <w:pPr>
-                <w:jc w:val="left"/>
-              </w:pPr>
-              <w:r/>
-              <w:r>
-                <w:rPr>
-                  <w:rFonts w:ascii="Arvo" w:hAnsi="Arvo"/>
-                  <w:sz w:val="20"/>
-                </w:rPr>
-                <w:t>R$ 3.000,00</w:t>
-              </w:r>
-            </w:p>
-          </w:tc>
-        </w:tr>
-        <w:tr>
-          <w:tc>
-            <w:tcPr>
-              <w:tcW w:type="dxa" w:w="2880"/>
-            </w:tcPr>
-            <w:p>
-              <w:pPr>
-                <w:jc w:val="left"/>
-              </w:pPr>
-              <w:r/>
-              <w:r>
-                <w:rPr>
-                  <w:rFonts w:ascii="Arvo" w:hAnsi="Arvo"/>
-                  <w:sz w:val="20"/>
-                </w:rPr>
-                <w:t>Agravo</w:t>
-              </w:r>
-            </w:p>
-          </w:tc>
-          <w:tc>
-            <w:tcPr>
-              <w:tcW w:type="dxa" w:w="2880"/>
-            </w:tcPr>
-            <w:p>
-              <w:pPr>
-                <w:jc w:val="left"/>
-              </w:pPr>
-              <w:r/>
-              <w:r>
-                <w:rPr>
-                  <w:rFonts w:ascii="Arvo" w:hAnsi="Arvo"/>
-                  <w:sz w:val="20"/>
-                </w:rPr>
-                <w:t>Elaboração e protocolo de agravo de instrumento ou agravo interno.</w:t>
-              </w:r>
-            </w:p>
-          </w:tc>
-          <w:tc>
-            <w:tcPr>
-              <w:tcW w:type="dxa" w:w="2880"/>
-            </w:tcPr>
-            <w:p>
-              <w:pPr>
-                <w:jc w:val="left"/>
-              </w:pPr>
-              <w:r/>
-              <w:r>
-                <w:rPr>
-                  <w:rFonts w:ascii="Arvo" w:hAnsi="Arvo"/>
-                  <w:sz w:val="20"/>
-                </w:rPr>
-                <w:t>R$ 1.800,00</w:t>
-              </w:r>
-            </w:p>
-          </w:tc>
-        </w:tr>
-        <w:tr>
-          <w:tc>
-            <w:tcPr>
-              <w:tcW w:type="dxa" w:w="2880"/>
-            </w:tcPr>
-            <w:p>
-              <w:pPr>
-                <w:jc w:val="left"/>
-              </w:pPr>
-              <w:r/>
-              <w:r>
-                <w:rPr>
-                  <w:rFonts w:ascii="Arvo" w:hAnsi="Arvo"/>
-                  <w:sz w:val="20"/>
-                </w:rPr>
-                <w:t>Apelação</w:t>
-              </w:r>
-            </w:p>
-          </w:tc>
-          <w:tc>
-            <w:tcPr>
-              <w:tcW w:type="dxa" w:w="2880"/>
-            </w:tcPr>
-            <w:p>
-              <w:pPr>
-                <w:jc w:val="left"/>
-              </w:pPr>
-              <w:r/>
-              <w:r>
-                <w:rPr>
-                  <w:rFonts w:ascii="Arvo" w:hAnsi="Arvo"/>
-                  <w:sz w:val="20"/>
-                </w:rPr>
-                <w:t>Elaboração e protocolo de apelação cível em 1º grau de jurisdição.</w:t>
-              </w:r>
-            </w:p>
-          </w:tc>
-          <w:tc>
-            <w:tcPr>
-              <w:tcW w:type="dxa" w:w="2880"/>
-            </w:tcPr>
-            <w:p>
-              <w:pPr>
-                <w:jc w:val="left"/>
-              </w:pPr>
-              <w:r/>
-              <w:r>
-                <w:rPr>
-                  <w:rFonts w:ascii="Arvo" w:hAnsi="Arvo"/>
-                  <w:sz w:val="20"/>
-                </w:rPr>
-                <w:t>R$ 3.500,00</w:t>
-              </w:r>
-            </w:p>
-          </w:tc>
-        </w:tr>
-        <w:tr>
-          <w:tc>
-            <w:tcPr>
-              <w:tcW w:type="dxa" w:w="2880"/>
-            </w:tcPr>
-            <w:p>
-              <w:pPr>
-                <w:jc w:val="left"/>
-              </w:pPr>
-              <w:r/>
-              <w:r>
-                <w:rPr>
-                  <w:rFonts w:ascii="Arvo" w:hAnsi="Arvo"/>
-                  <w:sz w:val="20"/>
-                </w:rPr>
-                <w:t>Recurso Especial / Extraordinário</w:t>
-              </w:r>
-            </w:p>
-          </w:tc>
-          <w:tc>
-            <w:tcPr>
-              <w:tcW w:type="dxa" w:w="2880"/>
-            </w:tcPr>
-            <w:p>
-              <w:pPr>
-                <w:jc w:val="left"/>
-              </w:pPr>
-              <w:r/>
-              <w:r>
-                <w:rPr>
-                  <w:rFonts w:ascii="Arvo" w:hAnsi="Arvo"/>
-                  <w:sz w:val="20"/>
-                </w:rPr>
-                <w:t>Elaboração e protocolo de recursos excepcionais ao STJ e STF, inclusive agravos correlatos.</w:t>
-              </w:r>
-            </w:p>
-          </w:tc>
-          <w:tc>
-            <w:tcPr>
-              <w:tcW w:type="dxa" w:w="2880"/>
-            </w:tcPr>
-            <w:p>
-              <w:pPr>
-                <w:jc w:val="left"/>
-              </w:pPr>
-              <w:r/>
-              <w:r>
-                <w:rPr>
-                  <w:rFonts w:ascii="Arvo" w:hAnsi="Arvo"/>
-                  <w:sz w:val="20"/>
-                </w:rPr>
-                <w:t>R$ 6.500,00</w:t>
-              </w:r>
-            </w:p>
-          </w:tc>
-        </w:tr>
-        <w:tr>
-          <w:tc>
-            <w:tcPr>
-              <w:tcW w:type="dxa" w:w="2880"/>
-            </w:tcPr>
-            <w:p>
-              <w:pPr>
-                <w:jc w:val="left"/>
-              </w:pPr>
-              <w:r/>
-              <w:r>
-                <w:rPr>
-                  <w:rFonts w:ascii="Arvo" w:hAnsi="Arvo"/>
-                  <w:sz w:val="20"/>
-                </w:rPr>
-                <w:t>Audiência</w:t>
-              </w:r>
-            </w:p>
-          </w:tc>
-          <w:tc>
-            <w:tcPr>
-              <w:tcW w:type="dxa" w:w="2880"/>
-            </w:tcPr>
-            <w:p>
-              <w:pPr>
-                <w:jc w:val="left"/>
-              </w:pPr>
-              <w:r/>
-              <w:r>
-                <w:rPr>
-                  <w:rFonts w:ascii="Arvo" w:hAnsi="Arvo"/>
-                  <w:sz w:val="20"/>
-                </w:rPr>
-                <w:t>Comparecimento, acompanhamento e atuação em audiência.</w:t>
-              </w:r>
-            </w:p>
-          </w:tc>
-          <w:tc>
-            <w:tcPr>
-              <w:tcW w:type="dxa" w:w="2880"/>
-            </w:tcPr>
-            <w:p>
-              <w:pPr>
-                <w:jc w:val="left"/>
-              </w:pPr>
-              <w:r/>
-              <w:r>
-                <w:rPr>
-                  <w:rFonts w:ascii="Arvo" w:hAnsi="Arvo"/>
-                  <w:sz w:val="20"/>
-                </w:rPr>
-                <w:t>R$ 1.500,00</w:t>
-              </w:r>
-            </w:p>
-          </w:tc>
-        </w:tr>
-        <w:tr>
-          <w:tc>
-            <w:tcPr>
-              <w:tcW w:type="dxa" w:w="2880"/>
-            </w:tcPr>
-            <w:p>
-              <w:pPr>
-                <w:jc w:val="left"/>
-              </w:pPr>
-              <w:r/>
-              <w:r>
-                <w:rPr>
-                  <w:rFonts w:ascii="Arvo" w:hAnsi="Arvo"/>
-                  <w:sz w:val="20"/>
-                </w:rPr>
-                <w:t>Diligência Externa</w:t>
-              </w:r>
-            </w:p>
-          </w:tc>
-          <w:tc>
-            <w:tcPr>
-              <w:tcW w:type="dxa" w:w="2880"/>
-            </w:tcPr>
-            <w:p>
-              <w:pPr>
-                <w:jc w:val="left"/>
-              </w:pPr>
-              <w:r/>
-              <w:r>
-                <w:rPr>
-                  <w:rFonts w:ascii="Arvo" w:hAnsi="Arvo"/>
-                  <w:sz w:val="20"/>
-                </w:rPr>
-                <w:t>Realização de diligência presencial em cartório, órgão público ou unidade do Contratante.</w:t>
-              </w:r>
-            </w:p>
-          </w:tc>
-          <w:tc>
-            <w:tcPr>
-              <w:tcW w:type="dxa" w:w="2880"/>
-            </w:tcPr>
-            <w:p>
-              <w:pPr>
-                <w:jc w:val="left"/>
-              </w:pPr>
-              <w:r/>
-              <w:r>
-                <w:rPr>
-                  <w:rFonts w:ascii="Arvo" w:hAnsi="Arvo"/>
-                  <w:sz w:val="20"/>
-                </w:rPr>
-                <w:t>R$ 850,00</w:t>
-              </w:r>
-            </w:p>
-          </w:tc>
-        </w:tr>
-      </w:tbl>
-      <w:p>
-        <w:r>
-          <w:rPr>
-            <w:rFonts w:ascii="Arvo" w:hAnsi="Arvo"/>
-            <w:sz w:val="20"/>
-          </w:rPr>
-        </w:r>
-      </w:p>
-      <w:r>
-        <w:t xml:space="preserve"/>
-      </w:r>
-    </w:p>
-    <w:p>
-      <w:pPr>
-        <w:spacing w:line="276" w:lineRule="auto"/>
-        <w:rPr>
-          <w:rFonts w:ascii="Arvo" w:hAnsi="Arvo"/>
-          <w:sz w:val="20"/>
-          <w:szCs w:val="20"/>
-        </w:rPr>
+        </w:rPr>
+        <w:t>Os honorários serão apurados por ato processual efetivamente praticado, conforme tabela:</w:t>
+      </w:r>
+    </w:p>
+    <w:tbl>
+      <w:tblPr>
+        <w:tblW w:type="auto" w:w="0"/>
+        <w:tblLook w:firstColumn="1" w:firstRow="1" w:lastColumn="0" w:lastRow="0" w:noHBand="0" w:noVBand="1" w:val="04A0"/>
+        <w:tblBorders>
+          <w:top w:val="single" w:sz="4" w:space="0" w:color="auto"/>
+          <w:left w:val="single" w:sz="4" w:space="0" w:color="auto"/>
+          <w:right w:val="single" w:sz="4" w:space="0" w:color="auto"/>
+          <w:insideH w:val="single" w:sz="4" w:space="0" w:color="auto"/>
+          <w:insideV w:val="single" w:sz="4" w:space="0" w:color="auto"/>
+        </w:tblBorders>
+      </w:tblPr>
+      <w:tblGrid>
+        <w:gridCol w:w="2880"/>
+        <w:gridCol w:w="2880"/>
+        <w:gridCol w:w="2880"/>
+      </w:tblGrid>
+      <w:tr>
+        <w:tc>
+          <w:tcPr>
+            <w:tcW w:type="dxa" w:w="2880"/>
+          </w:tcPr>
+          <w:p>
+            <w:pPr>
+              <w:jc w:val="left"/>
+            </w:pPr>
+            <w:r/>
+            <w:r>
+              <w:rPr>
+                <w:rFonts w:ascii="Arvo" w:hAnsi="Arvo"/>
+                <w:b/>
+                <w:sz w:val="20"/>
+              </w:rPr>
+              <w:t>Ato processual</w:t>
+            </w:r>
+          </w:p>
+        </w:tc>
+        <w:tc>
+          <w:tcPr>
+            <w:tcW w:type="dxa" w:w="2880"/>
+          </w:tcPr>
+          <w:p>
+            <w:pPr>
+              <w:jc w:val="left"/>
+            </w:pPr>
+            <w:r/>
+            <w:r>
+              <w:rPr>
+                <w:rFonts w:ascii="Arvo" w:hAnsi="Arvo"/>
+                <w:b/>
+                <w:sz w:val="20"/>
+              </w:rPr>
+              <w:t>Descrição</w:t>
+            </w:r>
+          </w:p>
+        </w:tc>
+        <w:tc>
+          <w:tcPr>
+            <w:tcW w:type="dxa" w:w="2880"/>
+          </w:tcPr>
+          <w:p>
+            <w:pPr>
+              <w:jc w:val="left"/>
+            </w:pPr>
+            <w:r/>
+            <w:r>
+              <w:rPr>
+                <w:rFonts w:ascii="Arvo" w:hAnsi="Arvo"/>
+                <w:b/>
+                <w:sz w:val="20"/>
+              </w:rPr>
+              <w:t>Valor</w:t>
+            </w:r>
+          </w:p>
+        </w:tc>
+      </w:tr>
+      <w:tr>
+        <w:tc>
+          <w:tcPr>
+            <w:tcW w:type="dxa" w:w="2880"/>
+          </w:tcPr>
+          <w:p>
+            <w:pPr>
+              <w:jc w:val="left"/>
+            </w:pPr>
+            <w:r/>
+            <w:r>
+              <w:rPr>
+                <w:rFonts w:ascii="Arvo" w:hAnsi="Arvo"/>
+                <w:sz w:val="20"/>
+              </w:rPr>
+              <w:t>Petição Inicial</w:t>
+            </w:r>
+          </w:p>
+        </w:tc>
+        <w:tc>
+          <w:tcPr>
+            <w:tcW w:type="dxa" w:w="2880"/>
+          </w:tcPr>
+          <w:p>
+            <w:pPr>
+              <w:jc w:val="left"/>
+            </w:pPr>
+            <w:r/>
+            <w:r>
+              <w:rPr>
+                <w:rFonts w:ascii="Arvo" w:hAnsi="Arvo"/>
+                <w:sz w:val="20"/>
+              </w:rPr>
+              <w:t>Elaboração e protocolo da peça inaugural.</w:t>
+            </w:r>
+          </w:p>
+        </w:tc>
+        <w:tc>
+          <w:tcPr>
+            <w:tcW w:type="dxa" w:w="2880"/>
+          </w:tcPr>
+          <w:p>
+            <w:pPr>
+              <w:jc w:val="left"/>
+            </w:pPr>
+            <w:r/>
+            <w:r>
+              <w:rPr>
+                <w:rFonts w:ascii="Arvo" w:hAnsi="Arvo"/>
+                <w:sz w:val="20"/>
+              </w:rPr>
+              <w:t>R$ 2.500,00</w:t>
+            </w:r>
+          </w:p>
+        </w:tc>
+      </w:tr>
+      <w:tr>
+        <w:tc>
+          <w:tcPr>
+            <w:tcW w:type="dxa" w:w="2880"/>
+          </w:tcPr>
+          <w:p>
+            <w:pPr>
+              <w:jc w:val="left"/>
+            </w:pPr>
+            <w:r/>
+            <w:r>
+              <w:rPr>
+                <w:rFonts w:ascii="Arvo" w:hAnsi="Arvo"/>
+                <w:sz w:val="20"/>
+              </w:rPr>
+              <w:t>Contestação</w:t>
+            </w:r>
+          </w:p>
+        </w:tc>
+        <w:tc>
+          <w:tcPr>
+            <w:tcW w:type="dxa" w:w="2880"/>
+          </w:tcPr>
+          <w:p>
+            <w:pPr>
+              <w:jc w:val="left"/>
+            </w:pPr>
+            <w:r/>
+            <w:r>
+              <w:rPr>
+                <w:rFonts w:ascii="Arvo" w:hAnsi="Arvo"/>
+                <w:sz w:val="20"/>
+              </w:rPr>
+              <w:t>Elaboração e protocolo de defesa em processo judicial.</w:t>
+            </w:r>
+          </w:p>
+        </w:tc>
+        <w:tc>
+          <w:tcPr>
+            <w:tcW w:type="dxa" w:w="2880"/>
+          </w:tcPr>
+          <w:p>
+            <w:pPr>
+              <w:jc w:val="left"/>
+            </w:pPr>
+            <w:r/>
+            <w:r>
+              <w:rPr>
+                <w:rFonts w:ascii="Arvo" w:hAnsi="Arvo"/>
+                <w:sz w:val="20"/>
+              </w:rPr>
+              <w:t>R$ 2.200,00</w:t>
+            </w:r>
+          </w:p>
+        </w:tc>
+      </w:tr>
+      <w:tr>
+        <w:tc>
+          <w:tcPr>
+            <w:tcW w:type="dxa" w:w="2880"/>
+          </w:tcPr>
+          <w:p>
+            <w:pPr>
+              <w:jc w:val="left"/>
+            </w:pPr>
+            <w:r/>
+            <w:r>
+              <w:rPr>
+                <w:rFonts w:ascii="Arvo" w:hAnsi="Arvo"/>
+                <w:sz w:val="20"/>
+              </w:rPr>
+              <w:t>Recurso Ordinário</w:t>
+            </w:r>
+          </w:p>
+        </w:tc>
+        <w:tc>
+          <w:tcPr>
+            <w:tcW w:type="dxa" w:w="2880"/>
+          </w:tcPr>
+          <w:p>
+            <w:pPr>
+              <w:jc w:val="left"/>
+            </w:pPr>
+            <w:r/>
+            <w:r>
+              <w:rPr>
+                <w:rFonts w:ascii="Arvo" w:hAnsi="Arvo"/>
+                <w:sz w:val="20"/>
+              </w:rPr>
+              <w:t>Elaboração e protocolo de recurso ordinário na Justiça do Trabalho.</w:t>
+            </w:r>
+          </w:p>
+        </w:tc>
+        <w:tc>
+          <w:tcPr>
+            <w:tcW w:type="dxa" w:w="2880"/>
+          </w:tcPr>
+          <w:p>
+            <w:pPr>
+              <w:jc w:val="left"/>
+            </w:pPr>
+            <w:r/>
+            <w:r>
+              <w:rPr>
+                <w:rFonts w:ascii="Arvo" w:hAnsi="Arvo"/>
+                <w:sz w:val="20"/>
+              </w:rPr>
+              <w:t>R$ 3.000,00</w:t>
+            </w:r>
+          </w:p>
+        </w:tc>
+      </w:tr>
+      <w:tr>
+        <w:tc>
+          <w:tcPr>
+            <w:tcW w:type="dxa" w:w="2880"/>
+          </w:tcPr>
+          <w:p>
+            <w:pPr>
+              <w:jc w:val="left"/>
+            </w:pPr>
+            <w:r/>
+            <w:r>
+              <w:rPr>
+                <w:rFonts w:ascii="Arvo" w:hAnsi="Arvo"/>
+                <w:sz w:val="20"/>
+              </w:rPr>
+              <w:t>Agravo</w:t>
+            </w:r>
+          </w:p>
+        </w:tc>
+        <w:tc>
+          <w:tcPr>
+            <w:tcW w:type="dxa" w:w="2880"/>
+          </w:tcPr>
+          <w:p>
+            <w:pPr>
+              <w:jc w:val="left"/>
+            </w:pPr>
+            <w:r/>
+            <w:r>
+              <w:rPr>
+                <w:rFonts w:ascii="Arvo" w:hAnsi="Arvo"/>
+                <w:sz w:val="20"/>
+              </w:rPr>
+              <w:t>Elaboração e protocolo de agravo de instrumento ou agravo interno.</w:t>
+            </w:r>
+          </w:p>
+        </w:tc>
+        <w:tc>
+          <w:tcPr>
+            <w:tcW w:type="dxa" w:w="2880"/>
+          </w:tcPr>
+          <w:p>
+            <w:pPr>
+              <w:jc w:val="left"/>
+            </w:pPr>
+            <w:r/>
+            <w:r>
+              <w:rPr>
+                <w:rFonts w:ascii="Arvo" w:hAnsi="Arvo"/>
+                <w:sz w:val="20"/>
+              </w:rPr>
+              <w:t>R$ 1.800,00</w:t>
+            </w:r>
+          </w:p>
+        </w:tc>
+      </w:tr>
+      <w:tr>
+        <w:tc>
+          <w:tcPr>
+            <w:tcW w:type="dxa" w:w="2880"/>
+          </w:tcPr>
+          <w:p>
+            <w:pPr>
+              <w:jc w:val="left"/>
+            </w:pPr>
+            <w:r/>
+            <w:r>
+              <w:rPr>
+                <w:rFonts w:ascii="Arvo" w:hAnsi="Arvo"/>
+                <w:sz w:val="20"/>
+              </w:rPr>
+              <w:t>Apelação</w:t>
+            </w:r>
+          </w:p>
+        </w:tc>
+        <w:tc>
+          <w:tcPr>
+            <w:tcW w:type="dxa" w:w="2880"/>
+          </w:tcPr>
+          <w:p>
+            <w:pPr>
+              <w:jc w:val="left"/>
+            </w:pPr>
+            <w:r/>
+            <w:r>
+              <w:rPr>
+                <w:rFonts w:ascii="Arvo" w:hAnsi="Arvo"/>
+                <w:sz w:val="20"/>
+              </w:rPr>
+              <w:t>Elaboração e protocolo de apelação cível em 1º grau de jurisdição.</w:t>
+            </w:r>
+          </w:p>
+        </w:tc>
+        <w:tc>
+          <w:tcPr>
+            <w:tcW w:type="dxa" w:w="2880"/>
+          </w:tcPr>
+          <w:p>
+            <w:pPr>
+              <w:jc w:val="left"/>
+            </w:pPr>
+            <w:r/>
+            <w:r>
+              <w:rPr>
+                <w:rFonts w:ascii="Arvo" w:hAnsi="Arvo"/>
+                <w:sz w:val="20"/>
+              </w:rPr>
+              <w:t>R$ 3.500,00</w:t>
+            </w:r>
+          </w:p>
+        </w:tc>
+      </w:tr>
+      <w:tr>
+        <w:tc>
+          <w:tcPr>
+            <w:tcW w:type="dxa" w:w="2880"/>
+          </w:tcPr>
+          <w:p>
+            <w:pPr>
+              <w:jc w:val="left"/>
+            </w:pPr>
+            <w:r/>
+            <w:r>
+              <w:rPr>
+                <w:rFonts w:ascii="Arvo" w:hAnsi="Arvo"/>
+                <w:sz w:val="20"/>
+              </w:rPr>
+              <w:t>Recurso Especial / Extraordinário</w:t>
+            </w:r>
+          </w:p>
+        </w:tc>
+        <w:tc>
+          <w:tcPr>
+            <w:tcW w:type="dxa" w:w="2880"/>
+          </w:tcPr>
+          <w:p>
+            <w:pPr>
+              <w:jc w:val="left"/>
+            </w:pPr>
+            <w:r/>
+            <w:r>
+              <w:rPr>
+                <w:rFonts w:ascii="Arvo" w:hAnsi="Arvo"/>
+                <w:sz w:val="20"/>
+              </w:rPr>
+              <w:t>Elaboração e protocolo de recursos excepcionais ao STJ e STF, inclusive agravos correlatos.</w:t>
+            </w:r>
+          </w:p>
+        </w:tc>
+        <w:tc>
+          <w:tcPr>
+            <w:tcW w:type="dxa" w:w="2880"/>
+          </w:tcPr>
+          <w:p>
+            <w:pPr>
+              <w:jc w:val="left"/>
+            </w:pPr>
+            <w:r/>
+            <w:r>
+              <w:rPr>
+                <w:rFonts w:ascii="Arvo" w:hAnsi="Arvo"/>
+                <w:sz w:val="20"/>
+              </w:rPr>
+              <w:t>R$ 6.500,00</w:t>
+            </w:r>
+          </w:p>
+        </w:tc>
+      </w:tr>
+      <w:tr>
+        <w:tc>
+          <w:tcPr>
+            <w:tcW w:type="dxa" w:w="2880"/>
+          </w:tcPr>
+          <w:p>
+            <w:pPr>
+              <w:jc w:val="left"/>
+            </w:pPr>
+            <w:r/>
+            <w:r>
+              <w:rPr>
+                <w:rFonts w:ascii="Arvo" w:hAnsi="Arvo"/>
+                <w:sz w:val="20"/>
+              </w:rPr>
+              <w:t>Audiência</w:t>
+            </w:r>
+          </w:p>
+        </w:tc>
+        <w:tc>
+          <w:tcPr>
+            <w:tcW w:type="dxa" w:w="2880"/>
+          </w:tcPr>
+          <w:p>
+            <w:pPr>
+              <w:jc w:val="left"/>
+            </w:pPr>
+            <w:r/>
+            <w:r>
+              <w:rPr>
+                <w:rFonts w:ascii="Arvo" w:hAnsi="Arvo"/>
+                <w:sz w:val="20"/>
+              </w:rPr>
+              <w:t>Comparecimento, acompanhamento e atuação em audiência.</w:t>
+            </w:r>
+          </w:p>
+        </w:tc>
+        <w:tc>
+          <w:tcPr>
+            <w:tcW w:type="dxa" w:w="2880"/>
+          </w:tcPr>
+          <w:p>
+            <w:pPr>
+              <w:jc w:val="left"/>
+            </w:pPr>
+            <w:r/>
+            <w:r>
+              <w:rPr>
+                <w:rFonts w:ascii="Arvo" w:hAnsi="Arvo"/>
+                <w:sz w:val="20"/>
+              </w:rPr>
+              <w:t>R$ 1.500,00</w:t>
+            </w:r>
+          </w:p>
+        </w:tc>
+      </w:tr>
+      <w:tr>
+        <w:tc>
+          <w:tcPr>
+            <w:tcW w:type="dxa" w:w="2880"/>
+          </w:tcPr>
+          <w:p>
+            <w:pPr>
+              <w:jc w:val="left"/>
+            </w:pPr>
+            <w:r/>
+            <w:r>
+              <w:rPr>
+                <w:rFonts w:ascii="Arvo" w:hAnsi="Arvo"/>
+                <w:sz w:val="20"/>
+              </w:rPr>
+              <w:t>Diligência Externa</w:t>
+            </w:r>
+          </w:p>
+        </w:tc>
+        <w:tc>
+          <w:tcPr>
+            <w:tcW w:type="dxa" w:w="2880"/>
+          </w:tcPr>
+          <w:p>
+            <w:pPr>
+              <w:jc w:val="left"/>
+            </w:pPr>
+            <w:r/>
+            <w:r>
+              <w:rPr>
+                <w:rFonts w:ascii="Arvo" w:hAnsi="Arvo"/>
+                <w:sz w:val="20"/>
+              </w:rPr>
+              <w:t>Realização de diligência presencial em cartório, órgão público ou unidade do Contratante.</w:t>
+            </w:r>
+          </w:p>
+        </w:tc>
+        <w:tc>
+          <w:tcPr>
+            <w:tcW w:type="dxa" w:w="2880"/>
+          </w:tcPr>
+          <w:p>
+            <w:pPr>
+              <w:jc w:val="left"/>
+            </w:pPr>
+            <w:r/>
+            <w:r>
+              <w:rPr>
+                <w:rFonts w:ascii="Arvo" w:hAnsi="Arvo"/>
+                <w:sz w:val="20"/>
+              </w:rPr>
+              <w:t>R$ 850,00</w:t>
+            </w:r>
+          </w:p>
+        </w:tc>
+      </w:tr>
+    </w:tbl>
+    <w:p>
+      <w:r>
+        <w:rPr>
+          <w:rFonts w:ascii="Arvo" w:hAnsi="Arvo"/>
+          <w:sz w:val="20"/>
+        </w:rPr>
+      </w:r>
+    </w:p>
+    <w:p>
+      <w:r>
+        <w:rPr>
+          <w:rFonts w:ascii="Arvo" w:hAnsi="Arvo"/>
+          <w:b/>
+          <w:sz w:val="20"/>
+        </w:rPr>
+        <w:t>Honorários — Escopo Contencioso C</w:t>
+      </w:r>
+    </w:p>
+    <w:p>
+      <w:pPr>
         <w:jc w:val="both"/>
       </w:pPr>
       <w:r>
         <w:rPr>
           <w:rFonts w:ascii="Arvo" w:hAnsi="Arvo"/>
           <w:sz w:val="20"/>
-          <w:szCs w:val="20"/>
-        </w:rPr>
-        <w:t xml:space="preserve"/>
-      </w:r>
-      <w:p>
-        <w:r>
-          <w:rPr>
-            <w:rFonts w:ascii="Arvo" w:hAnsi="Arvo"/>
-            <w:b/>
-            <w:sz w:val="20"/>
-          </w:rPr>
-          <w:t>Honorários — Escopo Contencioso C</w:t>
-        </w:r>
-      </w:p>
-      <w:p>
-        <w:pPr>
-          <w:jc w:val="both"/>
-        </w:pPr>
-        <w:r>
-          <w:rPr>
-            <w:rFonts w:ascii="Arvo" w:hAnsi="Arvo"/>
-            <w:sz w:val="20"/>
-          </w:rPr>
-          <w:t>Preço global para a condução integral do escopo delimitado: R$ 85.000,00.</w:t>
-        </w:r>
-      </w:p>
-      <w:p>
-        <w:pPr>
-          <w:jc w:val="both"/>
-        </w:pPr>
-        <w:r>
-          <w:rPr>
-            <w:rFonts w:ascii="Arvo" w:hAnsi="Arvo"/>
-            <w:sz w:val="20"/>
-          </w:rPr>
-          <w:t>Ações e fases cobertas: Conhecimento e Execução em primeira e segunda instâncias (TRT/TRF), incluindo embargos de declaração e demais incidentes.</w:t>
-        </w:r>
-      </w:p>
-      <w:p>
-        <w:pPr>
-          <w:jc w:val="both"/>
-        </w:pPr>
-        <w:r>
-          <w:rPr>
-            <w:rFonts w:ascii="Arvo" w:hAnsi="Arvo"/>
-            <w:sz w:val="20"/>
-          </w:rPr>
-          <w:t>Forma de pagamento: 40% no ato da assinatura da proposta; 30% após sentença de primeiro grau; 30% após trânsito em julgado.</w:t>
-        </w:r>
-      </w:p>
-      <w:p>
-        <w:r>
-          <w:rPr>
-            <w:rFonts w:ascii="Arvo" w:hAnsi="Arvo"/>
-            <w:sz w:val="20"/>
-          </w:rPr>
-        </w:r>
-      </w:p>
-      <w:r>
-        <w:t xml:space="preserve"/>
+        </w:rPr>
+        <w:t>Preço global para a condução integral do escopo delimitado: R$ 85.000,00.</w:t>
+      </w:r>
+    </w:p>
+    <w:p>
+      <w:pPr>
+        <w:jc w:val="both"/>
+      </w:pPr>
+      <w:r>
+        <w:rPr>
+          <w:rFonts w:ascii="Arvo" w:hAnsi="Arvo"/>
+          <w:sz w:val="20"/>
+        </w:rPr>
+        <w:t>Ações e fases cobertas: Conhecimento e Execução em primeira e segunda instâncias (TRT/TRF), incluindo embargos de declaração e demais incidentes.</w:t>
+      </w:r>
+    </w:p>
+    <w:p>
+      <w:pPr>
+        <w:jc w:val="both"/>
+      </w:pPr>
+      <w:r>
+        <w:rPr>
+          <w:rFonts w:ascii="Arvo" w:hAnsi="Arvo"/>
+          <w:sz w:val="20"/>
+        </w:rPr>
+        <w:t>Forma de pagamento: 40% no ato da assinatura da proposta; 30% após sentença de primeiro grau; 30% após trânsito em julgado.</w:t>
+      </w:r>
+    </w:p>
+    <w:p>
+      <w:r>
+        <w:rPr>
+          <w:rFonts w:ascii="Arvo" w:hAnsi="Arvo"/>
+          <w:sz w:val="20"/>
+        </w:rPr>
       </w:r>
     </w:p>
     <w:p>

</xml_diff>

<commit_message>
Tabelas dos subdocs com estilo idêntico ao template original
Substitui geração de tabelas via python-docx (que produzia tabelas
sem formatação visual) por injeção direta de XML construído para
replicar o estilo exato do template:
- Header: fundo FAE2D5 (bege/rosa), texto bold centralizado
- Primeira coluna de dados: fundo FFF9F4 (creme), demais colunas
  transparentes
- Bordas: single sz=4 color=1A3557 (azul escuro) em todas as células
- Padding: 100/120 dxa
- Fonte Arvo sz=10 em todas as células

Implementação: pmra/template_engine.py
- _para_xml(): gera <w:p> formatado (Arvo, justificado, bold opcional)
- _table_xml(): gera <w:tbl> completo com cells estilizadas
- _subdoc_append(): injeta bloco XML antes do <w:sectPr> do subdoc

https://claude.ai/code/session_012AQuGGrkZo1QrHGcyvhfSB
</commit_message>
<xml_diff>
--- a/Proposta_Demo_Multi_Escopo.docx
+++ b/Proposta_Demo_Multi_Escopo.docx
@@ -804,31 +804,49 @@
       </w:pPr>
     </w:p>
     <w:p>
-      <w:r>
+      <w:pPr>
+        <w:spacing w:line="276" w:lineRule="auto"/>
         <w:rPr>
           <w:rFonts w:ascii="Arvo" w:hAnsi="Arvo"/>
           <w:b/>
-          <w:sz w:val="20"/>
-        </w:rPr>
-        <w:t>Honorários — Escopo Consultivo A</w:t>
-      </w:r>
-    </w:p>
-    <w:p>
-      <w:pPr>
+          <w:bCs/>
+          <w:sz w:val="20"/>
+          <w:szCs w:val="20"/>
+        </w:rPr>
+      </w:pPr>
+      <w:r>
+        <w:rPr>
+          <w:rFonts w:ascii="Arvo" w:hAnsi="Arvo"/>
+          <w:b/>
+          <w:bCs/>
+          <w:sz w:val="20"/>
+          <w:szCs w:val="20"/>
+        </w:rPr>
+        <w:t xml:space="preserve">Honorários — Escopo Consultivo A</w:t>
+      </w:r>
+    </w:p>
+    <w:p>
+      <w:pPr>
+        <w:spacing w:line="276" w:lineRule="auto"/>
         <w:jc w:val="both"/>
-      </w:pPr>
-      <w:r>
-        <w:rPr>
-          <w:rFonts w:ascii="Arvo" w:hAnsi="Arvo"/>
-          <w:sz w:val="20"/>
-        </w:rPr>
-        <w:t>Os honorários serão apurados conforme a tabela de senioridade abaixo, com base em relatório mensal de horas executadas.</w:t>
+        <w:rPr>
+          <w:rFonts w:ascii="Arvo" w:hAnsi="Arvo"/>
+          <w:sz w:val="20"/>
+          <w:szCs w:val="20"/>
+        </w:rPr>
+      </w:pPr>
+      <w:r>
+        <w:rPr>
+          <w:rFonts w:ascii="Arvo" w:hAnsi="Arvo"/>
+          <w:sz w:val="20"/>
+          <w:szCs w:val="20"/>
+        </w:rPr>
+        <w:t xml:space="preserve">Os honorários serão apurados conforme a tabela de senioridade abaixo, com base em relatório mensal de horas executadas.</w:t>
       </w:r>
     </w:p>
     <w:tbl>
       <w:tblPr>
-        <w:tblW w:type="auto" w:w="0"/>
-        <w:tblLook w:firstColumn="1" w:firstRow="1" w:lastColumn="0" w:lastRow="0" w:noHBand="0" w:noVBand="1" w:val="04A0"/>
+        <w:tblW w:w="9634" w:type="dxa"/>
         <w:tblBorders>
           <w:top w:val="single" w:sz="4" w:space="0" w:color="auto"/>
           <w:left w:val="single" w:sz="4" w:space="0" w:color="auto"/>
@@ -836,47 +854,96 @@
           <w:insideH w:val="single" w:sz="4" w:space="0" w:color="auto"/>
           <w:insideV w:val="single" w:sz="4" w:space="0" w:color="auto"/>
         </w:tblBorders>
+        <w:tblCellMar>
+          <w:left w:w="10" w:type="dxa"/>
+          <w:right w:w="10" w:type="dxa"/>
+        </w:tblCellMar>
+        <w:tblLook w:val="04A0" w:firstRow="1" w:lastRow="0" w:firstColumn="1" w:lastColumn="0" w:noHBand="0" w:noVBand="1"/>
       </w:tblPr>
       <w:tblGrid>
-        <w:gridCol w:w="4320"/>
-        <w:gridCol w:w="4320"/>
+        <w:gridCol w:w="3208"/>
+        <w:gridCol w:w="6426"/>
       </w:tblGrid>
       <w:tr>
         <w:tc>
           <w:tcPr>
-            <w:tcW w:type="dxa" w:w="4320"/>
+            <w:tcW w:w="3208" w:type="dxa"/>
+            <w:tcBorders>
+              <w:top w:val="single" w:sz="4" w:space="0" w:color="1A3557"/>
+              <w:left w:val="single" w:sz="4" w:space="0" w:color="1A3557"/>
+              <w:bottom w:val="single" w:sz="4" w:space="0" w:color="1A3557"/>
+              <w:right w:val="single" w:sz="4" w:space="0" w:color="1A3557"/>
+            </w:tcBorders>
+            <w:shd w:val="clear" w:color="auto" w:fill="FAE2D5"/>
+            <w:tcMar>
+              <w:top w:w="100" w:type="dxa"/>
+              <w:left w:w="120" w:type="dxa"/>
+              <w:bottom w:w="100" w:type="dxa"/>
+              <w:right w:w="120" w:type="dxa"/>
+            </w:tcMar>
           </w:tcPr>
           <w:p>
             <w:pPr>
-              <w:jc w:val="left"/>
+              <w:spacing w:line="276" w:lineRule="auto"/>
+              <w:jc w:val="center"/>
+              <w:rPr>
+                <w:rFonts w:ascii="Arvo" w:hAnsi="Arvo"/>
+                <w:b/>
+                <w:bCs/>
+                <w:sz w:val="20"/>
+                <w:szCs w:val="20"/>
+              </w:rPr>
             </w:pPr>
-            <w:r/>
             <w:r>
               <w:rPr>
                 <w:rFonts w:ascii="Arvo" w:hAnsi="Arvo"/>
                 <w:b/>
-                <w:sz w:val="20"/>
-              </w:rPr>
-              <w:t>Categoria</w:t>
+                <w:bCs/>
+                <w:sz w:val="20"/>
+                <w:szCs w:val="20"/>
+              </w:rPr>
+              <w:t xml:space="preserve">Categoria</w:t>
             </w:r>
           </w:p>
         </w:tc>
         <w:tc>
           <w:tcPr>
-            <w:tcW w:type="dxa" w:w="4320"/>
+            <w:tcW w:w="6426" w:type="dxa"/>
+            <w:tcBorders>
+              <w:top w:val="single" w:sz="4" w:space="0" w:color="1A3557"/>
+              <w:left w:val="single" w:sz="4" w:space="0" w:color="1A3557"/>
+              <w:bottom w:val="single" w:sz="4" w:space="0" w:color="1A3557"/>
+              <w:right w:val="single" w:sz="4" w:space="0" w:color="1A3557"/>
+            </w:tcBorders>
+            <w:shd w:val="clear" w:color="auto" w:fill="FAE2D5"/>
+            <w:tcMar>
+              <w:top w:w="100" w:type="dxa"/>
+              <w:left w:w="120" w:type="dxa"/>
+              <w:bottom w:w="100" w:type="dxa"/>
+              <w:right w:w="120" w:type="dxa"/>
+            </w:tcMar>
           </w:tcPr>
           <w:p>
             <w:pPr>
-              <w:jc w:val="left"/>
+              <w:spacing w:line="276" w:lineRule="auto"/>
+              <w:jc w:val="center"/>
+              <w:rPr>
+                <w:rFonts w:ascii="Arvo" w:hAnsi="Arvo"/>
+                <w:b/>
+                <w:bCs/>
+                <w:sz w:val="20"/>
+                <w:szCs w:val="20"/>
+              </w:rPr>
             </w:pPr>
-            <w:r/>
             <w:r>
               <w:rPr>
                 <w:rFonts w:ascii="Arvo" w:hAnsi="Arvo"/>
                 <w:b/>
-                <w:sz w:val="20"/>
-              </w:rPr>
-              <w:t>Valor por hora</w:t>
+                <w:bCs/>
+                <w:sz w:val="20"/>
+                <w:szCs w:val="20"/>
+              </w:rPr>
+              <w:t xml:space="preserve">Valor por Hora (R$)</w:t>
             </w:r>
           </w:p>
         </w:tc>
@@ -884,37 +951,74 @@
       <w:tr>
         <w:tc>
           <w:tcPr>
-            <w:tcW w:type="dxa" w:w="4320"/>
+            <w:tcW w:w="3208" w:type="dxa"/>
+            <w:tcBorders>
+              <w:top w:val="single" w:sz="4" w:space="0" w:color="1A3557"/>
+              <w:left w:val="single" w:sz="4" w:space="0" w:color="1A3557"/>
+              <w:bottom w:val="single" w:sz="4" w:space="0" w:color="1A3557"/>
+              <w:right w:val="single" w:sz="4" w:space="0" w:color="1A3557"/>
+            </w:tcBorders>
+            <w:shd w:val="clear" w:color="auto" w:fill="FFF9F4"/>
+            <w:tcMar>
+              <w:top w:w="100" w:type="dxa"/>
+              <w:left w:w="120" w:type="dxa"/>
+              <w:bottom w:w="100" w:type="dxa"/>
+              <w:right w:w="120" w:type="dxa"/>
+            </w:tcMar>
           </w:tcPr>
           <w:p>
             <w:pPr>
-              <w:jc w:val="left"/>
+              <w:spacing w:line="276" w:lineRule="auto"/>
+              <w:jc w:val="both"/>
+              <w:rPr>
+                <w:rFonts w:ascii="Arvo" w:hAnsi="Arvo"/>
+                <w:sz w:val="20"/>
+                <w:szCs w:val="20"/>
+              </w:rPr>
             </w:pPr>
-            <w:r/>
             <w:r>
               <w:rPr>
                 <w:rFonts w:ascii="Arvo" w:hAnsi="Arvo"/>
                 <w:sz w:val="20"/>
-              </w:rPr>
-              <w:t>Sócio</w:t>
+                <w:szCs w:val="20"/>
+              </w:rPr>
+              <w:t xml:space="preserve">Sócio</w:t>
             </w:r>
           </w:p>
         </w:tc>
         <w:tc>
           <w:tcPr>
-            <w:tcW w:type="dxa" w:w="4320"/>
+            <w:tcW w:w="6426" w:type="dxa"/>
+            <w:tcBorders>
+              <w:top w:val="single" w:sz="4" w:space="0" w:color="1A3557"/>
+              <w:left w:val="single" w:sz="4" w:space="0" w:color="1A3557"/>
+              <w:bottom w:val="single" w:sz="4" w:space="0" w:color="1A3557"/>
+              <w:right w:val="single" w:sz="4" w:space="0" w:color="1A3557"/>
+            </w:tcBorders>
+            <w:tcMar>
+              <w:top w:w="100" w:type="dxa"/>
+              <w:left w:w="120" w:type="dxa"/>
+              <w:bottom w:w="100" w:type="dxa"/>
+              <w:right w:w="120" w:type="dxa"/>
+            </w:tcMar>
           </w:tcPr>
           <w:p>
             <w:pPr>
-              <w:jc w:val="left"/>
+              <w:spacing w:line="276" w:lineRule="auto"/>
+              <w:jc w:val="both"/>
+              <w:rPr>
+                <w:rFonts w:ascii="Arvo" w:hAnsi="Arvo"/>
+                <w:sz w:val="20"/>
+                <w:szCs w:val="20"/>
+              </w:rPr>
             </w:pPr>
-            <w:r/>
             <w:r>
               <w:rPr>
                 <w:rFonts w:ascii="Arvo" w:hAnsi="Arvo"/>
                 <w:sz w:val="20"/>
-              </w:rPr>
-              <w:t>R$ 1.200,00</w:t>
+                <w:szCs w:val="20"/>
+              </w:rPr>
+              <w:t xml:space="preserve">R$ 1.200,00</w:t>
             </w:r>
           </w:p>
         </w:tc>
@@ -922,37 +1026,74 @@
       <w:tr>
         <w:tc>
           <w:tcPr>
-            <w:tcW w:type="dxa" w:w="4320"/>
+            <w:tcW w:w="3208" w:type="dxa"/>
+            <w:tcBorders>
+              <w:top w:val="single" w:sz="4" w:space="0" w:color="1A3557"/>
+              <w:left w:val="single" w:sz="4" w:space="0" w:color="1A3557"/>
+              <w:bottom w:val="single" w:sz="4" w:space="0" w:color="1A3557"/>
+              <w:right w:val="single" w:sz="4" w:space="0" w:color="1A3557"/>
+            </w:tcBorders>
+            <w:shd w:val="clear" w:color="auto" w:fill="FFF9F4"/>
+            <w:tcMar>
+              <w:top w:w="100" w:type="dxa"/>
+              <w:left w:w="120" w:type="dxa"/>
+              <w:bottom w:w="100" w:type="dxa"/>
+              <w:right w:w="120" w:type="dxa"/>
+            </w:tcMar>
           </w:tcPr>
           <w:p>
             <w:pPr>
-              <w:jc w:val="left"/>
+              <w:spacing w:line="276" w:lineRule="auto"/>
+              <w:jc w:val="both"/>
+              <w:rPr>
+                <w:rFonts w:ascii="Arvo" w:hAnsi="Arvo"/>
+                <w:sz w:val="20"/>
+                <w:szCs w:val="20"/>
+              </w:rPr>
             </w:pPr>
-            <w:r/>
             <w:r>
               <w:rPr>
                 <w:rFonts w:ascii="Arvo" w:hAnsi="Arvo"/>
                 <w:sz w:val="20"/>
-              </w:rPr>
-              <w:t>Associado Sênior</w:t>
+                <w:szCs w:val="20"/>
+              </w:rPr>
+              <w:t xml:space="preserve">Associado Sênior</w:t>
             </w:r>
           </w:p>
         </w:tc>
         <w:tc>
           <w:tcPr>
-            <w:tcW w:type="dxa" w:w="4320"/>
+            <w:tcW w:w="6426" w:type="dxa"/>
+            <w:tcBorders>
+              <w:top w:val="single" w:sz="4" w:space="0" w:color="1A3557"/>
+              <w:left w:val="single" w:sz="4" w:space="0" w:color="1A3557"/>
+              <w:bottom w:val="single" w:sz="4" w:space="0" w:color="1A3557"/>
+              <w:right w:val="single" w:sz="4" w:space="0" w:color="1A3557"/>
+            </w:tcBorders>
+            <w:tcMar>
+              <w:top w:w="100" w:type="dxa"/>
+              <w:left w:w="120" w:type="dxa"/>
+              <w:bottom w:w="100" w:type="dxa"/>
+              <w:right w:w="120" w:type="dxa"/>
+            </w:tcMar>
           </w:tcPr>
           <w:p>
             <w:pPr>
-              <w:jc w:val="left"/>
+              <w:spacing w:line="276" w:lineRule="auto"/>
+              <w:jc w:val="both"/>
+              <w:rPr>
+                <w:rFonts w:ascii="Arvo" w:hAnsi="Arvo"/>
+                <w:sz w:val="20"/>
+                <w:szCs w:val="20"/>
+              </w:rPr>
             </w:pPr>
-            <w:r/>
             <w:r>
               <w:rPr>
                 <w:rFonts w:ascii="Arvo" w:hAnsi="Arvo"/>
                 <w:sz w:val="20"/>
-              </w:rPr>
-              <w:t>R$ 950,00</w:t>
+                <w:szCs w:val="20"/>
+              </w:rPr>
+              <w:t xml:space="preserve">R$ 950,00</w:t>
             </w:r>
           </w:p>
         </w:tc>
@@ -960,37 +1101,74 @@
       <w:tr>
         <w:tc>
           <w:tcPr>
-            <w:tcW w:type="dxa" w:w="4320"/>
+            <w:tcW w:w="3208" w:type="dxa"/>
+            <w:tcBorders>
+              <w:top w:val="single" w:sz="4" w:space="0" w:color="1A3557"/>
+              <w:left w:val="single" w:sz="4" w:space="0" w:color="1A3557"/>
+              <w:bottom w:val="single" w:sz="4" w:space="0" w:color="1A3557"/>
+              <w:right w:val="single" w:sz="4" w:space="0" w:color="1A3557"/>
+            </w:tcBorders>
+            <w:shd w:val="clear" w:color="auto" w:fill="FFF9F4"/>
+            <w:tcMar>
+              <w:top w:w="100" w:type="dxa"/>
+              <w:left w:w="120" w:type="dxa"/>
+              <w:bottom w:w="100" w:type="dxa"/>
+              <w:right w:w="120" w:type="dxa"/>
+            </w:tcMar>
           </w:tcPr>
           <w:p>
             <w:pPr>
-              <w:jc w:val="left"/>
+              <w:spacing w:line="276" w:lineRule="auto"/>
+              <w:jc w:val="both"/>
+              <w:rPr>
+                <w:rFonts w:ascii="Arvo" w:hAnsi="Arvo"/>
+                <w:sz w:val="20"/>
+                <w:szCs w:val="20"/>
+              </w:rPr>
             </w:pPr>
-            <w:r/>
             <w:r>
               <w:rPr>
                 <w:rFonts w:ascii="Arvo" w:hAnsi="Arvo"/>
                 <w:sz w:val="20"/>
-              </w:rPr>
-              <w:t>Associado Pleno</w:t>
+                <w:szCs w:val="20"/>
+              </w:rPr>
+              <w:t xml:space="preserve">Associado Pleno</w:t>
             </w:r>
           </w:p>
         </w:tc>
         <w:tc>
           <w:tcPr>
-            <w:tcW w:type="dxa" w:w="4320"/>
+            <w:tcW w:w="6426" w:type="dxa"/>
+            <w:tcBorders>
+              <w:top w:val="single" w:sz="4" w:space="0" w:color="1A3557"/>
+              <w:left w:val="single" w:sz="4" w:space="0" w:color="1A3557"/>
+              <w:bottom w:val="single" w:sz="4" w:space="0" w:color="1A3557"/>
+              <w:right w:val="single" w:sz="4" w:space="0" w:color="1A3557"/>
+            </w:tcBorders>
+            <w:tcMar>
+              <w:top w:w="100" w:type="dxa"/>
+              <w:left w:w="120" w:type="dxa"/>
+              <w:bottom w:w="100" w:type="dxa"/>
+              <w:right w:w="120" w:type="dxa"/>
+            </w:tcMar>
           </w:tcPr>
           <w:p>
             <w:pPr>
-              <w:jc w:val="left"/>
+              <w:spacing w:line="276" w:lineRule="auto"/>
+              <w:jc w:val="both"/>
+              <w:rPr>
+                <w:rFonts w:ascii="Arvo" w:hAnsi="Arvo"/>
+                <w:sz w:val="20"/>
+                <w:szCs w:val="20"/>
+              </w:rPr>
             </w:pPr>
-            <w:r/>
             <w:r>
               <w:rPr>
                 <w:rFonts w:ascii="Arvo" w:hAnsi="Arvo"/>
                 <w:sz w:val="20"/>
-              </w:rPr>
-              <w:t>R$ 750,00</w:t>
+                <w:szCs w:val="20"/>
+              </w:rPr>
+              <w:t xml:space="preserve">R$ 750,00</w:t>
             </w:r>
           </w:p>
         </w:tc>
@@ -998,37 +1176,74 @@
       <w:tr>
         <w:tc>
           <w:tcPr>
-            <w:tcW w:type="dxa" w:w="4320"/>
+            <w:tcW w:w="3208" w:type="dxa"/>
+            <w:tcBorders>
+              <w:top w:val="single" w:sz="4" w:space="0" w:color="1A3557"/>
+              <w:left w:val="single" w:sz="4" w:space="0" w:color="1A3557"/>
+              <w:bottom w:val="single" w:sz="4" w:space="0" w:color="1A3557"/>
+              <w:right w:val="single" w:sz="4" w:space="0" w:color="1A3557"/>
+            </w:tcBorders>
+            <w:shd w:val="clear" w:color="auto" w:fill="FFF9F4"/>
+            <w:tcMar>
+              <w:top w:w="100" w:type="dxa"/>
+              <w:left w:w="120" w:type="dxa"/>
+              <w:bottom w:w="100" w:type="dxa"/>
+              <w:right w:w="120" w:type="dxa"/>
+            </w:tcMar>
           </w:tcPr>
           <w:p>
             <w:pPr>
-              <w:jc w:val="left"/>
+              <w:spacing w:line="276" w:lineRule="auto"/>
+              <w:jc w:val="both"/>
+              <w:rPr>
+                <w:rFonts w:ascii="Arvo" w:hAnsi="Arvo"/>
+                <w:sz w:val="20"/>
+                <w:szCs w:val="20"/>
+              </w:rPr>
             </w:pPr>
-            <w:r/>
             <w:r>
               <w:rPr>
                 <w:rFonts w:ascii="Arvo" w:hAnsi="Arvo"/>
                 <w:sz w:val="20"/>
-              </w:rPr>
-              <w:t>Associado Júnior</w:t>
+                <w:szCs w:val="20"/>
+              </w:rPr>
+              <w:t xml:space="preserve">Associado Júnior</w:t>
             </w:r>
           </w:p>
         </w:tc>
         <w:tc>
           <w:tcPr>
-            <w:tcW w:type="dxa" w:w="4320"/>
+            <w:tcW w:w="6426" w:type="dxa"/>
+            <w:tcBorders>
+              <w:top w:val="single" w:sz="4" w:space="0" w:color="1A3557"/>
+              <w:left w:val="single" w:sz="4" w:space="0" w:color="1A3557"/>
+              <w:bottom w:val="single" w:sz="4" w:space="0" w:color="1A3557"/>
+              <w:right w:val="single" w:sz="4" w:space="0" w:color="1A3557"/>
+            </w:tcBorders>
+            <w:tcMar>
+              <w:top w:w="100" w:type="dxa"/>
+              <w:left w:w="120" w:type="dxa"/>
+              <w:bottom w:w="100" w:type="dxa"/>
+              <w:right w:w="120" w:type="dxa"/>
+            </w:tcMar>
           </w:tcPr>
           <w:p>
             <w:pPr>
-              <w:jc w:val="left"/>
+              <w:spacing w:line="276" w:lineRule="auto"/>
+              <w:jc w:val="both"/>
+              <w:rPr>
+                <w:rFonts w:ascii="Arvo" w:hAnsi="Arvo"/>
+                <w:sz w:val="20"/>
+                <w:szCs w:val="20"/>
+              </w:rPr>
             </w:pPr>
-            <w:r/>
             <w:r>
               <w:rPr>
                 <w:rFonts w:ascii="Arvo" w:hAnsi="Arvo"/>
                 <w:sz w:val="20"/>
-              </w:rPr>
-              <w:t>R$ 500,00</w:t>
+                <w:szCs w:val="20"/>
+              </w:rPr>
+              <w:t xml:space="preserve">R$ 500,00</w:t>
             </w:r>
           </w:p>
         </w:tc>
@@ -1036,109 +1251,190 @@
       <w:tr>
         <w:tc>
           <w:tcPr>
-            <w:tcW w:type="dxa" w:w="4320"/>
+            <w:tcW w:w="3208" w:type="dxa"/>
+            <w:tcBorders>
+              <w:top w:val="single" w:sz="4" w:space="0" w:color="1A3557"/>
+              <w:left w:val="single" w:sz="4" w:space="0" w:color="1A3557"/>
+              <w:bottom w:val="single" w:sz="4" w:space="0" w:color="1A3557"/>
+              <w:right w:val="single" w:sz="4" w:space="0" w:color="1A3557"/>
+            </w:tcBorders>
+            <w:shd w:val="clear" w:color="auto" w:fill="FFF9F4"/>
+            <w:tcMar>
+              <w:top w:w="100" w:type="dxa"/>
+              <w:left w:w="120" w:type="dxa"/>
+              <w:bottom w:w="100" w:type="dxa"/>
+              <w:right w:w="120" w:type="dxa"/>
+            </w:tcMar>
           </w:tcPr>
           <w:p>
             <w:pPr>
-              <w:jc w:val="left"/>
+              <w:spacing w:line="276" w:lineRule="auto"/>
+              <w:jc w:val="both"/>
+              <w:rPr>
+                <w:rFonts w:ascii="Arvo" w:hAnsi="Arvo"/>
+                <w:sz w:val="20"/>
+                <w:szCs w:val="20"/>
+              </w:rPr>
             </w:pPr>
-            <w:r/>
             <w:r>
               <w:rPr>
                 <w:rFonts w:ascii="Arvo" w:hAnsi="Arvo"/>
                 <w:sz w:val="20"/>
-              </w:rPr>
-              <w:t>Estagiário/Paralegal</w:t>
+                <w:szCs w:val="20"/>
+              </w:rPr>
+              <w:t xml:space="preserve">Estagiário/Paralegal</w:t>
             </w:r>
           </w:p>
         </w:tc>
         <w:tc>
           <w:tcPr>
-            <w:tcW w:type="dxa" w:w="4320"/>
+            <w:tcW w:w="6426" w:type="dxa"/>
+            <w:tcBorders>
+              <w:top w:val="single" w:sz="4" w:space="0" w:color="1A3557"/>
+              <w:left w:val="single" w:sz="4" w:space="0" w:color="1A3557"/>
+              <w:bottom w:val="single" w:sz="4" w:space="0" w:color="1A3557"/>
+              <w:right w:val="single" w:sz="4" w:space="0" w:color="1A3557"/>
+            </w:tcBorders>
+            <w:tcMar>
+              <w:top w:w="100" w:type="dxa"/>
+              <w:left w:w="120" w:type="dxa"/>
+              <w:bottom w:w="100" w:type="dxa"/>
+              <w:right w:w="120" w:type="dxa"/>
+            </w:tcMar>
           </w:tcPr>
           <w:p>
             <w:pPr>
-              <w:jc w:val="left"/>
+              <w:spacing w:line="276" w:lineRule="auto"/>
+              <w:jc w:val="both"/>
+              <w:rPr>
+                <w:rFonts w:ascii="Arvo" w:hAnsi="Arvo"/>
+                <w:sz w:val="20"/>
+                <w:szCs w:val="20"/>
+              </w:rPr>
             </w:pPr>
-            <w:r/>
             <w:r>
               <w:rPr>
                 <w:rFonts w:ascii="Arvo" w:hAnsi="Arvo"/>
                 <w:sz w:val="20"/>
-              </w:rPr>
-              <w:t>R$ 280,00</w:t>
+                <w:szCs w:val="20"/>
+              </w:rPr>
+              <w:t xml:space="preserve">R$ 280,00</w:t>
             </w:r>
           </w:p>
         </w:tc>
       </w:tr>
     </w:tbl>
     <w:p>
-      <w:r>
-        <w:rPr>
-          <w:rFonts w:ascii="Arvo" w:hAnsi="Arvo"/>
-          <w:sz w:val="20"/>
-        </w:rPr>
-      </w:r>
-    </w:p>
-    <w:p>
-      <w:r>
+      <w:pPr>
+        <w:spacing w:line="276" w:lineRule="auto"/>
+        <w:rPr>
+          <w:rFonts w:ascii="Arvo" w:hAnsi="Arvo"/>
+          <w:sz w:val="20"/>
+          <w:szCs w:val="20"/>
+        </w:rPr>
+      </w:pPr>
+    </w:p>
+    <w:p>
+      <w:pPr>
+        <w:spacing w:line="276" w:lineRule="auto"/>
         <w:rPr>
           <w:rFonts w:ascii="Arvo" w:hAnsi="Arvo"/>
           <w:b/>
-          <w:sz w:val="20"/>
-        </w:rPr>
-        <w:t>Honorários — Escopo Consultivo B</w:t>
-      </w:r>
-    </w:p>
-    <w:p>
-      <w:pPr>
+          <w:bCs/>
+          <w:sz w:val="20"/>
+          <w:szCs w:val="20"/>
+        </w:rPr>
+      </w:pPr>
+      <w:r>
+        <w:rPr>
+          <w:rFonts w:ascii="Arvo" w:hAnsi="Arvo"/>
+          <w:b/>
+          <w:bCs/>
+          <w:sz w:val="20"/>
+          <w:szCs w:val="20"/>
+        </w:rPr>
+        <w:t xml:space="preserve">Honorários — Escopo Consultivo B</w:t>
+      </w:r>
+    </w:p>
+    <w:p>
+      <w:pPr>
+        <w:spacing w:line="276" w:lineRule="auto"/>
         <w:jc w:val="both"/>
-      </w:pPr>
-      <w:r>
-        <w:rPr>
-          <w:rFonts w:ascii="Arvo" w:hAnsi="Arvo"/>
-          <w:sz w:val="20"/>
-        </w:rPr>
-        <w:t>Os honorários serão apurados com base em valor horário único, aplicável indistintamente a qualquer profissional alocado na prestação dos serviços consultivos, ao valor de R$ 700,00 por hora.</w:t>
-      </w:r>
-    </w:p>
-    <w:p>
-      <w:r>
-        <w:rPr>
-          <w:rFonts w:ascii="Arvo" w:hAnsi="Arvo"/>
-          <w:sz w:val="20"/>
-        </w:rPr>
-      </w:r>
-    </w:p>
-    <w:p>
-      <w:r>
+        <w:rPr>
+          <w:rFonts w:ascii="Arvo" w:hAnsi="Arvo"/>
+          <w:sz w:val="20"/>
+          <w:szCs w:val="20"/>
+        </w:rPr>
+      </w:pPr>
+      <w:r>
+        <w:rPr>
+          <w:rFonts w:ascii="Arvo" w:hAnsi="Arvo"/>
+          <w:sz w:val="20"/>
+          <w:szCs w:val="20"/>
+        </w:rPr>
+        <w:t xml:space="preserve">Os honorários serão apurados com base em valor horário único, aplicável indistintamente a qualquer profissional alocado na prestação dos serviços consultivos, ao valor de R$ 700,00 por hora.</w:t>
+      </w:r>
+    </w:p>
+    <w:p>
+      <w:pPr>
+        <w:spacing w:line="276" w:lineRule="auto"/>
+        <w:rPr>
+          <w:rFonts w:ascii="Arvo" w:hAnsi="Arvo"/>
+          <w:sz w:val="20"/>
+          <w:szCs w:val="20"/>
+        </w:rPr>
+      </w:pPr>
+    </w:p>
+    <w:p>
+      <w:pPr>
+        <w:spacing w:line="276" w:lineRule="auto"/>
         <w:rPr>
           <w:rFonts w:ascii="Arvo" w:hAnsi="Arvo"/>
           <w:b/>
-          <w:sz w:val="20"/>
-        </w:rPr>
-        <w:t>Honorários — Escopo Consultivo C</w:t>
-      </w:r>
-    </w:p>
-    <w:p>
-      <w:pPr>
+          <w:bCs/>
+          <w:sz w:val="20"/>
+          <w:szCs w:val="20"/>
+        </w:rPr>
+      </w:pPr>
+      <w:r>
+        <w:rPr>
+          <w:rFonts w:ascii="Arvo" w:hAnsi="Arvo"/>
+          <w:b/>
+          <w:bCs/>
+          <w:sz w:val="20"/>
+          <w:szCs w:val="20"/>
+        </w:rPr>
+        <w:t xml:space="preserve">Honorários — Escopo Consultivo C</w:t>
+      </w:r>
+    </w:p>
+    <w:p>
+      <w:pPr>
+        <w:spacing w:line="276" w:lineRule="auto"/>
         <w:jc w:val="both"/>
-      </w:pPr>
-      <w:r>
-        <w:rPr>
-          <w:rFonts w:ascii="Arvo" w:hAnsi="Arvo"/>
-          <w:sz w:val="20"/>
-        </w:rPr>
-        <w:t>Honorários fixos mensais de R$ 18.500,00, abrangendo até 35 horas de trabalho consultivo por mês. Horas excedentes ao cap serão cobradas a R$ 650,00 por hora.</w:t>
-      </w:r>
-    </w:p>
-    <w:p>
-      <w:r>
-        <w:rPr>
-          <w:rFonts w:ascii="Arvo" w:hAnsi="Arvo"/>
-          <w:sz w:val="20"/>
-        </w:rPr>
-      </w:r>
+        <w:rPr>
+          <w:rFonts w:ascii="Arvo" w:hAnsi="Arvo"/>
+          <w:sz w:val="20"/>
+          <w:szCs w:val="20"/>
+        </w:rPr>
+      </w:pPr>
+      <w:r>
+        <w:rPr>
+          <w:rFonts w:ascii="Arvo" w:hAnsi="Arvo"/>
+          <w:sz w:val="20"/>
+          <w:szCs w:val="20"/>
+        </w:rPr>
+        <w:t xml:space="preserve">Honorários fixos mensais de R$ 18.500,00, abrangendo até 35 horas de trabalho consultivo por mês. Horas excedentes ao cap serão cobradas a R$ 650,00 por hora.</w:t>
+      </w:r>
+    </w:p>
+    <w:p>
+      <w:pPr>
+        <w:spacing w:line="276" w:lineRule="auto"/>
+        <w:rPr>
+          <w:rFonts w:ascii="Arvo" w:hAnsi="Arvo"/>
+          <w:sz w:val="20"/>
+          <w:szCs w:val="20"/>
+        </w:rPr>
+      </w:pPr>
     </w:p>
     <w:p>
       <w:pPr>
@@ -2015,31 +2311,49 @@
       </w:pPr>
     </w:p>
     <w:p>
-      <w:r>
+      <w:pPr>
+        <w:spacing w:line="276" w:lineRule="auto"/>
         <w:rPr>
           <w:rFonts w:ascii="Arvo" w:hAnsi="Arvo"/>
           <w:b/>
-          <w:sz w:val="20"/>
-        </w:rPr>
-        <w:t>Honorários — Escopo Contencioso A</w:t>
-      </w:r>
-    </w:p>
-    <w:p>
-      <w:pPr>
+          <w:bCs/>
+          <w:sz w:val="20"/>
+          <w:szCs w:val="20"/>
+        </w:rPr>
+      </w:pPr>
+      <w:r>
+        <w:rPr>
+          <w:rFonts w:ascii="Arvo" w:hAnsi="Arvo"/>
+          <w:b/>
+          <w:bCs/>
+          <w:sz w:val="20"/>
+          <w:szCs w:val="20"/>
+        </w:rPr>
+        <w:t xml:space="preserve">Honorários — Escopo Contencioso A</w:t>
+      </w:r>
+    </w:p>
+    <w:p>
+      <w:pPr>
+        <w:spacing w:line="276" w:lineRule="auto"/>
         <w:jc w:val="both"/>
-      </w:pPr>
-      <w:r>
-        <w:rPr>
-          <w:rFonts w:ascii="Arvo" w:hAnsi="Arvo"/>
-          <w:sz w:val="20"/>
-        </w:rPr>
-        <w:t>Os honorários serão apurados em valor mensal por processo, conforme natureza e fase, de acordo com a tabela abaixo:</w:t>
+        <w:rPr>
+          <w:rFonts w:ascii="Arvo" w:hAnsi="Arvo"/>
+          <w:sz w:val="20"/>
+          <w:szCs w:val="20"/>
+        </w:rPr>
+      </w:pPr>
+      <w:r>
+        <w:rPr>
+          <w:rFonts w:ascii="Arvo" w:hAnsi="Arvo"/>
+          <w:sz w:val="20"/>
+          <w:szCs w:val="20"/>
+        </w:rPr>
+        <w:t xml:space="preserve">Os honorários serão apurados em valor mensal por processo, conforme natureza e fase, de acordo com a tabela abaixo:</w:t>
       </w:r>
     </w:p>
     <w:tbl>
       <w:tblPr>
-        <w:tblW w:type="auto" w:w="0"/>
-        <w:tblLook w:firstColumn="1" w:firstRow="1" w:lastColumn="0" w:lastRow="0" w:noHBand="0" w:noVBand="1" w:val="04A0"/>
+        <w:tblW w:w="9634" w:type="dxa"/>
         <w:tblBorders>
           <w:top w:val="single" w:sz="4" w:space="0" w:color="auto"/>
           <w:left w:val="single" w:sz="4" w:space="0" w:color="auto"/>
@@ -2047,67 +2361,138 @@
           <w:insideH w:val="single" w:sz="4" w:space="0" w:color="auto"/>
           <w:insideV w:val="single" w:sz="4" w:space="0" w:color="auto"/>
         </w:tblBorders>
+        <w:tblCellMar>
+          <w:left w:w="10" w:type="dxa"/>
+          <w:right w:w="10" w:type="dxa"/>
+        </w:tblCellMar>
+        <w:tblLook w:val="04A0" w:firstRow="1" w:lastRow="0" w:firstColumn="1" w:lastColumn="0" w:noHBand="0" w:noVBand="1"/>
       </w:tblPr>
       <w:tblGrid>
-        <w:gridCol w:w="2880"/>
-        <w:gridCol w:w="2880"/>
-        <w:gridCol w:w="2880"/>
+        <w:gridCol w:w="3400"/>
+        <w:gridCol w:w="3400"/>
+        <w:gridCol w:w="2834"/>
       </w:tblGrid>
       <w:tr>
         <w:tc>
           <w:tcPr>
-            <w:tcW w:type="dxa" w:w="2880"/>
+            <w:tcW w:w="3400" w:type="dxa"/>
+            <w:tcBorders>
+              <w:top w:val="single" w:sz="4" w:space="0" w:color="1A3557"/>
+              <w:left w:val="single" w:sz="4" w:space="0" w:color="1A3557"/>
+              <w:bottom w:val="single" w:sz="4" w:space="0" w:color="1A3557"/>
+              <w:right w:val="single" w:sz="4" w:space="0" w:color="1A3557"/>
+            </w:tcBorders>
+            <w:shd w:val="clear" w:color="auto" w:fill="FAE2D5"/>
+            <w:tcMar>
+              <w:top w:w="100" w:type="dxa"/>
+              <w:left w:w="120" w:type="dxa"/>
+              <w:bottom w:w="100" w:type="dxa"/>
+              <w:right w:w="120" w:type="dxa"/>
+            </w:tcMar>
           </w:tcPr>
           <w:p>
             <w:pPr>
-              <w:jc w:val="left"/>
+              <w:spacing w:line="276" w:lineRule="auto"/>
+              <w:jc w:val="center"/>
+              <w:rPr>
+                <w:rFonts w:ascii="Arvo" w:hAnsi="Arvo"/>
+                <w:b/>
+                <w:bCs/>
+                <w:sz w:val="20"/>
+                <w:szCs w:val="20"/>
+              </w:rPr>
             </w:pPr>
-            <w:r/>
             <w:r>
               <w:rPr>
                 <w:rFonts w:ascii="Arvo" w:hAnsi="Arvo"/>
                 <w:b/>
-                <w:sz w:val="20"/>
-              </w:rPr>
-              <w:t>Natureza da ação</w:t>
+                <w:bCs/>
+                <w:sz w:val="20"/>
+                <w:szCs w:val="20"/>
+              </w:rPr>
+              <w:t xml:space="preserve">Natureza da ação</w:t>
             </w:r>
           </w:p>
         </w:tc>
         <w:tc>
           <w:tcPr>
-            <w:tcW w:type="dxa" w:w="2880"/>
+            <w:tcW w:w="3400" w:type="dxa"/>
+            <w:tcBorders>
+              <w:top w:val="single" w:sz="4" w:space="0" w:color="1A3557"/>
+              <w:left w:val="single" w:sz="4" w:space="0" w:color="1A3557"/>
+              <w:bottom w:val="single" w:sz="4" w:space="0" w:color="1A3557"/>
+              <w:right w:val="single" w:sz="4" w:space="0" w:color="1A3557"/>
+            </w:tcBorders>
+            <w:shd w:val="clear" w:color="auto" w:fill="FAE2D5"/>
+            <w:tcMar>
+              <w:top w:w="100" w:type="dxa"/>
+              <w:left w:w="120" w:type="dxa"/>
+              <w:bottom w:w="100" w:type="dxa"/>
+              <w:right w:w="120" w:type="dxa"/>
+            </w:tcMar>
           </w:tcPr>
           <w:p>
             <w:pPr>
-              <w:jc w:val="left"/>
+              <w:spacing w:line="276" w:lineRule="auto"/>
+              <w:jc w:val="center"/>
+              <w:rPr>
+                <w:rFonts w:ascii="Arvo" w:hAnsi="Arvo"/>
+                <w:b/>
+                <w:bCs/>
+                <w:sz w:val="20"/>
+                <w:szCs w:val="20"/>
+              </w:rPr>
             </w:pPr>
-            <w:r/>
             <w:r>
               <w:rPr>
                 <w:rFonts w:ascii="Arvo" w:hAnsi="Arvo"/>
                 <w:b/>
-                <w:sz w:val="20"/>
-              </w:rPr>
-              <w:t>Instâncias de Atuação</w:t>
+                <w:bCs/>
+                <w:sz w:val="20"/>
+                <w:szCs w:val="20"/>
+              </w:rPr>
+              <w:t xml:space="preserve">Instâncias de Atuação</w:t>
             </w:r>
           </w:p>
         </w:tc>
         <w:tc>
           <w:tcPr>
-            <w:tcW w:type="dxa" w:w="2880"/>
+            <w:tcW w:w="2834" w:type="dxa"/>
+            <w:tcBorders>
+              <w:top w:val="single" w:sz="4" w:space="0" w:color="1A3557"/>
+              <w:left w:val="single" w:sz="4" w:space="0" w:color="1A3557"/>
+              <w:bottom w:val="single" w:sz="4" w:space="0" w:color="1A3557"/>
+              <w:right w:val="single" w:sz="4" w:space="0" w:color="1A3557"/>
+            </w:tcBorders>
+            <w:shd w:val="clear" w:color="auto" w:fill="FAE2D5"/>
+            <w:tcMar>
+              <w:top w:w="100" w:type="dxa"/>
+              <w:left w:w="120" w:type="dxa"/>
+              <w:bottom w:w="100" w:type="dxa"/>
+              <w:right w:w="120" w:type="dxa"/>
+            </w:tcMar>
           </w:tcPr>
           <w:p>
             <w:pPr>
-              <w:jc w:val="left"/>
+              <w:spacing w:line="276" w:lineRule="auto"/>
+              <w:jc w:val="center"/>
+              <w:rPr>
+                <w:rFonts w:ascii="Arvo" w:hAnsi="Arvo"/>
+                <w:b/>
+                <w:bCs/>
+                <w:sz w:val="20"/>
+                <w:szCs w:val="20"/>
+              </w:rPr>
             </w:pPr>
-            <w:r/>
             <w:r>
               <w:rPr>
                 <w:rFonts w:ascii="Arvo" w:hAnsi="Arvo"/>
                 <w:b/>
-                <w:sz w:val="20"/>
-              </w:rPr>
-              <w:t>Valor</w:t>
+                <w:bCs/>
+                <w:sz w:val="20"/>
+                <w:szCs w:val="20"/>
+              </w:rPr>
+              <w:t xml:space="preserve">Valor</w:t>
             </w:r>
           </w:p>
         </w:tc>
@@ -2115,55 +2500,110 @@
       <w:tr>
         <w:tc>
           <w:tcPr>
-            <w:tcW w:type="dxa" w:w="2880"/>
+            <w:tcW w:w="3400" w:type="dxa"/>
+            <w:tcBorders>
+              <w:top w:val="single" w:sz="4" w:space="0" w:color="1A3557"/>
+              <w:left w:val="single" w:sz="4" w:space="0" w:color="1A3557"/>
+              <w:bottom w:val="single" w:sz="4" w:space="0" w:color="1A3557"/>
+              <w:right w:val="single" w:sz="4" w:space="0" w:color="1A3557"/>
+            </w:tcBorders>
+            <w:shd w:val="clear" w:color="auto" w:fill="FFF9F4"/>
+            <w:tcMar>
+              <w:top w:w="100" w:type="dxa"/>
+              <w:left w:w="120" w:type="dxa"/>
+              <w:bottom w:w="100" w:type="dxa"/>
+              <w:right w:w="120" w:type="dxa"/>
+            </w:tcMar>
           </w:tcPr>
           <w:p>
             <w:pPr>
-              <w:jc w:val="left"/>
+              <w:spacing w:line="276" w:lineRule="auto"/>
+              <w:jc w:val="both"/>
+              <w:rPr>
+                <w:rFonts w:ascii="Arvo" w:hAnsi="Arvo"/>
+                <w:sz w:val="20"/>
+                <w:szCs w:val="20"/>
+              </w:rPr>
             </w:pPr>
-            <w:r/>
             <w:r>
               <w:rPr>
                 <w:rFonts w:ascii="Arvo" w:hAnsi="Arvo"/>
                 <w:sz w:val="20"/>
-              </w:rPr>
-              <w:t>Trabalhista</w:t>
+                <w:szCs w:val="20"/>
+              </w:rPr>
+              <w:t xml:space="preserve">Trabalhista</w:t>
             </w:r>
           </w:p>
         </w:tc>
         <w:tc>
           <w:tcPr>
-            <w:tcW w:type="dxa" w:w="2880"/>
+            <w:tcW w:w="3400" w:type="dxa"/>
+            <w:tcBorders>
+              <w:top w:val="single" w:sz="4" w:space="0" w:color="1A3557"/>
+              <w:left w:val="single" w:sz="4" w:space="0" w:color="1A3557"/>
+              <w:bottom w:val="single" w:sz="4" w:space="0" w:color="1A3557"/>
+              <w:right w:val="single" w:sz="4" w:space="0" w:color="1A3557"/>
+            </w:tcBorders>
+            <w:tcMar>
+              <w:top w:w="100" w:type="dxa"/>
+              <w:left w:w="120" w:type="dxa"/>
+              <w:bottom w:w="100" w:type="dxa"/>
+              <w:right w:w="120" w:type="dxa"/>
+            </w:tcMar>
           </w:tcPr>
           <w:p>
             <w:pPr>
-              <w:jc w:val="left"/>
+              <w:spacing w:line="276" w:lineRule="auto"/>
+              <w:jc w:val="both"/>
+              <w:rPr>
+                <w:rFonts w:ascii="Arvo" w:hAnsi="Arvo"/>
+                <w:sz w:val="20"/>
+                <w:szCs w:val="20"/>
+              </w:rPr>
             </w:pPr>
-            <w:r/>
             <w:r>
               <w:rPr>
                 <w:rFonts w:ascii="Arvo" w:hAnsi="Arvo"/>
                 <w:sz w:val="20"/>
-              </w:rPr>
-              <w:t>Conhecimento</w:t>
+                <w:szCs w:val="20"/>
+              </w:rPr>
+              <w:t xml:space="preserve">Conhecimento</w:t>
             </w:r>
           </w:p>
         </w:tc>
         <w:tc>
           <w:tcPr>
-            <w:tcW w:type="dxa" w:w="2880"/>
+            <w:tcW w:w="2834" w:type="dxa"/>
+            <w:tcBorders>
+              <w:top w:val="single" w:sz="4" w:space="0" w:color="1A3557"/>
+              <w:left w:val="single" w:sz="4" w:space="0" w:color="1A3557"/>
+              <w:bottom w:val="single" w:sz="4" w:space="0" w:color="1A3557"/>
+              <w:right w:val="single" w:sz="4" w:space="0" w:color="1A3557"/>
+            </w:tcBorders>
+            <w:tcMar>
+              <w:top w:w="100" w:type="dxa"/>
+              <w:left w:w="120" w:type="dxa"/>
+              <w:bottom w:w="100" w:type="dxa"/>
+              <w:right w:w="120" w:type="dxa"/>
+            </w:tcMar>
           </w:tcPr>
           <w:p>
             <w:pPr>
-              <w:jc w:val="left"/>
+              <w:spacing w:line="276" w:lineRule="auto"/>
+              <w:jc w:val="both"/>
+              <w:rPr>
+                <w:rFonts w:ascii="Arvo" w:hAnsi="Arvo"/>
+                <w:sz w:val="20"/>
+                <w:szCs w:val="20"/>
+              </w:rPr>
             </w:pPr>
-            <w:r/>
             <w:r>
               <w:rPr>
                 <w:rFonts w:ascii="Arvo" w:hAnsi="Arvo"/>
                 <w:sz w:val="20"/>
-              </w:rPr>
-              <w:t>R$ 5.500,00</w:t>
+                <w:szCs w:val="20"/>
+              </w:rPr>
+              <w:t xml:space="preserve">R$ 5.500,00</w:t>
             </w:r>
           </w:p>
         </w:tc>
@@ -2171,55 +2611,110 @@
       <w:tr>
         <w:tc>
           <w:tcPr>
-            <w:tcW w:type="dxa" w:w="2880"/>
+            <w:tcW w:w="3400" w:type="dxa"/>
+            <w:tcBorders>
+              <w:top w:val="single" w:sz="4" w:space="0" w:color="1A3557"/>
+              <w:left w:val="single" w:sz="4" w:space="0" w:color="1A3557"/>
+              <w:bottom w:val="single" w:sz="4" w:space="0" w:color="1A3557"/>
+              <w:right w:val="single" w:sz="4" w:space="0" w:color="1A3557"/>
+            </w:tcBorders>
+            <w:shd w:val="clear" w:color="auto" w:fill="FFF9F4"/>
+            <w:tcMar>
+              <w:top w:w="100" w:type="dxa"/>
+              <w:left w:w="120" w:type="dxa"/>
+              <w:bottom w:w="100" w:type="dxa"/>
+              <w:right w:w="120" w:type="dxa"/>
+            </w:tcMar>
           </w:tcPr>
           <w:p>
             <w:pPr>
-              <w:jc w:val="left"/>
+              <w:spacing w:line="276" w:lineRule="auto"/>
+              <w:jc w:val="both"/>
+              <w:rPr>
+                <w:rFonts w:ascii="Arvo" w:hAnsi="Arvo"/>
+                <w:sz w:val="20"/>
+                <w:szCs w:val="20"/>
+              </w:rPr>
             </w:pPr>
-            <w:r/>
             <w:r>
               <w:rPr>
                 <w:rFonts w:ascii="Arvo" w:hAnsi="Arvo"/>
                 <w:sz w:val="20"/>
-              </w:rPr>
-              <w:t>Trabalhista</w:t>
+                <w:szCs w:val="20"/>
+              </w:rPr>
+              <w:t xml:space="preserve">Trabalhista</w:t>
             </w:r>
           </w:p>
         </w:tc>
         <w:tc>
           <w:tcPr>
-            <w:tcW w:type="dxa" w:w="2880"/>
+            <w:tcW w:w="3400" w:type="dxa"/>
+            <w:tcBorders>
+              <w:top w:val="single" w:sz="4" w:space="0" w:color="1A3557"/>
+              <w:left w:val="single" w:sz="4" w:space="0" w:color="1A3557"/>
+              <w:bottom w:val="single" w:sz="4" w:space="0" w:color="1A3557"/>
+              <w:right w:val="single" w:sz="4" w:space="0" w:color="1A3557"/>
+            </w:tcBorders>
+            <w:tcMar>
+              <w:top w:w="100" w:type="dxa"/>
+              <w:left w:w="120" w:type="dxa"/>
+              <w:bottom w:w="100" w:type="dxa"/>
+              <w:right w:w="120" w:type="dxa"/>
+            </w:tcMar>
           </w:tcPr>
           <w:p>
             <w:pPr>
-              <w:jc w:val="left"/>
+              <w:spacing w:line="276" w:lineRule="auto"/>
+              <w:jc w:val="both"/>
+              <w:rPr>
+                <w:rFonts w:ascii="Arvo" w:hAnsi="Arvo"/>
+                <w:sz w:val="20"/>
+                <w:szCs w:val="20"/>
+              </w:rPr>
             </w:pPr>
-            <w:r/>
             <w:r>
               <w:rPr>
                 <w:rFonts w:ascii="Arvo" w:hAnsi="Arvo"/>
                 <w:sz w:val="20"/>
-              </w:rPr>
-              <w:t>Execução</w:t>
+                <w:szCs w:val="20"/>
+              </w:rPr>
+              <w:t xml:space="preserve">Execução</w:t>
             </w:r>
           </w:p>
         </w:tc>
         <w:tc>
           <w:tcPr>
-            <w:tcW w:type="dxa" w:w="2880"/>
+            <w:tcW w:w="2834" w:type="dxa"/>
+            <w:tcBorders>
+              <w:top w:val="single" w:sz="4" w:space="0" w:color="1A3557"/>
+              <w:left w:val="single" w:sz="4" w:space="0" w:color="1A3557"/>
+              <w:bottom w:val="single" w:sz="4" w:space="0" w:color="1A3557"/>
+              <w:right w:val="single" w:sz="4" w:space="0" w:color="1A3557"/>
+            </w:tcBorders>
+            <w:tcMar>
+              <w:top w:w="100" w:type="dxa"/>
+              <w:left w:w="120" w:type="dxa"/>
+              <w:bottom w:w="100" w:type="dxa"/>
+              <w:right w:w="120" w:type="dxa"/>
+            </w:tcMar>
           </w:tcPr>
           <w:p>
             <w:pPr>
-              <w:jc w:val="left"/>
+              <w:spacing w:line="276" w:lineRule="auto"/>
+              <w:jc w:val="both"/>
+              <w:rPr>
+                <w:rFonts w:ascii="Arvo" w:hAnsi="Arvo"/>
+                <w:sz w:val="20"/>
+                <w:szCs w:val="20"/>
+              </w:rPr>
             </w:pPr>
-            <w:r/>
             <w:r>
               <w:rPr>
                 <w:rFonts w:ascii="Arvo" w:hAnsi="Arvo"/>
                 <w:sz w:val="20"/>
-              </w:rPr>
-              <w:t>R$ 3.800,00</w:t>
+                <w:szCs w:val="20"/>
+              </w:rPr>
+              <w:t xml:space="preserve">R$ 3.800,00</w:t>
             </w:r>
           </w:p>
         </w:tc>
@@ -2227,55 +2722,110 @@
       <w:tr>
         <w:tc>
           <w:tcPr>
-            <w:tcW w:type="dxa" w:w="2880"/>
+            <w:tcW w:w="3400" w:type="dxa"/>
+            <w:tcBorders>
+              <w:top w:val="single" w:sz="4" w:space="0" w:color="1A3557"/>
+              <w:left w:val="single" w:sz="4" w:space="0" w:color="1A3557"/>
+              <w:bottom w:val="single" w:sz="4" w:space="0" w:color="1A3557"/>
+              <w:right w:val="single" w:sz="4" w:space="0" w:color="1A3557"/>
+            </w:tcBorders>
+            <w:shd w:val="clear" w:color="auto" w:fill="FFF9F4"/>
+            <w:tcMar>
+              <w:top w:w="100" w:type="dxa"/>
+              <w:left w:w="120" w:type="dxa"/>
+              <w:bottom w:w="100" w:type="dxa"/>
+              <w:right w:w="120" w:type="dxa"/>
+            </w:tcMar>
           </w:tcPr>
           <w:p>
             <w:pPr>
-              <w:jc w:val="left"/>
+              <w:spacing w:line="276" w:lineRule="auto"/>
+              <w:jc w:val="both"/>
+              <w:rPr>
+                <w:rFonts w:ascii="Arvo" w:hAnsi="Arvo"/>
+                <w:sz w:val="20"/>
+                <w:szCs w:val="20"/>
+              </w:rPr>
             </w:pPr>
-            <w:r/>
             <w:r>
               <w:rPr>
                 <w:rFonts w:ascii="Arvo" w:hAnsi="Arvo"/>
                 <w:sz w:val="20"/>
-              </w:rPr>
-              <w:t>Cível</w:t>
+                <w:szCs w:val="20"/>
+              </w:rPr>
+              <w:t xml:space="preserve">Cível</w:t>
             </w:r>
           </w:p>
         </w:tc>
         <w:tc>
           <w:tcPr>
-            <w:tcW w:type="dxa" w:w="2880"/>
+            <w:tcW w:w="3400" w:type="dxa"/>
+            <w:tcBorders>
+              <w:top w:val="single" w:sz="4" w:space="0" w:color="1A3557"/>
+              <w:left w:val="single" w:sz="4" w:space="0" w:color="1A3557"/>
+              <w:bottom w:val="single" w:sz="4" w:space="0" w:color="1A3557"/>
+              <w:right w:val="single" w:sz="4" w:space="0" w:color="1A3557"/>
+            </w:tcBorders>
+            <w:tcMar>
+              <w:top w:w="100" w:type="dxa"/>
+              <w:left w:w="120" w:type="dxa"/>
+              <w:bottom w:w="100" w:type="dxa"/>
+              <w:right w:w="120" w:type="dxa"/>
+            </w:tcMar>
           </w:tcPr>
           <w:p>
             <w:pPr>
-              <w:jc w:val="left"/>
+              <w:spacing w:line="276" w:lineRule="auto"/>
+              <w:jc w:val="both"/>
+              <w:rPr>
+                <w:rFonts w:ascii="Arvo" w:hAnsi="Arvo"/>
+                <w:sz w:val="20"/>
+                <w:szCs w:val="20"/>
+              </w:rPr>
             </w:pPr>
-            <w:r/>
             <w:r>
               <w:rPr>
                 <w:rFonts w:ascii="Arvo" w:hAnsi="Arvo"/>
                 <w:sz w:val="20"/>
-              </w:rPr>
-              <w:t>Conhecimento</w:t>
+                <w:szCs w:val="20"/>
+              </w:rPr>
+              <w:t xml:space="preserve">Conhecimento</w:t>
             </w:r>
           </w:p>
         </w:tc>
         <w:tc>
           <w:tcPr>
-            <w:tcW w:type="dxa" w:w="2880"/>
+            <w:tcW w:w="2834" w:type="dxa"/>
+            <w:tcBorders>
+              <w:top w:val="single" w:sz="4" w:space="0" w:color="1A3557"/>
+              <w:left w:val="single" w:sz="4" w:space="0" w:color="1A3557"/>
+              <w:bottom w:val="single" w:sz="4" w:space="0" w:color="1A3557"/>
+              <w:right w:val="single" w:sz="4" w:space="0" w:color="1A3557"/>
+            </w:tcBorders>
+            <w:tcMar>
+              <w:top w:w="100" w:type="dxa"/>
+              <w:left w:w="120" w:type="dxa"/>
+              <w:bottom w:w="100" w:type="dxa"/>
+              <w:right w:w="120" w:type="dxa"/>
+            </w:tcMar>
           </w:tcPr>
           <w:p>
             <w:pPr>
-              <w:jc w:val="left"/>
+              <w:spacing w:line="276" w:lineRule="auto"/>
+              <w:jc w:val="both"/>
+              <w:rPr>
+                <w:rFonts w:ascii="Arvo" w:hAnsi="Arvo"/>
+                <w:sz w:val="20"/>
+                <w:szCs w:val="20"/>
+              </w:rPr>
             </w:pPr>
-            <w:r/>
             <w:r>
               <w:rPr>
                 <w:rFonts w:ascii="Arvo" w:hAnsi="Arvo"/>
                 <w:sz w:val="20"/>
-              </w:rPr>
-              <w:t>R$ 7.200,00</w:t>
+                <w:szCs w:val="20"/>
+              </w:rPr>
+              <w:t xml:space="preserve">R$ 7.200,00</w:t>
             </w:r>
           </w:p>
         </w:tc>
@@ -2283,94 +2833,169 @@
       <w:tr>
         <w:tc>
           <w:tcPr>
-            <w:tcW w:type="dxa" w:w="2880"/>
+            <w:tcW w:w="3400" w:type="dxa"/>
+            <w:tcBorders>
+              <w:top w:val="single" w:sz="4" w:space="0" w:color="1A3557"/>
+              <w:left w:val="single" w:sz="4" w:space="0" w:color="1A3557"/>
+              <w:bottom w:val="single" w:sz="4" w:space="0" w:color="1A3557"/>
+              <w:right w:val="single" w:sz="4" w:space="0" w:color="1A3557"/>
+            </w:tcBorders>
+            <w:shd w:val="clear" w:color="auto" w:fill="FFF9F4"/>
+            <w:tcMar>
+              <w:top w:w="100" w:type="dxa"/>
+              <w:left w:w="120" w:type="dxa"/>
+              <w:bottom w:w="100" w:type="dxa"/>
+              <w:right w:w="120" w:type="dxa"/>
+            </w:tcMar>
           </w:tcPr>
           <w:p>
             <w:pPr>
-              <w:jc w:val="left"/>
+              <w:spacing w:line="276" w:lineRule="auto"/>
+              <w:jc w:val="both"/>
+              <w:rPr>
+                <w:rFonts w:ascii="Arvo" w:hAnsi="Arvo"/>
+                <w:sz w:val="20"/>
+                <w:szCs w:val="20"/>
+              </w:rPr>
             </w:pPr>
-            <w:r/>
             <w:r>
               <w:rPr>
                 <w:rFonts w:ascii="Arvo" w:hAnsi="Arvo"/>
                 <w:sz w:val="20"/>
-              </w:rPr>
-              <w:t>Tributária</w:t>
+                <w:szCs w:val="20"/>
+              </w:rPr>
+              <w:t xml:space="preserve">Tributária</w:t>
             </w:r>
           </w:p>
         </w:tc>
         <w:tc>
           <w:tcPr>
-            <w:tcW w:type="dxa" w:w="2880"/>
+            <w:tcW w:w="3400" w:type="dxa"/>
+            <w:tcBorders>
+              <w:top w:val="single" w:sz="4" w:space="0" w:color="1A3557"/>
+              <w:left w:val="single" w:sz="4" w:space="0" w:color="1A3557"/>
+              <w:bottom w:val="single" w:sz="4" w:space="0" w:color="1A3557"/>
+              <w:right w:val="single" w:sz="4" w:space="0" w:color="1A3557"/>
+            </w:tcBorders>
+            <w:tcMar>
+              <w:top w:w="100" w:type="dxa"/>
+              <w:left w:w="120" w:type="dxa"/>
+              <w:bottom w:w="100" w:type="dxa"/>
+              <w:right w:w="120" w:type="dxa"/>
+            </w:tcMar>
           </w:tcPr>
           <w:p>
             <w:pPr>
-              <w:jc w:val="left"/>
+              <w:spacing w:line="276" w:lineRule="auto"/>
+              <w:jc w:val="both"/>
+              <w:rPr>
+                <w:rFonts w:ascii="Arvo" w:hAnsi="Arvo"/>
+                <w:sz w:val="20"/>
+                <w:szCs w:val="20"/>
+              </w:rPr>
             </w:pPr>
-            <w:r/>
             <w:r>
               <w:rPr>
                 <w:rFonts w:ascii="Arvo" w:hAnsi="Arvo"/>
                 <w:sz w:val="20"/>
-              </w:rPr>
-              <w:t>Conhecimento</w:t>
+                <w:szCs w:val="20"/>
+              </w:rPr>
+              <w:t xml:space="preserve">Conhecimento</w:t>
             </w:r>
           </w:p>
         </w:tc>
         <w:tc>
           <w:tcPr>
-            <w:tcW w:type="dxa" w:w="2880"/>
+            <w:tcW w:w="2834" w:type="dxa"/>
+            <w:tcBorders>
+              <w:top w:val="single" w:sz="4" w:space="0" w:color="1A3557"/>
+              <w:left w:val="single" w:sz="4" w:space="0" w:color="1A3557"/>
+              <w:bottom w:val="single" w:sz="4" w:space="0" w:color="1A3557"/>
+              <w:right w:val="single" w:sz="4" w:space="0" w:color="1A3557"/>
+            </w:tcBorders>
+            <w:tcMar>
+              <w:top w:w="100" w:type="dxa"/>
+              <w:left w:w="120" w:type="dxa"/>
+              <w:bottom w:w="100" w:type="dxa"/>
+              <w:right w:w="120" w:type="dxa"/>
+            </w:tcMar>
           </w:tcPr>
           <w:p>
             <w:pPr>
-              <w:jc w:val="left"/>
+              <w:spacing w:line="276" w:lineRule="auto"/>
+              <w:jc w:val="both"/>
+              <w:rPr>
+                <w:rFonts w:ascii="Arvo" w:hAnsi="Arvo"/>
+                <w:sz w:val="20"/>
+                <w:szCs w:val="20"/>
+              </w:rPr>
             </w:pPr>
-            <w:r/>
             <w:r>
               <w:rPr>
                 <w:rFonts w:ascii="Arvo" w:hAnsi="Arvo"/>
                 <w:sz w:val="20"/>
-              </w:rPr>
-              <w:t>R$ 9.500,00</w:t>
+                <w:szCs w:val="20"/>
+              </w:rPr>
+              <w:t xml:space="preserve">R$ 9.500,00</w:t>
             </w:r>
           </w:p>
         </w:tc>
       </w:tr>
     </w:tbl>
     <w:p>
-      <w:r>
-        <w:rPr>
-          <w:rFonts w:ascii="Arvo" w:hAnsi="Arvo"/>
-          <w:sz w:val="20"/>
-        </w:rPr>
-      </w:r>
-    </w:p>
-    <w:p>
-      <w:r>
+      <w:pPr>
+        <w:spacing w:line="276" w:lineRule="auto"/>
+        <w:rPr>
+          <w:rFonts w:ascii="Arvo" w:hAnsi="Arvo"/>
+          <w:sz w:val="20"/>
+          <w:szCs w:val="20"/>
+        </w:rPr>
+      </w:pPr>
+    </w:p>
+    <w:p>
+      <w:pPr>
+        <w:spacing w:line="276" w:lineRule="auto"/>
         <w:rPr>
           <w:rFonts w:ascii="Arvo" w:hAnsi="Arvo"/>
           <w:b/>
-          <w:sz w:val="20"/>
-        </w:rPr>
-        <w:t>Honorários — Escopo Contencioso B</w:t>
-      </w:r>
-    </w:p>
-    <w:p>
-      <w:pPr>
+          <w:bCs/>
+          <w:sz w:val="20"/>
+          <w:szCs w:val="20"/>
+        </w:rPr>
+      </w:pPr>
+      <w:r>
+        <w:rPr>
+          <w:rFonts w:ascii="Arvo" w:hAnsi="Arvo"/>
+          <w:b/>
+          <w:bCs/>
+          <w:sz w:val="20"/>
+          <w:szCs w:val="20"/>
+        </w:rPr>
+        <w:t xml:space="preserve">Honorários — Escopo Contencioso B</w:t>
+      </w:r>
+    </w:p>
+    <w:p>
+      <w:pPr>
+        <w:spacing w:line="276" w:lineRule="auto"/>
         <w:jc w:val="both"/>
-      </w:pPr>
-      <w:r>
-        <w:rPr>
-          <w:rFonts w:ascii="Arvo" w:hAnsi="Arvo"/>
-          <w:sz w:val="20"/>
-        </w:rPr>
-        <w:t>Os honorários serão apurados por ato processual efetivamente praticado, conforme tabela:</w:t>
+        <w:rPr>
+          <w:rFonts w:ascii="Arvo" w:hAnsi="Arvo"/>
+          <w:sz w:val="20"/>
+          <w:szCs w:val="20"/>
+        </w:rPr>
+      </w:pPr>
+      <w:r>
+        <w:rPr>
+          <w:rFonts w:ascii="Arvo" w:hAnsi="Arvo"/>
+          <w:sz w:val="20"/>
+          <w:szCs w:val="20"/>
+        </w:rPr>
+        <w:t xml:space="preserve">Os honorários serão apurados por ato processual efetivamente praticado, conforme tabela:</w:t>
       </w:r>
     </w:p>
     <w:tbl>
       <w:tblPr>
-        <w:tblW w:type="auto" w:w="0"/>
-        <w:tblLook w:firstColumn="1" w:firstRow="1" w:lastColumn="0" w:lastRow="0" w:noHBand="0" w:noVBand="1" w:val="04A0"/>
+        <w:tblW w:w="9634" w:type="dxa"/>
         <w:tblBorders>
           <w:top w:val="single" w:sz="4" w:space="0" w:color="auto"/>
           <w:left w:val="single" w:sz="4" w:space="0" w:color="auto"/>
@@ -2378,67 +3003,138 @@
           <w:insideH w:val="single" w:sz="4" w:space="0" w:color="auto"/>
           <w:insideV w:val="single" w:sz="4" w:space="0" w:color="auto"/>
         </w:tblBorders>
+        <w:tblCellMar>
+          <w:left w:w="10" w:type="dxa"/>
+          <w:right w:w="10" w:type="dxa"/>
+        </w:tblCellMar>
+        <w:tblLook w:val="04A0" w:firstRow="1" w:lastRow="0" w:firstColumn="1" w:lastColumn="0" w:noHBand="0" w:noVBand="1"/>
       </w:tblPr>
       <w:tblGrid>
-        <w:gridCol w:w="2880"/>
-        <w:gridCol w:w="2880"/>
-        <w:gridCol w:w="2880"/>
+        <w:gridCol w:w="2800"/>
+        <w:gridCol w:w="4334"/>
+        <w:gridCol w:w="2500"/>
       </w:tblGrid>
       <w:tr>
         <w:tc>
           <w:tcPr>
-            <w:tcW w:type="dxa" w:w="2880"/>
+            <w:tcW w:w="2800" w:type="dxa"/>
+            <w:tcBorders>
+              <w:top w:val="single" w:sz="4" w:space="0" w:color="1A3557"/>
+              <w:left w:val="single" w:sz="4" w:space="0" w:color="1A3557"/>
+              <w:bottom w:val="single" w:sz="4" w:space="0" w:color="1A3557"/>
+              <w:right w:val="single" w:sz="4" w:space="0" w:color="1A3557"/>
+            </w:tcBorders>
+            <w:shd w:val="clear" w:color="auto" w:fill="FAE2D5"/>
+            <w:tcMar>
+              <w:top w:w="100" w:type="dxa"/>
+              <w:left w:w="120" w:type="dxa"/>
+              <w:bottom w:w="100" w:type="dxa"/>
+              <w:right w:w="120" w:type="dxa"/>
+            </w:tcMar>
           </w:tcPr>
           <w:p>
             <w:pPr>
-              <w:jc w:val="left"/>
+              <w:spacing w:line="276" w:lineRule="auto"/>
+              <w:jc w:val="center"/>
+              <w:rPr>
+                <w:rFonts w:ascii="Arvo" w:hAnsi="Arvo"/>
+                <w:b/>
+                <w:bCs/>
+                <w:sz w:val="20"/>
+                <w:szCs w:val="20"/>
+              </w:rPr>
             </w:pPr>
-            <w:r/>
             <w:r>
               <w:rPr>
                 <w:rFonts w:ascii="Arvo" w:hAnsi="Arvo"/>
                 <w:b/>
-                <w:sz w:val="20"/>
-              </w:rPr>
-              <w:t>Ato processual</w:t>
+                <w:bCs/>
+                <w:sz w:val="20"/>
+                <w:szCs w:val="20"/>
+              </w:rPr>
+              <w:t xml:space="preserve">Ato Processual</w:t>
             </w:r>
           </w:p>
         </w:tc>
         <w:tc>
           <w:tcPr>
-            <w:tcW w:type="dxa" w:w="2880"/>
+            <w:tcW w:w="4334" w:type="dxa"/>
+            <w:tcBorders>
+              <w:top w:val="single" w:sz="4" w:space="0" w:color="1A3557"/>
+              <w:left w:val="single" w:sz="4" w:space="0" w:color="1A3557"/>
+              <w:bottom w:val="single" w:sz="4" w:space="0" w:color="1A3557"/>
+              <w:right w:val="single" w:sz="4" w:space="0" w:color="1A3557"/>
+            </w:tcBorders>
+            <w:shd w:val="clear" w:color="auto" w:fill="FAE2D5"/>
+            <w:tcMar>
+              <w:top w:w="100" w:type="dxa"/>
+              <w:left w:w="120" w:type="dxa"/>
+              <w:bottom w:w="100" w:type="dxa"/>
+              <w:right w:w="120" w:type="dxa"/>
+            </w:tcMar>
           </w:tcPr>
           <w:p>
             <w:pPr>
-              <w:jc w:val="left"/>
+              <w:spacing w:line="276" w:lineRule="auto"/>
+              <w:jc w:val="center"/>
+              <w:rPr>
+                <w:rFonts w:ascii="Arvo" w:hAnsi="Arvo"/>
+                <w:b/>
+                <w:bCs/>
+                <w:sz w:val="20"/>
+                <w:szCs w:val="20"/>
+              </w:rPr>
             </w:pPr>
-            <w:r/>
             <w:r>
               <w:rPr>
                 <w:rFonts w:ascii="Arvo" w:hAnsi="Arvo"/>
                 <w:b/>
-                <w:sz w:val="20"/>
-              </w:rPr>
-              <w:t>Descrição</w:t>
+                <w:bCs/>
+                <w:sz w:val="20"/>
+                <w:szCs w:val="20"/>
+              </w:rPr>
+              <w:t xml:space="preserve">Descrição</w:t>
             </w:r>
           </w:p>
         </w:tc>
         <w:tc>
           <w:tcPr>
-            <w:tcW w:type="dxa" w:w="2880"/>
+            <w:tcW w:w="2500" w:type="dxa"/>
+            <w:tcBorders>
+              <w:top w:val="single" w:sz="4" w:space="0" w:color="1A3557"/>
+              <w:left w:val="single" w:sz="4" w:space="0" w:color="1A3557"/>
+              <w:bottom w:val="single" w:sz="4" w:space="0" w:color="1A3557"/>
+              <w:right w:val="single" w:sz="4" w:space="0" w:color="1A3557"/>
+            </w:tcBorders>
+            <w:shd w:val="clear" w:color="auto" w:fill="FAE2D5"/>
+            <w:tcMar>
+              <w:top w:w="100" w:type="dxa"/>
+              <w:left w:w="120" w:type="dxa"/>
+              <w:bottom w:w="100" w:type="dxa"/>
+              <w:right w:w="120" w:type="dxa"/>
+            </w:tcMar>
           </w:tcPr>
           <w:p>
             <w:pPr>
-              <w:jc w:val="left"/>
+              <w:spacing w:line="276" w:lineRule="auto"/>
+              <w:jc w:val="center"/>
+              <w:rPr>
+                <w:rFonts w:ascii="Arvo" w:hAnsi="Arvo"/>
+                <w:b/>
+                <w:bCs/>
+                <w:sz w:val="20"/>
+                <w:szCs w:val="20"/>
+              </w:rPr>
             </w:pPr>
-            <w:r/>
             <w:r>
               <w:rPr>
                 <w:rFonts w:ascii="Arvo" w:hAnsi="Arvo"/>
                 <w:b/>
-                <w:sz w:val="20"/>
-              </w:rPr>
-              <w:t>Valor</w:t>
+                <w:bCs/>
+                <w:sz w:val="20"/>
+                <w:szCs w:val="20"/>
+              </w:rPr>
+              <w:t xml:space="preserve">Valor</w:t>
             </w:r>
           </w:p>
         </w:tc>
@@ -2446,55 +3142,110 @@
       <w:tr>
         <w:tc>
           <w:tcPr>
-            <w:tcW w:type="dxa" w:w="2880"/>
+            <w:tcW w:w="2800" w:type="dxa"/>
+            <w:tcBorders>
+              <w:top w:val="single" w:sz="4" w:space="0" w:color="1A3557"/>
+              <w:left w:val="single" w:sz="4" w:space="0" w:color="1A3557"/>
+              <w:bottom w:val="single" w:sz="4" w:space="0" w:color="1A3557"/>
+              <w:right w:val="single" w:sz="4" w:space="0" w:color="1A3557"/>
+            </w:tcBorders>
+            <w:shd w:val="clear" w:color="auto" w:fill="FFF9F4"/>
+            <w:tcMar>
+              <w:top w:w="100" w:type="dxa"/>
+              <w:left w:w="120" w:type="dxa"/>
+              <w:bottom w:w="100" w:type="dxa"/>
+              <w:right w:w="120" w:type="dxa"/>
+            </w:tcMar>
           </w:tcPr>
           <w:p>
             <w:pPr>
-              <w:jc w:val="left"/>
+              <w:spacing w:line="276" w:lineRule="auto"/>
+              <w:jc w:val="both"/>
+              <w:rPr>
+                <w:rFonts w:ascii="Arvo" w:hAnsi="Arvo"/>
+                <w:sz w:val="20"/>
+                <w:szCs w:val="20"/>
+              </w:rPr>
             </w:pPr>
-            <w:r/>
             <w:r>
               <w:rPr>
                 <w:rFonts w:ascii="Arvo" w:hAnsi="Arvo"/>
                 <w:sz w:val="20"/>
-              </w:rPr>
-              <w:t>Petição Inicial</w:t>
+                <w:szCs w:val="20"/>
+              </w:rPr>
+              <w:t xml:space="preserve">Petição Inicial</w:t>
             </w:r>
           </w:p>
         </w:tc>
         <w:tc>
           <w:tcPr>
-            <w:tcW w:type="dxa" w:w="2880"/>
+            <w:tcW w:w="4334" w:type="dxa"/>
+            <w:tcBorders>
+              <w:top w:val="single" w:sz="4" w:space="0" w:color="1A3557"/>
+              <w:left w:val="single" w:sz="4" w:space="0" w:color="1A3557"/>
+              <w:bottom w:val="single" w:sz="4" w:space="0" w:color="1A3557"/>
+              <w:right w:val="single" w:sz="4" w:space="0" w:color="1A3557"/>
+            </w:tcBorders>
+            <w:tcMar>
+              <w:top w:w="100" w:type="dxa"/>
+              <w:left w:w="120" w:type="dxa"/>
+              <w:bottom w:w="100" w:type="dxa"/>
+              <w:right w:w="120" w:type="dxa"/>
+            </w:tcMar>
           </w:tcPr>
           <w:p>
             <w:pPr>
-              <w:jc w:val="left"/>
+              <w:spacing w:line="276" w:lineRule="auto"/>
+              <w:jc w:val="both"/>
+              <w:rPr>
+                <w:rFonts w:ascii="Arvo" w:hAnsi="Arvo"/>
+                <w:sz w:val="20"/>
+                <w:szCs w:val="20"/>
+              </w:rPr>
             </w:pPr>
-            <w:r/>
             <w:r>
               <w:rPr>
                 <w:rFonts w:ascii="Arvo" w:hAnsi="Arvo"/>
                 <w:sz w:val="20"/>
-              </w:rPr>
-              <w:t>Elaboração e protocolo da peça inaugural.</w:t>
+                <w:szCs w:val="20"/>
+              </w:rPr>
+              <w:t xml:space="preserve">Elaboração e protocolo da peça inaugural.</w:t>
             </w:r>
           </w:p>
         </w:tc>
         <w:tc>
           <w:tcPr>
-            <w:tcW w:type="dxa" w:w="2880"/>
+            <w:tcW w:w="2500" w:type="dxa"/>
+            <w:tcBorders>
+              <w:top w:val="single" w:sz="4" w:space="0" w:color="1A3557"/>
+              <w:left w:val="single" w:sz="4" w:space="0" w:color="1A3557"/>
+              <w:bottom w:val="single" w:sz="4" w:space="0" w:color="1A3557"/>
+              <w:right w:val="single" w:sz="4" w:space="0" w:color="1A3557"/>
+            </w:tcBorders>
+            <w:tcMar>
+              <w:top w:w="100" w:type="dxa"/>
+              <w:left w:w="120" w:type="dxa"/>
+              <w:bottom w:w="100" w:type="dxa"/>
+              <w:right w:w="120" w:type="dxa"/>
+            </w:tcMar>
           </w:tcPr>
           <w:p>
             <w:pPr>
-              <w:jc w:val="left"/>
+              <w:spacing w:line="276" w:lineRule="auto"/>
+              <w:jc w:val="both"/>
+              <w:rPr>
+                <w:rFonts w:ascii="Arvo" w:hAnsi="Arvo"/>
+                <w:sz w:val="20"/>
+                <w:szCs w:val="20"/>
+              </w:rPr>
             </w:pPr>
-            <w:r/>
             <w:r>
               <w:rPr>
                 <w:rFonts w:ascii="Arvo" w:hAnsi="Arvo"/>
                 <w:sz w:val="20"/>
-              </w:rPr>
-              <w:t>R$ 2.500,00</w:t>
+                <w:szCs w:val="20"/>
+              </w:rPr>
+              <w:t xml:space="preserve">R$ 2.500,00</w:t>
             </w:r>
           </w:p>
         </w:tc>
@@ -2502,55 +3253,110 @@
       <w:tr>
         <w:tc>
           <w:tcPr>
-            <w:tcW w:type="dxa" w:w="2880"/>
+            <w:tcW w:w="2800" w:type="dxa"/>
+            <w:tcBorders>
+              <w:top w:val="single" w:sz="4" w:space="0" w:color="1A3557"/>
+              <w:left w:val="single" w:sz="4" w:space="0" w:color="1A3557"/>
+              <w:bottom w:val="single" w:sz="4" w:space="0" w:color="1A3557"/>
+              <w:right w:val="single" w:sz="4" w:space="0" w:color="1A3557"/>
+            </w:tcBorders>
+            <w:shd w:val="clear" w:color="auto" w:fill="FFF9F4"/>
+            <w:tcMar>
+              <w:top w:w="100" w:type="dxa"/>
+              <w:left w:w="120" w:type="dxa"/>
+              <w:bottom w:w="100" w:type="dxa"/>
+              <w:right w:w="120" w:type="dxa"/>
+            </w:tcMar>
           </w:tcPr>
           <w:p>
             <w:pPr>
-              <w:jc w:val="left"/>
+              <w:spacing w:line="276" w:lineRule="auto"/>
+              <w:jc w:val="both"/>
+              <w:rPr>
+                <w:rFonts w:ascii="Arvo" w:hAnsi="Arvo"/>
+                <w:sz w:val="20"/>
+                <w:szCs w:val="20"/>
+              </w:rPr>
             </w:pPr>
-            <w:r/>
             <w:r>
               <w:rPr>
                 <w:rFonts w:ascii="Arvo" w:hAnsi="Arvo"/>
                 <w:sz w:val="20"/>
-              </w:rPr>
-              <w:t>Contestação</w:t>
+                <w:szCs w:val="20"/>
+              </w:rPr>
+              <w:t xml:space="preserve">Contestação</w:t>
             </w:r>
           </w:p>
         </w:tc>
         <w:tc>
           <w:tcPr>
-            <w:tcW w:type="dxa" w:w="2880"/>
+            <w:tcW w:w="4334" w:type="dxa"/>
+            <w:tcBorders>
+              <w:top w:val="single" w:sz="4" w:space="0" w:color="1A3557"/>
+              <w:left w:val="single" w:sz="4" w:space="0" w:color="1A3557"/>
+              <w:bottom w:val="single" w:sz="4" w:space="0" w:color="1A3557"/>
+              <w:right w:val="single" w:sz="4" w:space="0" w:color="1A3557"/>
+            </w:tcBorders>
+            <w:tcMar>
+              <w:top w:w="100" w:type="dxa"/>
+              <w:left w:w="120" w:type="dxa"/>
+              <w:bottom w:w="100" w:type="dxa"/>
+              <w:right w:w="120" w:type="dxa"/>
+            </w:tcMar>
           </w:tcPr>
           <w:p>
             <w:pPr>
-              <w:jc w:val="left"/>
+              <w:spacing w:line="276" w:lineRule="auto"/>
+              <w:jc w:val="both"/>
+              <w:rPr>
+                <w:rFonts w:ascii="Arvo" w:hAnsi="Arvo"/>
+                <w:sz w:val="20"/>
+                <w:szCs w:val="20"/>
+              </w:rPr>
             </w:pPr>
-            <w:r/>
             <w:r>
               <w:rPr>
                 <w:rFonts w:ascii="Arvo" w:hAnsi="Arvo"/>
                 <w:sz w:val="20"/>
-              </w:rPr>
-              <w:t>Elaboração e protocolo de defesa em processo judicial.</w:t>
+                <w:szCs w:val="20"/>
+              </w:rPr>
+              <w:t xml:space="preserve">Elaboração e protocolo de defesa em processo judicial.</w:t>
             </w:r>
           </w:p>
         </w:tc>
         <w:tc>
           <w:tcPr>
-            <w:tcW w:type="dxa" w:w="2880"/>
+            <w:tcW w:w="2500" w:type="dxa"/>
+            <w:tcBorders>
+              <w:top w:val="single" w:sz="4" w:space="0" w:color="1A3557"/>
+              <w:left w:val="single" w:sz="4" w:space="0" w:color="1A3557"/>
+              <w:bottom w:val="single" w:sz="4" w:space="0" w:color="1A3557"/>
+              <w:right w:val="single" w:sz="4" w:space="0" w:color="1A3557"/>
+            </w:tcBorders>
+            <w:tcMar>
+              <w:top w:w="100" w:type="dxa"/>
+              <w:left w:w="120" w:type="dxa"/>
+              <w:bottom w:w="100" w:type="dxa"/>
+              <w:right w:w="120" w:type="dxa"/>
+            </w:tcMar>
           </w:tcPr>
           <w:p>
             <w:pPr>
-              <w:jc w:val="left"/>
+              <w:spacing w:line="276" w:lineRule="auto"/>
+              <w:jc w:val="both"/>
+              <w:rPr>
+                <w:rFonts w:ascii="Arvo" w:hAnsi="Arvo"/>
+                <w:sz w:val="20"/>
+                <w:szCs w:val="20"/>
+              </w:rPr>
             </w:pPr>
-            <w:r/>
             <w:r>
               <w:rPr>
                 <w:rFonts w:ascii="Arvo" w:hAnsi="Arvo"/>
                 <w:sz w:val="20"/>
-              </w:rPr>
-              <w:t>R$ 2.200,00</w:t>
+                <w:szCs w:val="20"/>
+              </w:rPr>
+              <w:t xml:space="preserve">R$ 2.200,00</w:t>
             </w:r>
           </w:p>
         </w:tc>
@@ -2558,55 +3364,110 @@
       <w:tr>
         <w:tc>
           <w:tcPr>
-            <w:tcW w:type="dxa" w:w="2880"/>
+            <w:tcW w:w="2800" w:type="dxa"/>
+            <w:tcBorders>
+              <w:top w:val="single" w:sz="4" w:space="0" w:color="1A3557"/>
+              <w:left w:val="single" w:sz="4" w:space="0" w:color="1A3557"/>
+              <w:bottom w:val="single" w:sz="4" w:space="0" w:color="1A3557"/>
+              <w:right w:val="single" w:sz="4" w:space="0" w:color="1A3557"/>
+            </w:tcBorders>
+            <w:shd w:val="clear" w:color="auto" w:fill="FFF9F4"/>
+            <w:tcMar>
+              <w:top w:w="100" w:type="dxa"/>
+              <w:left w:w="120" w:type="dxa"/>
+              <w:bottom w:w="100" w:type="dxa"/>
+              <w:right w:w="120" w:type="dxa"/>
+            </w:tcMar>
           </w:tcPr>
           <w:p>
             <w:pPr>
-              <w:jc w:val="left"/>
+              <w:spacing w:line="276" w:lineRule="auto"/>
+              <w:jc w:val="both"/>
+              <w:rPr>
+                <w:rFonts w:ascii="Arvo" w:hAnsi="Arvo"/>
+                <w:sz w:val="20"/>
+                <w:szCs w:val="20"/>
+              </w:rPr>
             </w:pPr>
-            <w:r/>
             <w:r>
               <w:rPr>
                 <w:rFonts w:ascii="Arvo" w:hAnsi="Arvo"/>
                 <w:sz w:val="20"/>
-              </w:rPr>
-              <w:t>Recurso Ordinário</w:t>
+                <w:szCs w:val="20"/>
+              </w:rPr>
+              <w:t xml:space="preserve">Recurso Ordinário</w:t>
             </w:r>
           </w:p>
         </w:tc>
         <w:tc>
           <w:tcPr>
-            <w:tcW w:type="dxa" w:w="2880"/>
+            <w:tcW w:w="4334" w:type="dxa"/>
+            <w:tcBorders>
+              <w:top w:val="single" w:sz="4" w:space="0" w:color="1A3557"/>
+              <w:left w:val="single" w:sz="4" w:space="0" w:color="1A3557"/>
+              <w:bottom w:val="single" w:sz="4" w:space="0" w:color="1A3557"/>
+              <w:right w:val="single" w:sz="4" w:space="0" w:color="1A3557"/>
+            </w:tcBorders>
+            <w:tcMar>
+              <w:top w:w="100" w:type="dxa"/>
+              <w:left w:w="120" w:type="dxa"/>
+              <w:bottom w:w="100" w:type="dxa"/>
+              <w:right w:w="120" w:type="dxa"/>
+            </w:tcMar>
           </w:tcPr>
           <w:p>
             <w:pPr>
-              <w:jc w:val="left"/>
+              <w:spacing w:line="276" w:lineRule="auto"/>
+              <w:jc w:val="both"/>
+              <w:rPr>
+                <w:rFonts w:ascii="Arvo" w:hAnsi="Arvo"/>
+                <w:sz w:val="20"/>
+                <w:szCs w:val="20"/>
+              </w:rPr>
             </w:pPr>
-            <w:r/>
             <w:r>
               <w:rPr>
                 <w:rFonts w:ascii="Arvo" w:hAnsi="Arvo"/>
                 <w:sz w:val="20"/>
-              </w:rPr>
-              <w:t>Elaboração e protocolo de recurso ordinário na Justiça do Trabalho.</w:t>
+                <w:szCs w:val="20"/>
+              </w:rPr>
+              <w:t xml:space="preserve">Elaboração e protocolo de recurso ordinário na Justiça do Trabalho.</w:t>
             </w:r>
           </w:p>
         </w:tc>
         <w:tc>
           <w:tcPr>
-            <w:tcW w:type="dxa" w:w="2880"/>
+            <w:tcW w:w="2500" w:type="dxa"/>
+            <w:tcBorders>
+              <w:top w:val="single" w:sz="4" w:space="0" w:color="1A3557"/>
+              <w:left w:val="single" w:sz="4" w:space="0" w:color="1A3557"/>
+              <w:bottom w:val="single" w:sz="4" w:space="0" w:color="1A3557"/>
+              <w:right w:val="single" w:sz="4" w:space="0" w:color="1A3557"/>
+            </w:tcBorders>
+            <w:tcMar>
+              <w:top w:w="100" w:type="dxa"/>
+              <w:left w:w="120" w:type="dxa"/>
+              <w:bottom w:w="100" w:type="dxa"/>
+              <w:right w:w="120" w:type="dxa"/>
+            </w:tcMar>
           </w:tcPr>
           <w:p>
             <w:pPr>
-              <w:jc w:val="left"/>
+              <w:spacing w:line="276" w:lineRule="auto"/>
+              <w:jc w:val="both"/>
+              <w:rPr>
+                <w:rFonts w:ascii="Arvo" w:hAnsi="Arvo"/>
+                <w:sz w:val="20"/>
+                <w:szCs w:val="20"/>
+              </w:rPr>
             </w:pPr>
-            <w:r/>
             <w:r>
               <w:rPr>
                 <w:rFonts w:ascii="Arvo" w:hAnsi="Arvo"/>
                 <w:sz w:val="20"/>
-              </w:rPr>
-              <w:t>R$ 3.000,00</w:t>
+                <w:szCs w:val="20"/>
+              </w:rPr>
+              <w:t xml:space="preserve">R$ 3.000,00</w:t>
             </w:r>
           </w:p>
         </w:tc>
@@ -2614,55 +3475,110 @@
       <w:tr>
         <w:tc>
           <w:tcPr>
-            <w:tcW w:type="dxa" w:w="2880"/>
+            <w:tcW w:w="2800" w:type="dxa"/>
+            <w:tcBorders>
+              <w:top w:val="single" w:sz="4" w:space="0" w:color="1A3557"/>
+              <w:left w:val="single" w:sz="4" w:space="0" w:color="1A3557"/>
+              <w:bottom w:val="single" w:sz="4" w:space="0" w:color="1A3557"/>
+              <w:right w:val="single" w:sz="4" w:space="0" w:color="1A3557"/>
+            </w:tcBorders>
+            <w:shd w:val="clear" w:color="auto" w:fill="FFF9F4"/>
+            <w:tcMar>
+              <w:top w:w="100" w:type="dxa"/>
+              <w:left w:w="120" w:type="dxa"/>
+              <w:bottom w:w="100" w:type="dxa"/>
+              <w:right w:w="120" w:type="dxa"/>
+            </w:tcMar>
           </w:tcPr>
           <w:p>
             <w:pPr>
-              <w:jc w:val="left"/>
+              <w:spacing w:line="276" w:lineRule="auto"/>
+              <w:jc w:val="both"/>
+              <w:rPr>
+                <w:rFonts w:ascii="Arvo" w:hAnsi="Arvo"/>
+                <w:sz w:val="20"/>
+                <w:szCs w:val="20"/>
+              </w:rPr>
             </w:pPr>
-            <w:r/>
             <w:r>
               <w:rPr>
                 <w:rFonts w:ascii="Arvo" w:hAnsi="Arvo"/>
                 <w:sz w:val="20"/>
-              </w:rPr>
-              <w:t>Agravo</w:t>
+                <w:szCs w:val="20"/>
+              </w:rPr>
+              <w:t xml:space="preserve">Agravo</w:t>
             </w:r>
           </w:p>
         </w:tc>
         <w:tc>
           <w:tcPr>
-            <w:tcW w:type="dxa" w:w="2880"/>
+            <w:tcW w:w="4334" w:type="dxa"/>
+            <w:tcBorders>
+              <w:top w:val="single" w:sz="4" w:space="0" w:color="1A3557"/>
+              <w:left w:val="single" w:sz="4" w:space="0" w:color="1A3557"/>
+              <w:bottom w:val="single" w:sz="4" w:space="0" w:color="1A3557"/>
+              <w:right w:val="single" w:sz="4" w:space="0" w:color="1A3557"/>
+            </w:tcBorders>
+            <w:tcMar>
+              <w:top w:w="100" w:type="dxa"/>
+              <w:left w:w="120" w:type="dxa"/>
+              <w:bottom w:w="100" w:type="dxa"/>
+              <w:right w:w="120" w:type="dxa"/>
+            </w:tcMar>
           </w:tcPr>
           <w:p>
             <w:pPr>
-              <w:jc w:val="left"/>
+              <w:spacing w:line="276" w:lineRule="auto"/>
+              <w:jc w:val="both"/>
+              <w:rPr>
+                <w:rFonts w:ascii="Arvo" w:hAnsi="Arvo"/>
+                <w:sz w:val="20"/>
+                <w:szCs w:val="20"/>
+              </w:rPr>
             </w:pPr>
-            <w:r/>
             <w:r>
               <w:rPr>
                 <w:rFonts w:ascii="Arvo" w:hAnsi="Arvo"/>
                 <w:sz w:val="20"/>
-              </w:rPr>
-              <w:t>Elaboração e protocolo de agravo de instrumento ou agravo interno.</w:t>
+                <w:szCs w:val="20"/>
+              </w:rPr>
+              <w:t xml:space="preserve">Elaboração e protocolo de agravo de instrumento ou agravo interno.</w:t>
             </w:r>
           </w:p>
         </w:tc>
         <w:tc>
           <w:tcPr>
-            <w:tcW w:type="dxa" w:w="2880"/>
+            <w:tcW w:w="2500" w:type="dxa"/>
+            <w:tcBorders>
+              <w:top w:val="single" w:sz="4" w:space="0" w:color="1A3557"/>
+              <w:left w:val="single" w:sz="4" w:space="0" w:color="1A3557"/>
+              <w:bottom w:val="single" w:sz="4" w:space="0" w:color="1A3557"/>
+              <w:right w:val="single" w:sz="4" w:space="0" w:color="1A3557"/>
+            </w:tcBorders>
+            <w:tcMar>
+              <w:top w:w="100" w:type="dxa"/>
+              <w:left w:w="120" w:type="dxa"/>
+              <w:bottom w:w="100" w:type="dxa"/>
+              <w:right w:w="120" w:type="dxa"/>
+            </w:tcMar>
           </w:tcPr>
           <w:p>
             <w:pPr>
-              <w:jc w:val="left"/>
+              <w:spacing w:line="276" w:lineRule="auto"/>
+              <w:jc w:val="both"/>
+              <w:rPr>
+                <w:rFonts w:ascii="Arvo" w:hAnsi="Arvo"/>
+                <w:sz w:val="20"/>
+                <w:szCs w:val="20"/>
+              </w:rPr>
             </w:pPr>
-            <w:r/>
             <w:r>
               <w:rPr>
                 <w:rFonts w:ascii="Arvo" w:hAnsi="Arvo"/>
                 <w:sz w:val="20"/>
-              </w:rPr>
-              <w:t>R$ 1.800,00</w:t>
+                <w:szCs w:val="20"/>
+              </w:rPr>
+              <w:t xml:space="preserve">R$ 1.800,00</w:t>
             </w:r>
           </w:p>
         </w:tc>
@@ -2670,55 +3586,110 @@
       <w:tr>
         <w:tc>
           <w:tcPr>
-            <w:tcW w:type="dxa" w:w="2880"/>
+            <w:tcW w:w="2800" w:type="dxa"/>
+            <w:tcBorders>
+              <w:top w:val="single" w:sz="4" w:space="0" w:color="1A3557"/>
+              <w:left w:val="single" w:sz="4" w:space="0" w:color="1A3557"/>
+              <w:bottom w:val="single" w:sz="4" w:space="0" w:color="1A3557"/>
+              <w:right w:val="single" w:sz="4" w:space="0" w:color="1A3557"/>
+            </w:tcBorders>
+            <w:shd w:val="clear" w:color="auto" w:fill="FFF9F4"/>
+            <w:tcMar>
+              <w:top w:w="100" w:type="dxa"/>
+              <w:left w:w="120" w:type="dxa"/>
+              <w:bottom w:w="100" w:type="dxa"/>
+              <w:right w:w="120" w:type="dxa"/>
+            </w:tcMar>
           </w:tcPr>
           <w:p>
             <w:pPr>
-              <w:jc w:val="left"/>
+              <w:spacing w:line="276" w:lineRule="auto"/>
+              <w:jc w:val="both"/>
+              <w:rPr>
+                <w:rFonts w:ascii="Arvo" w:hAnsi="Arvo"/>
+                <w:sz w:val="20"/>
+                <w:szCs w:val="20"/>
+              </w:rPr>
             </w:pPr>
-            <w:r/>
             <w:r>
               <w:rPr>
                 <w:rFonts w:ascii="Arvo" w:hAnsi="Arvo"/>
                 <w:sz w:val="20"/>
-              </w:rPr>
-              <w:t>Apelação</w:t>
+                <w:szCs w:val="20"/>
+              </w:rPr>
+              <w:t xml:space="preserve">Apelação</w:t>
             </w:r>
           </w:p>
         </w:tc>
         <w:tc>
           <w:tcPr>
-            <w:tcW w:type="dxa" w:w="2880"/>
+            <w:tcW w:w="4334" w:type="dxa"/>
+            <w:tcBorders>
+              <w:top w:val="single" w:sz="4" w:space="0" w:color="1A3557"/>
+              <w:left w:val="single" w:sz="4" w:space="0" w:color="1A3557"/>
+              <w:bottom w:val="single" w:sz="4" w:space="0" w:color="1A3557"/>
+              <w:right w:val="single" w:sz="4" w:space="0" w:color="1A3557"/>
+            </w:tcBorders>
+            <w:tcMar>
+              <w:top w:w="100" w:type="dxa"/>
+              <w:left w:w="120" w:type="dxa"/>
+              <w:bottom w:w="100" w:type="dxa"/>
+              <w:right w:w="120" w:type="dxa"/>
+            </w:tcMar>
           </w:tcPr>
           <w:p>
             <w:pPr>
-              <w:jc w:val="left"/>
+              <w:spacing w:line="276" w:lineRule="auto"/>
+              <w:jc w:val="both"/>
+              <w:rPr>
+                <w:rFonts w:ascii="Arvo" w:hAnsi="Arvo"/>
+                <w:sz w:val="20"/>
+                <w:szCs w:val="20"/>
+              </w:rPr>
             </w:pPr>
-            <w:r/>
             <w:r>
               <w:rPr>
                 <w:rFonts w:ascii="Arvo" w:hAnsi="Arvo"/>
                 <w:sz w:val="20"/>
-              </w:rPr>
-              <w:t>Elaboração e protocolo de apelação cível em 1º grau de jurisdição.</w:t>
+                <w:szCs w:val="20"/>
+              </w:rPr>
+              <w:t xml:space="preserve">Elaboração e protocolo de apelação cível em 1º grau de jurisdição.</w:t>
             </w:r>
           </w:p>
         </w:tc>
         <w:tc>
           <w:tcPr>
-            <w:tcW w:type="dxa" w:w="2880"/>
+            <w:tcW w:w="2500" w:type="dxa"/>
+            <w:tcBorders>
+              <w:top w:val="single" w:sz="4" w:space="0" w:color="1A3557"/>
+              <w:left w:val="single" w:sz="4" w:space="0" w:color="1A3557"/>
+              <w:bottom w:val="single" w:sz="4" w:space="0" w:color="1A3557"/>
+              <w:right w:val="single" w:sz="4" w:space="0" w:color="1A3557"/>
+            </w:tcBorders>
+            <w:tcMar>
+              <w:top w:w="100" w:type="dxa"/>
+              <w:left w:w="120" w:type="dxa"/>
+              <w:bottom w:w="100" w:type="dxa"/>
+              <w:right w:w="120" w:type="dxa"/>
+            </w:tcMar>
           </w:tcPr>
           <w:p>
             <w:pPr>
-              <w:jc w:val="left"/>
+              <w:spacing w:line="276" w:lineRule="auto"/>
+              <w:jc w:val="both"/>
+              <w:rPr>
+                <w:rFonts w:ascii="Arvo" w:hAnsi="Arvo"/>
+                <w:sz w:val="20"/>
+                <w:szCs w:val="20"/>
+              </w:rPr>
             </w:pPr>
-            <w:r/>
             <w:r>
               <w:rPr>
                 <w:rFonts w:ascii="Arvo" w:hAnsi="Arvo"/>
                 <w:sz w:val="20"/>
-              </w:rPr>
-              <w:t>R$ 3.500,00</w:t>
+                <w:szCs w:val="20"/>
+              </w:rPr>
+              <w:t xml:space="preserve">R$ 3.500,00</w:t>
             </w:r>
           </w:p>
         </w:tc>
@@ -2726,55 +3697,110 @@
       <w:tr>
         <w:tc>
           <w:tcPr>
-            <w:tcW w:type="dxa" w:w="2880"/>
+            <w:tcW w:w="2800" w:type="dxa"/>
+            <w:tcBorders>
+              <w:top w:val="single" w:sz="4" w:space="0" w:color="1A3557"/>
+              <w:left w:val="single" w:sz="4" w:space="0" w:color="1A3557"/>
+              <w:bottom w:val="single" w:sz="4" w:space="0" w:color="1A3557"/>
+              <w:right w:val="single" w:sz="4" w:space="0" w:color="1A3557"/>
+            </w:tcBorders>
+            <w:shd w:val="clear" w:color="auto" w:fill="FFF9F4"/>
+            <w:tcMar>
+              <w:top w:w="100" w:type="dxa"/>
+              <w:left w:w="120" w:type="dxa"/>
+              <w:bottom w:w="100" w:type="dxa"/>
+              <w:right w:w="120" w:type="dxa"/>
+            </w:tcMar>
           </w:tcPr>
           <w:p>
             <w:pPr>
-              <w:jc w:val="left"/>
+              <w:spacing w:line="276" w:lineRule="auto"/>
+              <w:jc w:val="both"/>
+              <w:rPr>
+                <w:rFonts w:ascii="Arvo" w:hAnsi="Arvo"/>
+                <w:sz w:val="20"/>
+                <w:szCs w:val="20"/>
+              </w:rPr>
             </w:pPr>
-            <w:r/>
             <w:r>
               <w:rPr>
                 <w:rFonts w:ascii="Arvo" w:hAnsi="Arvo"/>
                 <w:sz w:val="20"/>
-              </w:rPr>
-              <w:t>Recurso Especial / Extraordinário</w:t>
+                <w:szCs w:val="20"/>
+              </w:rPr>
+              <w:t xml:space="preserve">Recurso Especial / Extraordinário</w:t>
             </w:r>
           </w:p>
         </w:tc>
         <w:tc>
           <w:tcPr>
-            <w:tcW w:type="dxa" w:w="2880"/>
+            <w:tcW w:w="4334" w:type="dxa"/>
+            <w:tcBorders>
+              <w:top w:val="single" w:sz="4" w:space="0" w:color="1A3557"/>
+              <w:left w:val="single" w:sz="4" w:space="0" w:color="1A3557"/>
+              <w:bottom w:val="single" w:sz="4" w:space="0" w:color="1A3557"/>
+              <w:right w:val="single" w:sz="4" w:space="0" w:color="1A3557"/>
+            </w:tcBorders>
+            <w:tcMar>
+              <w:top w:w="100" w:type="dxa"/>
+              <w:left w:w="120" w:type="dxa"/>
+              <w:bottom w:w="100" w:type="dxa"/>
+              <w:right w:w="120" w:type="dxa"/>
+            </w:tcMar>
           </w:tcPr>
           <w:p>
             <w:pPr>
-              <w:jc w:val="left"/>
+              <w:spacing w:line="276" w:lineRule="auto"/>
+              <w:jc w:val="both"/>
+              <w:rPr>
+                <w:rFonts w:ascii="Arvo" w:hAnsi="Arvo"/>
+                <w:sz w:val="20"/>
+                <w:szCs w:val="20"/>
+              </w:rPr>
             </w:pPr>
-            <w:r/>
             <w:r>
               <w:rPr>
                 <w:rFonts w:ascii="Arvo" w:hAnsi="Arvo"/>
                 <w:sz w:val="20"/>
-              </w:rPr>
-              <w:t>Elaboração e protocolo de recursos excepcionais ao STJ e STF, inclusive agravos correlatos.</w:t>
+                <w:szCs w:val="20"/>
+              </w:rPr>
+              <w:t xml:space="preserve">Elaboração e protocolo de recursos excepcionais ao STJ e STF, inclusive agravos correlatos.</w:t>
             </w:r>
           </w:p>
         </w:tc>
         <w:tc>
           <w:tcPr>
-            <w:tcW w:type="dxa" w:w="2880"/>
+            <w:tcW w:w="2500" w:type="dxa"/>
+            <w:tcBorders>
+              <w:top w:val="single" w:sz="4" w:space="0" w:color="1A3557"/>
+              <w:left w:val="single" w:sz="4" w:space="0" w:color="1A3557"/>
+              <w:bottom w:val="single" w:sz="4" w:space="0" w:color="1A3557"/>
+              <w:right w:val="single" w:sz="4" w:space="0" w:color="1A3557"/>
+            </w:tcBorders>
+            <w:tcMar>
+              <w:top w:w="100" w:type="dxa"/>
+              <w:left w:w="120" w:type="dxa"/>
+              <w:bottom w:w="100" w:type="dxa"/>
+              <w:right w:w="120" w:type="dxa"/>
+            </w:tcMar>
           </w:tcPr>
           <w:p>
             <w:pPr>
-              <w:jc w:val="left"/>
+              <w:spacing w:line="276" w:lineRule="auto"/>
+              <w:jc w:val="both"/>
+              <w:rPr>
+                <w:rFonts w:ascii="Arvo" w:hAnsi="Arvo"/>
+                <w:sz w:val="20"/>
+                <w:szCs w:val="20"/>
+              </w:rPr>
             </w:pPr>
-            <w:r/>
             <w:r>
               <w:rPr>
                 <w:rFonts w:ascii="Arvo" w:hAnsi="Arvo"/>
                 <w:sz w:val="20"/>
-              </w:rPr>
-              <w:t>R$ 6.500,00</w:t>
+                <w:szCs w:val="20"/>
+              </w:rPr>
+              <w:t xml:space="preserve">R$ 6.500,00</w:t>
             </w:r>
           </w:p>
         </w:tc>
@@ -2782,55 +3808,110 @@
       <w:tr>
         <w:tc>
           <w:tcPr>
-            <w:tcW w:type="dxa" w:w="2880"/>
+            <w:tcW w:w="2800" w:type="dxa"/>
+            <w:tcBorders>
+              <w:top w:val="single" w:sz="4" w:space="0" w:color="1A3557"/>
+              <w:left w:val="single" w:sz="4" w:space="0" w:color="1A3557"/>
+              <w:bottom w:val="single" w:sz="4" w:space="0" w:color="1A3557"/>
+              <w:right w:val="single" w:sz="4" w:space="0" w:color="1A3557"/>
+            </w:tcBorders>
+            <w:shd w:val="clear" w:color="auto" w:fill="FFF9F4"/>
+            <w:tcMar>
+              <w:top w:w="100" w:type="dxa"/>
+              <w:left w:w="120" w:type="dxa"/>
+              <w:bottom w:w="100" w:type="dxa"/>
+              <w:right w:w="120" w:type="dxa"/>
+            </w:tcMar>
           </w:tcPr>
           <w:p>
             <w:pPr>
-              <w:jc w:val="left"/>
+              <w:spacing w:line="276" w:lineRule="auto"/>
+              <w:jc w:val="both"/>
+              <w:rPr>
+                <w:rFonts w:ascii="Arvo" w:hAnsi="Arvo"/>
+                <w:sz w:val="20"/>
+                <w:szCs w:val="20"/>
+              </w:rPr>
             </w:pPr>
-            <w:r/>
             <w:r>
               <w:rPr>
                 <w:rFonts w:ascii="Arvo" w:hAnsi="Arvo"/>
                 <w:sz w:val="20"/>
-              </w:rPr>
-              <w:t>Audiência</w:t>
+                <w:szCs w:val="20"/>
+              </w:rPr>
+              <w:t xml:space="preserve">Audiência</w:t>
             </w:r>
           </w:p>
         </w:tc>
         <w:tc>
           <w:tcPr>
-            <w:tcW w:type="dxa" w:w="2880"/>
+            <w:tcW w:w="4334" w:type="dxa"/>
+            <w:tcBorders>
+              <w:top w:val="single" w:sz="4" w:space="0" w:color="1A3557"/>
+              <w:left w:val="single" w:sz="4" w:space="0" w:color="1A3557"/>
+              <w:bottom w:val="single" w:sz="4" w:space="0" w:color="1A3557"/>
+              <w:right w:val="single" w:sz="4" w:space="0" w:color="1A3557"/>
+            </w:tcBorders>
+            <w:tcMar>
+              <w:top w:w="100" w:type="dxa"/>
+              <w:left w:w="120" w:type="dxa"/>
+              <w:bottom w:w="100" w:type="dxa"/>
+              <w:right w:w="120" w:type="dxa"/>
+            </w:tcMar>
           </w:tcPr>
           <w:p>
             <w:pPr>
-              <w:jc w:val="left"/>
+              <w:spacing w:line="276" w:lineRule="auto"/>
+              <w:jc w:val="both"/>
+              <w:rPr>
+                <w:rFonts w:ascii="Arvo" w:hAnsi="Arvo"/>
+                <w:sz w:val="20"/>
+                <w:szCs w:val="20"/>
+              </w:rPr>
             </w:pPr>
-            <w:r/>
             <w:r>
               <w:rPr>
                 <w:rFonts w:ascii="Arvo" w:hAnsi="Arvo"/>
                 <w:sz w:val="20"/>
-              </w:rPr>
-              <w:t>Comparecimento, acompanhamento e atuação em audiência.</w:t>
+                <w:szCs w:val="20"/>
+              </w:rPr>
+              <w:t xml:space="preserve">Comparecimento, acompanhamento e atuação em audiência.</w:t>
             </w:r>
           </w:p>
         </w:tc>
         <w:tc>
           <w:tcPr>
-            <w:tcW w:type="dxa" w:w="2880"/>
+            <w:tcW w:w="2500" w:type="dxa"/>
+            <w:tcBorders>
+              <w:top w:val="single" w:sz="4" w:space="0" w:color="1A3557"/>
+              <w:left w:val="single" w:sz="4" w:space="0" w:color="1A3557"/>
+              <w:bottom w:val="single" w:sz="4" w:space="0" w:color="1A3557"/>
+              <w:right w:val="single" w:sz="4" w:space="0" w:color="1A3557"/>
+            </w:tcBorders>
+            <w:tcMar>
+              <w:top w:w="100" w:type="dxa"/>
+              <w:left w:w="120" w:type="dxa"/>
+              <w:bottom w:w="100" w:type="dxa"/>
+              <w:right w:w="120" w:type="dxa"/>
+            </w:tcMar>
           </w:tcPr>
           <w:p>
             <w:pPr>
-              <w:jc w:val="left"/>
+              <w:spacing w:line="276" w:lineRule="auto"/>
+              <w:jc w:val="both"/>
+              <w:rPr>
+                <w:rFonts w:ascii="Arvo" w:hAnsi="Arvo"/>
+                <w:sz w:val="20"/>
+                <w:szCs w:val="20"/>
+              </w:rPr>
             </w:pPr>
-            <w:r/>
             <w:r>
               <w:rPr>
                 <w:rFonts w:ascii="Arvo" w:hAnsi="Arvo"/>
                 <w:sz w:val="20"/>
-              </w:rPr>
-              <w:t>R$ 1.500,00</w:t>
+                <w:szCs w:val="20"/>
+              </w:rPr>
+              <w:t xml:space="preserve">R$ 1.500,00</w:t>
             </w:r>
           </w:p>
         </w:tc>
@@ -2838,121 +3919,213 @@
       <w:tr>
         <w:tc>
           <w:tcPr>
-            <w:tcW w:type="dxa" w:w="2880"/>
+            <w:tcW w:w="2800" w:type="dxa"/>
+            <w:tcBorders>
+              <w:top w:val="single" w:sz="4" w:space="0" w:color="1A3557"/>
+              <w:left w:val="single" w:sz="4" w:space="0" w:color="1A3557"/>
+              <w:bottom w:val="single" w:sz="4" w:space="0" w:color="1A3557"/>
+              <w:right w:val="single" w:sz="4" w:space="0" w:color="1A3557"/>
+            </w:tcBorders>
+            <w:shd w:val="clear" w:color="auto" w:fill="FFF9F4"/>
+            <w:tcMar>
+              <w:top w:w="100" w:type="dxa"/>
+              <w:left w:w="120" w:type="dxa"/>
+              <w:bottom w:w="100" w:type="dxa"/>
+              <w:right w:w="120" w:type="dxa"/>
+            </w:tcMar>
           </w:tcPr>
           <w:p>
             <w:pPr>
-              <w:jc w:val="left"/>
+              <w:spacing w:line="276" w:lineRule="auto"/>
+              <w:jc w:val="both"/>
+              <w:rPr>
+                <w:rFonts w:ascii="Arvo" w:hAnsi="Arvo"/>
+                <w:sz w:val="20"/>
+                <w:szCs w:val="20"/>
+              </w:rPr>
             </w:pPr>
-            <w:r/>
             <w:r>
               <w:rPr>
                 <w:rFonts w:ascii="Arvo" w:hAnsi="Arvo"/>
                 <w:sz w:val="20"/>
-              </w:rPr>
-              <w:t>Diligência Externa</w:t>
+                <w:szCs w:val="20"/>
+              </w:rPr>
+              <w:t xml:space="preserve">Diligência Externa</w:t>
             </w:r>
           </w:p>
         </w:tc>
         <w:tc>
           <w:tcPr>
-            <w:tcW w:type="dxa" w:w="2880"/>
+            <w:tcW w:w="4334" w:type="dxa"/>
+            <w:tcBorders>
+              <w:top w:val="single" w:sz="4" w:space="0" w:color="1A3557"/>
+              <w:left w:val="single" w:sz="4" w:space="0" w:color="1A3557"/>
+              <w:bottom w:val="single" w:sz="4" w:space="0" w:color="1A3557"/>
+              <w:right w:val="single" w:sz="4" w:space="0" w:color="1A3557"/>
+            </w:tcBorders>
+            <w:tcMar>
+              <w:top w:w="100" w:type="dxa"/>
+              <w:left w:w="120" w:type="dxa"/>
+              <w:bottom w:w="100" w:type="dxa"/>
+              <w:right w:w="120" w:type="dxa"/>
+            </w:tcMar>
           </w:tcPr>
           <w:p>
             <w:pPr>
-              <w:jc w:val="left"/>
+              <w:spacing w:line="276" w:lineRule="auto"/>
+              <w:jc w:val="both"/>
+              <w:rPr>
+                <w:rFonts w:ascii="Arvo" w:hAnsi="Arvo"/>
+                <w:sz w:val="20"/>
+                <w:szCs w:val="20"/>
+              </w:rPr>
             </w:pPr>
-            <w:r/>
             <w:r>
               <w:rPr>
                 <w:rFonts w:ascii="Arvo" w:hAnsi="Arvo"/>
                 <w:sz w:val="20"/>
-              </w:rPr>
-              <w:t>Realização de diligência presencial em cartório, órgão público ou unidade do Contratante.</w:t>
+                <w:szCs w:val="20"/>
+              </w:rPr>
+              <w:t xml:space="preserve">Realização de diligência presencial em cartório, órgão público ou unidade do Contratante.</w:t>
             </w:r>
           </w:p>
         </w:tc>
         <w:tc>
           <w:tcPr>
-            <w:tcW w:type="dxa" w:w="2880"/>
+            <w:tcW w:w="2500" w:type="dxa"/>
+            <w:tcBorders>
+              <w:top w:val="single" w:sz="4" w:space="0" w:color="1A3557"/>
+              <w:left w:val="single" w:sz="4" w:space="0" w:color="1A3557"/>
+              <w:bottom w:val="single" w:sz="4" w:space="0" w:color="1A3557"/>
+              <w:right w:val="single" w:sz="4" w:space="0" w:color="1A3557"/>
+            </w:tcBorders>
+            <w:tcMar>
+              <w:top w:w="100" w:type="dxa"/>
+              <w:left w:w="120" w:type="dxa"/>
+              <w:bottom w:w="100" w:type="dxa"/>
+              <w:right w:w="120" w:type="dxa"/>
+            </w:tcMar>
           </w:tcPr>
           <w:p>
             <w:pPr>
-              <w:jc w:val="left"/>
+              <w:spacing w:line="276" w:lineRule="auto"/>
+              <w:jc w:val="both"/>
+              <w:rPr>
+                <w:rFonts w:ascii="Arvo" w:hAnsi="Arvo"/>
+                <w:sz w:val="20"/>
+                <w:szCs w:val="20"/>
+              </w:rPr>
             </w:pPr>
-            <w:r/>
             <w:r>
               <w:rPr>
                 <w:rFonts w:ascii="Arvo" w:hAnsi="Arvo"/>
                 <w:sz w:val="20"/>
-              </w:rPr>
-              <w:t>R$ 850,00</w:t>
+                <w:szCs w:val="20"/>
+              </w:rPr>
+              <w:t xml:space="preserve">R$ 850,00</w:t>
             </w:r>
           </w:p>
         </w:tc>
       </w:tr>
     </w:tbl>
     <w:p>
-      <w:r>
-        <w:rPr>
-          <w:rFonts w:ascii="Arvo" w:hAnsi="Arvo"/>
-          <w:sz w:val="20"/>
-        </w:rPr>
-      </w:r>
-    </w:p>
-    <w:p>
-      <w:r>
+      <w:pPr>
+        <w:spacing w:line="276" w:lineRule="auto"/>
+        <w:rPr>
+          <w:rFonts w:ascii="Arvo" w:hAnsi="Arvo"/>
+          <w:sz w:val="20"/>
+          <w:szCs w:val="20"/>
+        </w:rPr>
+      </w:pPr>
+    </w:p>
+    <w:p>
+      <w:pPr>
+        <w:spacing w:line="276" w:lineRule="auto"/>
         <w:rPr>
           <w:rFonts w:ascii="Arvo" w:hAnsi="Arvo"/>
           <w:b/>
-          <w:sz w:val="20"/>
-        </w:rPr>
-        <w:t>Honorários — Escopo Contencioso C</w:t>
-      </w:r>
-    </w:p>
-    <w:p>
-      <w:pPr>
+          <w:bCs/>
+          <w:sz w:val="20"/>
+          <w:szCs w:val="20"/>
+        </w:rPr>
+      </w:pPr>
+      <w:r>
+        <w:rPr>
+          <w:rFonts w:ascii="Arvo" w:hAnsi="Arvo"/>
+          <w:b/>
+          <w:bCs/>
+          <w:sz w:val="20"/>
+          <w:szCs w:val="20"/>
+        </w:rPr>
+        <w:t xml:space="preserve">Honorários — Escopo Contencioso C</w:t>
+      </w:r>
+    </w:p>
+    <w:p>
+      <w:pPr>
+        <w:spacing w:line="276" w:lineRule="auto"/>
         <w:jc w:val="both"/>
-      </w:pPr>
-      <w:r>
-        <w:rPr>
-          <w:rFonts w:ascii="Arvo" w:hAnsi="Arvo"/>
-          <w:sz w:val="20"/>
-        </w:rPr>
-        <w:t>Preço global para a condução integral do escopo delimitado: R$ 85.000,00.</w:t>
-      </w:r>
-    </w:p>
-    <w:p>
-      <w:pPr>
+        <w:rPr>
+          <w:rFonts w:ascii="Arvo" w:hAnsi="Arvo"/>
+          <w:sz w:val="20"/>
+          <w:szCs w:val="20"/>
+        </w:rPr>
+      </w:pPr>
+      <w:r>
+        <w:rPr>
+          <w:rFonts w:ascii="Arvo" w:hAnsi="Arvo"/>
+          <w:sz w:val="20"/>
+          <w:szCs w:val="20"/>
+        </w:rPr>
+        <w:t xml:space="preserve">Preço global para a condução integral do escopo delimitado: R$ 85.000,00.</w:t>
+      </w:r>
+    </w:p>
+    <w:p>
+      <w:pPr>
+        <w:spacing w:line="276" w:lineRule="auto"/>
         <w:jc w:val="both"/>
-      </w:pPr>
-      <w:r>
-        <w:rPr>
-          <w:rFonts w:ascii="Arvo" w:hAnsi="Arvo"/>
-          <w:sz w:val="20"/>
-        </w:rPr>
-        <w:t>Ações e fases cobertas: Conhecimento e Execução em primeira e segunda instâncias (TRT/TRF), incluindo embargos de declaração e demais incidentes.</w:t>
-      </w:r>
-    </w:p>
-    <w:p>
-      <w:pPr>
+        <w:rPr>
+          <w:rFonts w:ascii="Arvo" w:hAnsi="Arvo"/>
+          <w:sz w:val="20"/>
+          <w:szCs w:val="20"/>
+        </w:rPr>
+      </w:pPr>
+      <w:r>
+        <w:rPr>
+          <w:rFonts w:ascii="Arvo" w:hAnsi="Arvo"/>
+          <w:sz w:val="20"/>
+          <w:szCs w:val="20"/>
+        </w:rPr>
+        <w:t xml:space="preserve">Ações e fases cobertas: Conhecimento e Execução em primeira e segunda instâncias (TRT/TRF), incluindo embargos de declaração e demais incidentes.</w:t>
+      </w:r>
+    </w:p>
+    <w:p>
+      <w:pPr>
+        <w:spacing w:line="276" w:lineRule="auto"/>
         <w:jc w:val="both"/>
-      </w:pPr>
-      <w:r>
-        <w:rPr>
-          <w:rFonts w:ascii="Arvo" w:hAnsi="Arvo"/>
-          <w:sz w:val="20"/>
-        </w:rPr>
-        <w:t>Forma de pagamento: 40% no ato da assinatura da proposta; 30% após sentença de primeiro grau; 30% após trânsito em julgado.</w:t>
-      </w:r>
-    </w:p>
-    <w:p>
-      <w:r>
-        <w:rPr>
-          <w:rFonts w:ascii="Arvo" w:hAnsi="Arvo"/>
-          <w:sz w:val="20"/>
-        </w:rPr>
-      </w:r>
+        <w:rPr>
+          <w:rFonts w:ascii="Arvo" w:hAnsi="Arvo"/>
+          <w:sz w:val="20"/>
+          <w:szCs w:val="20"/>
+        </w:rPr>
+      </w:pPr>
+      <w:r>
+        <w:rPr>
+          <w:rFonts w:ascii="Arvo" w:hAnsi="Arvo"/>
+          <w:sz w:val="20"/>
+          <w:szCs w:val="20"/>
+        </w:rPr>
+        <w:t xml:space="preserve">Forma de pagamento: 40% no ato da assinatura da proposta; 30% após sentença de primeiro grau; 30% após trânsito em julgado.</w:t>
+      </w:r>
+    </w:p>
+    <w:p>
+      <w:pPr>
+        <w:spacing w:line="276" w:lineRule="auto"/>
+        <w:rPr>
+          <w:rFonts w:ascii="Arvo" w:hAnsi="Arvo"/>
+          <w:sz w:val="20"/>
+          <w:szCs w:val="20"/>
+        </w:rPr>
+      </w:pPr>
     </w:p>
     <w:p>
       <w:pPr>

</xml_diff>

<commit_message>
Subdocs: replica todas as 4 tabelas do modo single (label/valor)
Faltavam as tabelas verticais 'label/valor' do modo de escopo único:
- Fixo Mensal Consultivo: Valor Mensal / Cap de Horas / Valor da Hora Excedente
- Preço Global Consultivo: Valor Total / Cap de Horas / Cronograma
- Preço Mensal Contencioso: Valor Mensal Fixo / Nº Máximo / Critério
- Preço Global Contencioso: Valor Total / Ações e Fases / Cronograma

Agora qualquer modalidade selecionada em qualquer escopo (consultivo ou
contencioso) renderiza a mesma tabela que renderizava no modo de escopo
único, com estilo idêntico (fundo creme FFF9F4 na coluna label, bordas
1A3557, fonte Arvo).

Adicionado também um parágrafo em branco entre o texto introdutório
e cada tabela, conforme padrão do template original.

Implementação: pmra/template_engine.py
- nova função _kv_table_xml() para tabelas label/valor verticais

https://claude.ai/code/session_012AQuGGrkZo1QrHGcyvhfSB
</commit_message>
<xml_diff>
--- a/Proposta_Demo_Multi_Escopo.docx
+++ b/Proposta_Demo_Multi_Escopo.docx
@@ -843,6 +843,16 @@
         </w:rPr>
         <w:t xml:space="preserve">Os honorários serão apurados conforme a tabela de senioridade abaixo, com base em relatório mensal de horas executadas.</w:t>
       </w:r>
+    </w:p>
+    <w:p>
+      <w:pPr>
+        <w:spacing w:line="276" w:lineRule="auto"/>
+        <w:rPr>
+          <w:rFonts w:ascii="Arvo" w:hAnsi="Arvo"/>
+          <w:sz w:val="20"/>
+          <w:szCs w:val="20"/>
+        </w:rPr>
+      </w:pPr>
     </w:p>
     <w:tbl>
       <w:tblPr>
@@ -1423,9 +1433,274 @@
           <w:sz w:val="20"/>
           <w:szCs w:val="20"/>
         </w:rPr>
-        <w:t xml:space="preserve">Honorários fixos mensais de R$ 18.500,00, abrangendo até 35 horas de trabalho consultivo por mês. Horas excedentes ao cap serão cobradas a R$ 650,00 por hora.</w:t>
-      </w:r>
-    </w:p>
+        <w:t xml:space="preserve">Os honorários serão fixados em valor mensal pré-estabelecido, abrangendo um cap de horas inclusas. Horas excedentes ao cap serão cobradas separadamente.</w:t>
+      </w:r>
+    </w:p>
+    <w:p>
+      <w:pPr>
+        <w:spacing w:line="276" w:lineRule="auto"/>
+        <w:rPr>
+          <w:rFonts w:ascii="Arvo" w:hAnsi="Arvo"/>
+          <w:sz w:val="20"/>
+          <w:szCs w:val="20"/>
+        </w:rPr>
+      </w:pPr>
+    </w:p>
+    <w:tbl>
+      <w:tblPr>
+        <w:tblW w:w="9634" w:type="dxa"/>
+        <w:tblBorders>
+          <w:top w:val="single" w:sz="4" w:space="0" w:color="auto"/>
+          <w:left w:val="single" w:sz="4" w:space="0" w:color="auto"/>
+          <w:right w:val="single" w:sz="4" w:space="0" w:color="auto"/>
+          <w:insideH w:val="single" w:sz="4" w:space="0" w:color="auto"/>
+          <w:insideV w:val="single" w:sz="4" w:space="0" w:color="auto"/>
+        </w:tblBorders>
+        <w:tblCellMar>
+          <w:left w:w="10" w:type="dxa"/>
+          <w:right w:w="10" w:type="dxa"/>
+        </w:tblCellMar>
+        <w:tblLook w:val="04A0" w:firstRow="0" w:lastRow="0" w:firstColumn="1" w:lastColumn="0" w:noHBand="0" w:noVBand="1"/>
+      </w:tblPr>
+      <w:tblGrid>
+        <w:gridCol w:w="3256"/>
+        <w:gridCol w:w="6378"/>
+      </w:tblGrid>
+      <w:tr>
+        <w:tc>
+          <w:tcPr>
+            <w:tcW w:w="3256" w:type="dxa"/>
+            <w:tcBorders>
+              <w:top w:val="single" w:sz="4" w:space="0" w:color="1A3557"/>
+              <w:left w:val="single" w:sz="4" w:space="0" w:color="1A3557"/>
+              <w:bottom w:val="single" w:sz="4" w:space="0" w:color="1A3557"/>
+              <w:right w:val="single" w:sz="4" w:space="0" w:color="1A3557"/>
+            </w:tcBorders>
+            <w:shd w:val="clear" w:color="auto" w:fill="FFF9F4"/>
+            <w:tcMar>
+              <w:top w:w="100" w:type="dxa"/>
+              <w:left w:w="120" w:type="dxa"/>
+              <w:bottom w:w="100" w:type="dxa"/>
+              <w:right w:w="120" w:type="dxa"/>
+            </w:tcMar>
+          </w:tcPr>
+          <w:p>
+            <w:pPr>
+              <w:spacing w:line="276" w:lineRule="auto"/>
+              <w:rPr>
+                <w:rFonts w:ascii="Arvo" w:hAnsi="Arvo"/>
+                <w:b/>
+                <w:bCs/>
+                <w:sz w:val="20"/>
+                <w:szCs w:val="20"/>
+              </w:rPr>
+            </w:pPr>
+            <w:r>
+              <w:rPr>
+                <w:rFonts w:ascii="Arvo" w:hAnsi="Arvo"/>
+                <w:b/>
+                <w:bCs/>
+                <w:sz w:val="20"/>
+                <w:szCs w:val="20"/>
+              </w:rPr>
+              <w:t xml:space="preserve">Valor Mensal</w:t>
+            </w:r>
+          </w:p>
+        </w:tc>
+        <w:tc>
+          <w:tcPr>
+            <w:tcW w:w="6378" w:type="dxa"/>
+            <w:tcBorders>
+              <w:top w:val="single" w:sz="4" w:space="0" w:color="1A3557"/>
+              <w:left w:val="single" w:sz="4" w:space="0" w:color="1A3557"/>
+              <w:bottom w:val="single" w:sz="4" w:space="0" w:color="1A3557"/>
+              <w:right w:val="single" w:sz="4" w:space="0" w:color="1A3557"/>
+            </w:tcBorders>
+            <w:tcMar>
+              <w:top w:w="100" w:type="dxa"/>
+              <w:left w:w="120" w:type="dxa"/>
+              <w:bottom w:w="100" w:type="dxa"/>
+              <w:right w:w="120" w:type="dxa"/>
+            </w:tcMar>
+          </w:tcPr>
+          <w:p>
+            <w:pPr>
+              <w:spacing w:line="276" w:lineRule="auto"/>
+              <w:jc w:val="both"/>
+              <w:rPr>
+                <w:rFonts w:ascii="Arvo" w:hAnsi="Arvo"/>
+                <w:sz w:val="20"/>
+                <w:szCs w:val="20"/>
+              </w:rPr>
+            </w:pPr>
+            <w:r>
+              <w:rPr>
+                <w:rFonts w:ascii="Arvo" w:hAnsi="Arvo"/>
+                <w:sz w:val="20"/>
+                <w:szCs w:val="20"/>
+              </w:rPr>
+              <w:t xml:space="preserve">R$ 18.500,00</w:t>
+            </w:r>
+          </w:p>
+        </w:tc>
+      </w:tr>
+      <w:tr>
+        <w:tc>
+          <w:tcPr>
+            <w:tcW w:w="3256" w:type="dxa"/>
+            <w:tcBorders>
+              <w:top w:val="single" w:sz="4" w:space="0" w:color="1A3557"/>
+              <w:left w:val="single" w:sz="4" w:space="0" w:color="1A3557"/>
+              <w:bottom w:val="single" w:sz="4" w:space="0" w:color="1A3557"/>
+              <w:right w:val="single" w:sz="4" w:space="0" w:color="1A3557"/>
+            </w:tcBorders>
+            <w:shd w:val="clear" w:color="auto" w:fill="FFF9F4"/>
+            <w:tcMar>
+              <w:top w:w="100" w:type="dxa"/>
+              <w:left w:w="120" w:type="dxa"/>
+              <w:bottom w:w="100" w:type="dxa"/>
+              <w:right w:w="120" w:type="dxa"/>
+            </w:tcMar>
+          </w:tcPr>
+          <w:p>
+            <w:pPr>
+              <w:spacing w:line="276" w:lineRule="auto"/>
+              <w:rPr>
+                <w:rFonts w:ascii="Arvo" w:hAnsi="Arvo"/>
+                <w:b/>
+                <w:bCs/>
+                <w:sz w:val="20"/>
+                <w:szCs w:val="20"/>
+              </w:rPr>
+            </w:pPr>
+            <w:r>
+              <w:rPr>
+                <w:rFonts w:ascii="Arvo" w:hAnsi="Arvo"/>
+                <w:b/>
+                <w:bCs/>
+                <w:sz w:val="20"/>
+                <w:szCs w:val="20"/>
+              </w:rPr>
+              <w:t xml:space="preserve">Cap de Horas</w:t>
+            </w:r>
+          </w:p>
+        </w:tc>
+        <w:tc>
+          <w:tcPr>
+            <w:tcW w:w="6378" w:type="dxa"/>
+            <w:tcBorders>
+              <w:top w:val="single" w:sz="4" w:space="0" w:color="1A3557"/>
+              <w:left w:val="single" w:sz="4" w:space="0" w:color="1A3557"/>
+              <w:bottom w:val="single" w:sz="4" w:space="0" w:color="1A3557"/>
+              <w:right w:val="single" w:sz="4" w:space="0" w:color="1A3557"/>
+            </w:tcBorders>
+            <w:tcMar>
+              <w:top w:w="100" w:type="dxa"/>
+              <w:left w:w="120" w:type="dxa"/>
+              <w:bottom w:w="100" w:type="dxa"/>
+              <w:right w:w="120" w:type="dxa"/>
+            </w:tcMar>
+          </w:tcPr>
+          <w:p>
+            <w:pPr>
+              <w:spacing w:line="276" w:lineRule="auto"/>
+              <w:jc w:val="both"/>
+              <w:rPr>
+                <w:rFonts w:ascii="Arvo" w:hAnsi="Arvo"/>
+                <w:sz w:val="20"/>
+                <w:szCs w:val="20"/>
+              </w:rPr>
+            </w:pPr>
+            <w:r>
+              <w:rPr>
+                <w:rFonts w:ascii="Arvo" w:hAnsi="Arvo"/>
+                <w:sz w:val="20"/>
+                <w:szCs w:val="20"/>
+              </w:rPr>
+              <w:t xml:space="preserve">35 horas horas</w:t>
+            </w:r>
+          </w:p>
+        </w:tc>
+      </w:tr>
+      <w:tr>
+        <w:tc>
+          <w:tcPr>
+            <w:tcW w:w="3256" w:type="dxa"/>
+            <w:tcBorders>
+              <w:top w:val="single" w:sz="4" w:space="0" w:color="1A3557"/>
+              <w:left w:val="single" w:sz="4" w:space="0" w:color="1A3557"/>
+              <w:bottom w:val="single" w:sz="4" w:space="0" w:color="1A3557"/>
+              <w:right w:val="single" w:sz="4" w:space="0" w:color="1A3557"/>
+            </w:tcBorders>
+            <w:shd w:val="clear" w:color="auto" w:fill="FFF9F4"/>
+            <w:tcMar>
+              <w:top w:w="100" w:type="dxa"/>
+              <w:left w:w="120" w:type="dxa"/>
+              <w:bottom w:w="100" w:type="dxa"/>
+              <w:right w:w="120" w:type="dxa"/>
+            </w:tcMar>
+          </w:tcPr>
+          <w:p>
+            <w:pPr>
+              <w:spacing w:line="276" w:lineRule="auto"/>
+              <w:rPr>
+                <w:rFonts w:ascii="Arvo" w:hAnsi="Arvo"/>
+                <w:b/>
+                <w:bCs/>
+                <w:sz w:val="20"/>
+                <w:szCs w:val="20"/>
+              </w:rPr>
+            </w:pPr>
+            <w:r>
+              <w:rPr>
+                <w:rFonts w:ascii="Arvo" w:hAnsi="Arvo"/>
+                <w:b/>
+                <w:bCs/>
+                <w:sz w:val="20"/>
+                <w:szCs w:val="20"/>
+              </w:rPr>
+              <w:t xml:space="preserve">Valor da Hora Excedente</w:t>
+            </w:r>
+          </w:p>
+        </w:tc>
+        <w:tc>
+          <w:tcPr>
+            <w:tcW w:w="6378" w:type="dxa"/>
+            <w:tcBorders>
+              <w:top w:val="single" w:sz="4" w:space="0" w:color="1A3557"/>
+              <w:left w:val="single" w:sz="4" w:space="0" w:color="1A3557"/>
+              <w:bottom w:val="single" w:sz="4" w:space="0" w:color="1A3557"/>
+              <w:right w:val="single" w:sz="4" w:space="0" w:color="1A3557"/>
+            </w:tcBorders>
+            <w:tcMar>
+              <w:top w:w="100" w:type="dxa"/>
+              <w:left w:w="120" w:type="dxa"/>
+              <w:bottom w:w="100" w:type="dxa"/>
+              <w:right w:w="120" w:type="dxa"/>
+            </w:tcMar>
+          </w:tcPr>
+          <w:p>
+            <w:pPr>
+              <w:spacing w:line="276" w:lineRule="auto"/>
+              <w:jc w:val="both"/>
+              <w:rPr>
+                <w:rFonts w:ascii="Arvo" w:hAnsi="Arvo"/>
+                <w:sz w:val="20"/>
+                <w:szCs w:val="20"/>
+              </w:rPr>
+            </w:pPr>
+            <w:r>
+              <w:rPr>
+                <w:rFonts w:ascii="Arvo" w:hAnsi="Arvo"/>
+                <w:sz w:val="20"/>
+                <w:szCs w:val="20"/>
+              </w:rPr>
+              <w:t xml:space="preserve">R$ 650,00</w:t>
+            </w:r>
+          </w:p>
+        </w:tc>
+      </w:tr>
+    </w:tbl>
     <w:p>
       <w:pPr>
         <w:spacing w:line="276" w:lineRule="auto"/>
@@ -2348,8 +2623,18 @@
           <w:sz w:val="20"/>
           <w:szCs w:val="20"/>
         </w:rPr>
-        <w:t xml:space="preserve">Os honorários serão apurados em valor mensal por processo, conforme natureza e fase, de acordo com a tabela abaixo:</w:t>
-      </w:r>
+        <w:t xml:space="preserve">Os honorários serão apurados conforme valor mensal por processo em curso, conforme a natureza da ação e fase processual coberta pela atuação, nos termos abaixo.</w:t>
+      </w:r>
+    </w:p>
+    <w:p>
+      <w:pPr>
+        <w:spacing w:line="276" w:lineRule="auto"/>
+        <w:rPr>
+          <w:rFonts w:ascii="Arvo" w:hAnsi="Arvo"/>
+          <w:sz w:val="20"/>
+          <w:szCs w:val="20"/>
+        </w:rPr>
+      </w:pPr>
     </w:p>
     <w:tbl>
       <w:tblPr>
@@ -2410,7 +2695,7 @@
                 <w:sz w:val="20"/>
                 <w:szCs w:val="20"/>
               </w:rPr>
-              <w:t xml:space="preserve">Natureza da ação</w:t>
+              <w:t xml:space="preserve">Natureza da Ação</w:t>
             </w:r>
           </w:p>
         </w:tc>
@@ -2492,7 +2777,7 @@
                 <w:sz w:val="20"/>
                 <w:szCs w:val="20"/>
               </w:rPr>
-              <w:t xml:space="preserve">Valor</w:t>
+              <w:t xml:space="preserve">Valor por Ação (R$)</w:t>
             </w:r>
           </w:p>
         </w:tc>
@@ -2990,8 +3275,18 @@
           <w:sz w:val="20"/>
           <w:szCs w:val="20"/>
         </w:rPr>
-        <w:t xml:space="preserve">Os honorários serão apurados por ato processual efetivamente praticado, conforme tabela:</w:t>
-      </w:r>
+        <w:t xml:space="preserve">Os honorários serão apurados por ato processual efetivamente praticado pelo Contratado, conforme os valores abaixo.</w:t>
+      </w:r>
+    </w:p>
+    <w:p>
+      <w:pPr>
+        <w:spacing w:line="276" w:lineRule="auto"/>
+        <w:rPr>
+          <w:rFonts w:ascii="Arvo" w:hAnsi="Arvo"/>
+          <w:sz w:val="20"/>
+          <w:szCs w:val="20"/>
+        </w:rPr>
+      </w:pPr>
     </w:p>
     <w:tbl>
       <w:tblPr>
@@ -3134,7 +3429,7 @@
                 <w:sz w:val="20"/>
                 <w:szCs w:val="20"/>
               </w:rPr>
-              <w:t xml:space="preserve">Valor</w:t>
+              <w:t xml:space="preserve">Valor (R$)</w:t>
             </w:r>
           </w:p>
         </w:tc>
@@ -4076,47 +4371,274 @@
           <w:sz w:val="20"/>
           <w:szCs w:val="20"/>
         </w:rPr>
-        <w:t xml:space="preserve">Preço global para a condução integral do escopo delimitado: R$ 85.000,00.</w:t>
-      </w:r>
-    </w:p>
-    <w:p>
-      <w:pPr>
-        <w:spacing w:line="276" w:lineRule="auto"/>
-        <w:jc w:val="both"/>
-        <w:rPr>
-          <w:rFonts w:ascii="Arvo" w:hAnsi="Arvo"/>
-          <w:sz w:val="20"/>
-          <w:szCs w:val="20"/>
-        </w:rPr>
-      </w:pPr>
-      <w:r>
-        <w:rPr>
-          <w:rFonts w:ascii="Arvo" w:hAnsi="Arvo"/>
-          <w:sz w:val="20"/>
-          <w:szCs w:val="20"/>
-        </w:rPr>
-        <w:t xml:space="preserve">Ações e fases cobertas: Conhecimento e Execução em primeira e segunda instâncias (TRT/TRF), incluindo embargos de declaração e demais incidentes.</w:t>
-      </w:r>
-    </w:p>
-    <w:p>
-      <w:pPr>
-        <w:spacing w:line="276" w:lineRule="auto"/>
-        <w:jc w:val="both"/>
-        <w:rPr>
-          <w:rFonts w:ascii="Arvo" w:hAnsi="Arvo"/>
-          <w:sz w:val="20"/>
-          <w:szCs w:val="20"/>
-        </w:rPr>
-      </w:pPr>
-      <w:r>
-        <w:rPr>
-          <w:rFonts w:ascii="Arvo" w:hAnsi="Arvo"/>
-          <w:sz w:val="20"/>
-          <w:szCs w:val="20"/>
-        </w:rPr>
-        <w:t xml:space="preserve">Forma de pagamento: 40% no ato da assinatura da proposta; 30% após sentença de primeiro grau; 30% após trânsito em julgado.</w:t>
-      </w:r>
-    </w:p>
+        <w:t xml:space="preserve">Os honorários serão fixados em valor global fechado para a condução integral do escopo delimitado, distribuído conforme o cronograma de pagamento abaixo.</w:t>
+      </w:r>
+    </w:p>
+    <w:p>
+      <w:pPr>
+        <w:spacing w:line="276" w:lineRule="auto"/>
+        <w:rPr>
+          <w:rFonts w:ascii="Arvo" w:hAnsi="Arvo"/>
+          <w:sz w:val="20"/>
+          <w:szCs w:val="20"/>
+        </w:rPr>
+      </w:pPr>
+    </w:p>
+    <w:tbl>
+      <w:tblPr>
+        <w:tblW w:w="9634" w:type="dxa"/>
+        <w:tblBorders>
+          <w:top w:val="single" w:sz="4" w:space="0" w:color="auto"/>
+          <w:left w:val="single" w:sz="4" w:space="0" w:color="auto"/>
+          <w:right w:val="single" w:sz="4" w:space="0" w:color="auto"/>
+          <w:insideH w:val="single" w:sz="4" w:space="0" w:color="auto"/>
+          <w:insideV w:val="single" w:sz="4" w:space="0" w:color="auto"/>
+        </w:tblBorders>
+        <w:tblCellMar>
+          <w:left w:w="10" w:type="dxa"/>
+          <w:right w:w="10" w:type="dxa"/>
+        </w:tblCellMar>
+        <w:tblLook w:val="04A0" w:firstRow="0" w:lastRow="0" w:firstColumn="1" w:lastColumn="0" w:noHBand="0" w:noVBand="1"/>
+      </w:tblPr>
+      <w:tblGrid>
+        <w:gridCol w:w="3256"/>
+        <w:gridCol w:w="6378"/>
+      </w:tblGrid>
+      <w:tr>
+        <w:tc>
+          <w:tcPr>
+            <w:tcW w:w="3256" w:type="dxa"/>
+            <w:tcBorders>
+              <w:top w:val="single" w:sz="4" w:space="0" w:color="1A3557"/>
+              <w:left w:val="single" w:sz="4" w:space="0" w:color="1A3557"/>
+              <w:bottom w:val="single" w:sz="4" w:space="0" w:color="1A3557"/>
+              <w:right w:val="single" w:sz="4" w:space="0" w:color="1A3557"/>
+            </w:tcBorders>
+            <w:shd w:val="clear" w:color="auto" w:fill="FFF9F4"/>
+            <w:tcMar>
+              <w:top w:w="100" w:type="dxa"/>
+              <w:left w:w="120" w:type="dxa"/>
+              <w:bottom w:w="100" w:type="dxa"/>
+              <w:right w:w="120" w:type="dxa"/>
+            </w:tcMar>
+          </w:tcPr>
+          <w:p>
+            <w:pPr>
+              <w:spacing w:line="276" w:lineRule="auto"/>
+              <w:rPr>
+                <w:rFonts w:ascii="Arvo" w:hAnsi="Arvo"/>
+                <w:b/>
+                <w:bCs/>
+                <w:sz w:val="20"/>
+                <w:szCs w:val="20"/>
+              </w:rPr>
+            </w:pPr>
+            <w:r>
+              <w:rPr>
+                <w:rFonts w:ascii="Arvo" w:hAnsi="Arvo"/>
+                <w:b/>
+                <w:bCs/>
+                <w:sz w:val="20"/>
+                <w:szCs w:val="20"/>
+              </w:rPr>
+              <w:t xml:space="preserve">Valor Total</w:t>
+            </w:r>
+          </w:p>
+        </w:tc>
+        <w:tc>
+          <w:tcPr>
+            <w:tcW w:w="6378" w:type="dxa"/>
+            <w:tcBorders>
+              <w:top w:val="single" w:sz="4" w:space="0" w:color="1A3557"/>
+              <w:left w:val="single" w:sz="4" w:space="0" w:color="1A3557"/>
+              <w:bottom w:val="single" w:sz="4" w:space="0" w:color="1A3557"/>
+              <w:right w:val="single" w:sz="4" w:space="0" w:color="1A3557"/>
+            </w:tcBorders>
+            <w:tcMar>
+              <w:top w:w="100" w:type="dxa"/>
+              <w:left w:w="120" w:type="dxa"/>
+              <w:bottom w:w="100" w:type="dxa"/>
+              <w:right w:w="120" w:type="dxa"/>
+            </w:tcMar>
+          </w:tcPr>
+          <w:p>
+            <w:pPr>
+              <w:spacing w:line="276" w:lineRule="auto"/>
+              <w:jc w:val="both"/>
+              <w:rPr>
+                <w:rFonts w:ascii="Arvo" w:hAnsi="Arvo"/>
+                <w:sz w:val="20"/>
+                <w:szCs w:val="20"/>
+              </w:rPr>
+            </w:pPr>
+            <w:r>
+              <w:rPr>
+                <w:rFonts w:ascii="Arvo" w:hAnsi="Arvo"/>
+                <w:sz w:val="20"/>
+                <w:szCs w:val="20"/>
+              </w:rPr>
+              <w:t xml:space="preserve">R$ 85.000,00</w:t>
+            </w:r>
+          </w:p>
+        </w:tc>
+      </w:tr>
+      <w:tr>
+        <w:tc>
+          <w:tcPr>
+            <w:tcW w:w="3256" w:type="dxa"/>
+            <w:tcBorders>
+              <w:top w:val="single" w:sz="4" w:space="0" w:color="1A3557"/>
+              <w:left w:val="single" w:sz="4" w:space="0" w:color="1A3557"/>
+              <w:bottom w:val="single" w:sz="4" w:space="0" w:color="1A3557"/>
+              <w:right w:val="single" w:sz="4" w:space="0" w:color="1A3557"/>
+            </w:tcBorders>
+            <w:shd w:val="clear" w:color="auto" w:fill="FFF9F4"/>
+            <w:tcMar>
+              <w:top w:w="100" w:type="dxa"/>
+              <w:left w:w="120" w:type="dxa"/>
+              <w:bottom w:w="100" w:type="dxa"/>
+              <w:right w:w="120" w:type="dxa"/>
+            </w:tcMar>
+          </w:tcPr>
+          <w:p>
+            <w:pPr>
+              <w:spacing w:line="276" w:lineRule="auto"/>
+              <w:rPr>
+                <w:rFonts w:ascii="Arvo" w:hAnsi="Arvo"/>
+                <w:b/>
+                <w:bCs/>
+                <w:sz w:val="20"/>
+                <w:szCs w:val="20"/>
+              </w:rPr>
+            </w:pPr>
+            <w:r>
+              <w:rPr>
+                <w:rFonts w:ascii="Arvo" w:hAnsi="Arvo"/>
+                <w:b/>
+                <w:bCs/>
+                <w:sz w:val="20"/>
+                <w:szCs w:val="20"/>
+              </w:rPr>
+              <w:t xml:space="preserve">Ações e Fases Cobertas</w:t>
+            </w:r>
+          </w:p>
+        </w:tc>
+        <w:tc>
+          <w:tcPr>
+            <w:tcW w:w="6378" w:type="dxa"/>
+            <w:tcBorders>
+              <w:top w:val="single" w:sz="4" w:space="0" w:color="1A3557"/>
+              <w:left w:val="single" w:sz="4" w:space="0" w:color="1A3557"/>
+              <w:bottom w:val="single" w:sz="4" w:space="0" w:color="1A3557"/>
+              <w:right w:val="single" w:sz="4" w:space="0" w:color="1A3557"/>
+            </w:tcBorders>
+            <w:tcMar>
+              <w:top w:w="100" w:type="dxa"/>
+              <w:left w:w="120" w:type="dxa"/>
+              <w:bottom w:w="100" w:type="dxa"/>
+              <w:right w:w="120" w:type="dxa"/>
+            </w:tcMar>
+          </w:tcPr>
+          <w:p>
+            <w:pPr>
+              <w:spacing w:line="276" w:lineRule="auto"/>
+              <w:jc w:val="both"/>
+              <w:rPr>
+                <w:rFonts w:ascii="Arvo" w:hAnsi="Arvo"/>
+                <w:sz w:val="20"/>
+                <w:szCs w:val="20"/>
+              </w:rPr>
+            </w:pPr>
+            <w:r>
+              <w:rPr>
+                <w:rFonts w:ascii="Arvo" w:hAnsi="Arvo"/>
+                <w:sz w:val="20"/>
+                <w:szCs w:val="20"/>
+              </w:rPr>
+              <w:t xml:space="preserve">Conhecimento e Execução em primeira e segunda instâncias (TRT/TRF), incluindo embargos de declaração e demais incidentes.</w:t>
+            </w:r>
+          </w:p>
+        </w:tc>
+      </w:tr>
+      <w:tr>
+        <w:tc>
+          <w:tcPr>
+            <w:tcW w:w="3256" w:type="dxa"/>
+            <w:tcBorders>
+              <w:top w:val="single" w:sz="4" w:space="0" w:color="1A3557"/>
+              <w:left w:val="single" w:sz="4" w:space="0" w:color="1A3557"/>
+              <w:bottom w:val="single" w:sz="4" w:space="0" w:color="1A3557"/>
+              <w:right w:val="single" w:sz="4" w:space="0" w:color="1A3557"/>
+            </w:tcBorders>
+            <w:shd w:val="clear" w:color="auto" w:fill="FFF9F4"/>
+            <w:tcMar>
+              <w:top w:w="100" w:type="dxa"/>
+              <w:left w:w="120" w:type="dxa"/>
+              <w:bottom w:w="100" w:type="dxa"/>
+              <w:right w:w="120" w:type="dxa"/>
+            </w:tcMar>
+          </w:tcPr>
+          <w:p>
+            <w:pPr>
+              <w:spacing w:line="276" w:lineRule="auto"/>
+              <w:rPr>
+                <w:rFonts w:ascii="Arvo" w:hAnsi="Arvo"/>
+                <w:b/>
+                <w:bCs/>
+                <w:sz w:val="20"/>
+                <w:szCs w:val="20"/>
+              </w:rPr>
+            </w:pPr>
+            <w:r>
+              <w:rPr>
+                <w:rFonts w:ascii="Arvo" w:hAnsi="Arvo"/>
+                <w:b/>
+                <w:bCs/>
+                <w:sz w:val="20"/>
+                <w:szCs w:val="20"/>
+              </w:rPr>
+              <w:t xml:space="preserve">Cronograma de pagamento</w:t>
+            </w:r>
+          </w:p>
+        </w:tc>
+        <w:tc>
+          <w:tcPr>
+            <w:tcW w:w="6378" w:type="dxa"/>
+            <w:tcBorders>
+              <w:top w:val="single" w:sz="4" w:space="0" w:color="1A3557"/>
+              <w:left w:val="single" w:sz="4" w:space="0" w:color="1A3557"/>
+              <w:bottom w:val="single" w:sz="4" w:space="0" w:color="1A3557"/>
+              <w:right w:val="single" w:sz="4" w:space="0" w:color="1A3557"/>
+            </w:tcBorders>
+            <w:tcMar>
+              <w:top w:w="100" w:type="dxa"/>
+              <w:left w:w="120" w:type="dxa"/>
+              <w:bottom w:w="100" w:type="dxa"/>
+              <w:right w:w="120" w:type="dxa"/>
+            </w:tcMar>
+          </w:tcPr>
+          <w:p>
+            <w:pPr>
+              <w:spacing w:line="276" w:lineRule="auto"/>
+              <w:jc w:val="both"/>
+              <w:rPr>
+                <w:rFonts w:ascii="Arvo" w:hAnsi="Arvo"/>
+                <w:sz w:val="20"/>
+                <w:szCs w:val="20"/>
+              </w:rPr>
+            </w:pPr>
+            <w:r>
+              <w:rPr>
+                <w:rFonts w:ascii="Arvo" w:hAnsi="Arvo"/>
+                <w:sz w:val="20"/>
+                <w:szCs w:val="20"/>
+              </w:rPr>
+              <w:t xml:space="preserve">40% no ato da assinatura da proposta; 30% após sentença de primeiro grau; 30% após trânsito em julgado.</w:t>
+            </w:r>
+          </w:p>
+        </w:tc>
+      </w:tr>
+    </w:tbl>
     <w:p>
       <w:pPr>
         <w:spacing w:line="276" w:lineRule="auto"/>

</xml_diff>

<commit_message>
Adiciona parágrafo em branco entre título e conteúdo de cada escopo/honorário
Em ambos os blocos:
- Escopo Consultivo/Contencioso X: → [blank] → descrição
- Honorários — Escopo Consultivo/Contencioso X → [blank] → conteúdo

Para os textos de escopo: edição em scripts/update_template.py
Para os títulos de honorários nos subdocs: edição em pmra/template_engine.py

https://claude.ai/code/session_012AQuGGrkZo1QrHGcyvhfSB
</commit_message>
<xml_diff>
--- a/Proposta_Demo_Multi_Escopo.docx
+++ b/Proposta_Demo_Multi_Escopo.docx
@@ -463,6 +463,16 @@
           <w:sz w:val="20"/>
           <w:szCs w:val="20"/>
         </w:rPr>
+      </w:pPr>
+    </w:p>
+    <w:p>
+      <w:pPr>
+        <w:spacing w:line="276" w:lineRule="auto"/>
+        <w:rPr>
+          <w:rFonts w:ascii="Arvo" w:hAnsi="Arvo"/>
+          <w:sz w:val="20"/>
+          <w:szCs w:val="20"/>
+        </w:rPr>
         <w:jc w:val="both"/>
       </w:pPr>
       <w:r>
@@ -513,6 +523,16 @@
           <w:sz w:val="20"/>
           <w:szCs w:val="20"/>
         </w:rPr>
+      </w:pPr>
+    </w:p>
+    <w:p>
+      <w:pPr>
+        <w:spacing w:line="276" w:lineRule="auto"/>
+        <w:rPr>
+          <w:rFonts w:ascii="Arvo" w:hAnsi="Arvo"/>
+          <w:sz w:val="20"/>
+          <w:szCs w:val="20"/>
+        </w:rPr>
         <w:jc w:val="both"/>
       </w:pPr>
       <w:r>
@@ -554,6 +574,16 @@
         </w:rPr>
         <w:t xml:space="preserve">Escopo Consultivo C:</w:t>
       </w:r>
+    </w:p>
+    <w:p>
+      <w:pPr>
+        <w:spacing w:line="276" w:lineRule="auto"/>
+        <w:rPr>
+          <w:rFonts w:ascii="Arvo" w:hAnsi="Arvo"/>
+          <w:sz w:val="20"/>
+          <w:szCs w:val="20"/>
+        </w:rPr>
+      </w:pPr>
     </w:p>
     <w:p>
       <w:pPr>
@@ -678,6 +708,16 @@
           <w:sz w:val="20"/>
           <w:szCs w:val="20"/>
         </w:rPr>
+      </w:pPr>
+    </w:p>
+    <w:p>
+      <w:pPr>
+        <w:spacing w:line="276" w:lineRule="auto"/>
+        <w:rPr>
+          <w:rFonts w:ascii="Arvo" w:hAnsi="Arvo"/>
+          <w:sz w:val="20"/>
+          <w:szCs w:val="20"/>
+        </w:rPr>
         <w:jc w:val="both"/>
       </w:pPr>
       <w:r>
@@ -730,6 +770,16 @@
           <w:sz w:val="20"/>
           <w:szCs w:val="20"/>
         </w:rPr>
+      </w:pPr>
+    </w:p>
+    <w:p>
+      <w:pPr>
+        <w:spacing w:line="276" w:lineRule="auto"/>
+        <w:rPr>
+          <w:rFonts w:ascii="Arvo" w:hAnsi="Arvo"/>
+          <w:sz w:val="20"/>
+          <w:szCs w:val="20"/>
+        </w:rPr>
         <w:jc w:val="both"/>
       </w:pPr>
       <w:r>
@@ -782,6 +832,16 @@
           <w:sz w:val="20"/>
           <w:szCs w:val="20"/>
         </w:rPr>
+      </w:pPr>
+    </w:p>
+    <w:p>
+      <w:pPr>
+        <w:spacing w:line="276" w:lineRule="auto"/>
+        <w:rPr>
+          <w:rFonts w:ascii="Arvo" w:hAnsi="Arvo"/>
+          <w:sz w:val="20"/>
+          <w:szCs w:val="20"/>
+        </w:rPr>
         <w:jc w:val="both"/>
       </w:pPr>
       <w:r>
@@ -824,6 +884,16 @@
         </w:rPr>
         <w:t xml:space="preserve">Honorários — Escopo Consultivo A</w:t>
       </w:r>
+    </w:p>
+    <w:p>
+      <w:pPr>
+        <w:spacing w:line="276" w:lineRule="auto"/>
+        <w:rPr>
+          <w:rFonts w:ascii="Arvo" w:hAnsi="Arvo"/>
+          <w:sz w:val="20"/>
+          <w:szCs w:val="20"/>
+        </w:rPr>
+      </w:pPr>
     </w:p>
     <w:p>
       <w:pPr>
@@ -1369,6 +1439,16 @@
     <w:p>
       <w:pPr>
         <w:spacing w:line="276" w:lineRule="auto"/>
+        <w:rPr>
+          <w:rFonts w:ascii="Arvo" w:hAnsi="Arvo"/>
+          <w:sz w:val="20"/>
+          <w:szCs w:val="20"/>
+        </w:rPr>
+      </w:pPr>
+    </w:p>
+    <w:p>
+      <w:pPr>
+        <w:spacing w:line="276" w:lineRule="auto"/>
         <w:jc w:val="both"/>
         <w:rPr>
           <w:rFonts w:ascii="Arvo" w:hAnsi="Arvo"/>
@@ -1416,6 +1496,16 @@
         </w:rPr>
         <w:t xml:space="preserve">Honorários — Escopo Consultivo C</w:t>
       </w:r>
+    </w:p>
+    <w:p>
+      <w:pPr>
+        <w:spacing w:line="276" w:lineRule="auto"/>
+        <w:rPr>
+          <w:rFonts w:ascii="Arvo" w:hAnsi="Arvo"/>
+          <w:sz w:val="20"/>
+          <w:szCs w:val="20"/>
+        </w:rPr>
+      </w:pPr>
     </w:p>
     <w:p>
       <w:pPr>
@@ -2610,6 +2700,16 @@
     <w:p>
       <w:pPr>
         <w:spacing w:line="276" w:lineRule="auto"/>
+        <w:rPr>
+          <w:rFonts w:ascii="Arvo" w:hAnsi="Arvo"/>
+          <w:sz w:val="20"/>
+          <w:szCs w:val="20"/>
+        </w:rPr>
+      </w:pPr>
+    </w:p>
+    <w:p>
+      <w:pPr>
+        <w:spacing w:line="276" w:lineRule="auto"/>
         <w:jc w:val="both"/>
         <w:rPr>
           <w:rFonts w:ascii="Arvo" w:hAnsi="Arvo"/>
@@ -3262,6 +3362,16 @@
     <w:p>
       <w:pPr>
         <w:spacing w:line="276" w:lineRule="auto"/>
+        <w:rPr>
+          <w:rFonts w:ascii="Arvo" w:hAnsi="Arvo"/>
+          <w:sz w:val="20"/>
+          <w:szCs w:val="20"/>
+        </w:rPr>
+      </w:pPr>
+    </w:p>
+    <w:p>
+      <w:pPr>
+        <w:spacing w:line="276" w:lineRule="auto"/>
         <w:jc w:val="both"/>
         <w:rPr>
           <w:rFonts w:ascii="Arvo" w:hAnsi="Arvo"/>
@@ -4354,6 +4464,16 @@
         </w:rPr>
         <w:t xml:space="preserve">Honorários — Escopo Contencioso C</w:t>
       </w:r>
+    </w:p>
+    <w:p>
+      <w:pPr>
+        <w:spacing w:line="276" w:lineRule="auto"/>
+        <w:rPr>
+          <w:rFonts w:ascii="Arvo" w:hAnsi="Arvo"/>
+          <w:sz w:val="20"/>
+          <w:szCs w:val="20"/>
+        </w:rPr>
+      </w:pPr>
     </w:p>
     <w:p>
       <w:pPr>

</xml_diff>

<commit_message>
feat: títulos de seção sublinhados, SLA dinâmico e correção pkg_resources
- Fix: adiciona setuptools ao requirements.txt para compatibilidade com
  Python 3.14 (pkg_resources foi removido da stdlib)
- Task 1: adiciona cabeçalho "Honorários Propostos para os Escopos
  Consultivos/Contenciosos" (bold + sublinhado) nos blocos multi-escopo
- Task 2: parágrafo {{p hon.subdoc}} passa a usar _make_tag_para (sz=2)
  para que [HONORARIO_BLOCO] fique invisível no Markers como demais tags
- Task 3: título SLA agora dinâmico via {{escopo.sla_titulo}} —
  "do Escopo Consultivo" (simples) / "dos Escopos Consultivos" (multi);
  parágrafo em branco inserido entre o título SLA e o texto descritivo
- markers_map.py: adiciona mapeamento [SLA_TITULO] para {{escopo.sla_titulo}}
- Template e Markers regenerados; demo atualizado

https://claude.ai/code/session_012AQuGGrkZo1QrHGcyvhfSB
</commit_message>
<xml_diff>
--- a/Proposta_Demo_Multi_Escopo.docx
+++ b/Proposta_Demo_Multi_Escopo.docx
@@ -626,17 +626,29 @@
           <w:sz w:val="20"/>
           <w:szCs w:val="20"/>
         </w:rPr>
+        <w:jc w:val="both"/>
       </w:pPr>
       <w:r>
         <w:rPr>
           <w:rFonts w:ascii="Arvo" w:hAnsi="Arvo"/>
           <w:b/>
           <w:bCs/>
-          <w:sz w:val="20"/>
-          <w:szCs w:val="20"/>
-        </w:rPr>
-        <w:t xml:space="preserve">Prazos de Entrega/SLA: </w:t>
-      </w:r>
+          <w:u w:val="single"/>
+          <w:sz w:val="20"/>
+          <w:szCs w:val="20"/>
+        </w:rPr>
+        <w:t xml:space="preserve">Prazos de Entrega/SLA dos Escopos Consultivos</w:t>
+      </w:r>
+    </w:p>
+    <w:p>
+      <w:pPr>
+        <w:spacing w:line="276" w:lineRule="auto"/>
+        <w:rPr>
+          <w:rFonts w:ascii="Arvo" w:hAnsi="Arvo"/>
+          <w:sz w:val="20"/>
+          <w:szCs w:val="20"/>
+        </w:rPr>
+      </w:pPr>
     </w:p>
     <w:p>
       <w:pPr>
@@ -851,6 +863,38 @@
           <w:szCs w:val="20"/>
         </w:rPr>
         <w:t xml:space="preserve">Litígio tributário projeto-único: condução integral de mandado de segurança e subsequente ação ordinária visando recuperação de créditos de PIS/COFINS sobre ICMS, com acompanhamento em todas as instâncias até o STF.</w:t>
+      </w:r>
+    </w:p>
+    <w:p>
+      <w:pPr>
+        <w:spacing w:line="276" w:lineRule="auto"/>
+        <w:rPr>
+          <w:rFonts w:ascii="Arvo" w:hAnsi="Arvo"/>
+          <w:sz w:val="20"/>
+          <w:szCs w:val="20"/>
+        </w:rPr>
+      </w:pPr>
+    </w:p>
+    <w:p>
+      <w:pPr>
+        <w:spacing w:line="276" w:lineRule="auto"/>
+        <w:rPr>
+          <w:rFonts w:ascii="Arvo" w:hAnsi="Arvo"/>
+          <w:sz w:val="20"/>
+          <w:szCs w:val="20"/>
+        </w:rPr>
+        <w:jc w:val="both"/>
+      </w:pPr>
+      <w:r>
+        <w:rPr>
+          <w:rFonts w:ascii="Arvo" w:hAnsi="Arvo"/>
+          <w:b/>
+          <w:bCs/>
+          <w:u w:val="single"/>
+          <w:sz w:val="20"/>
+          <w:szCs w:val="20"/>
+        </w:rPr>
+        <w:t xml:space="preserve">Honorários Propostos para os Escopos Consultivos</w:t>
       </w:r>
     </w:p>
     <w:p>
@@ -2667,6 +2711,40 @@
     <w:p>
       <w:pPr>
         <w:snapToGrid w:val="0"/>
+        <w:spacing w:line="276" w:lineRule="auto"/>
+        <w:rPr>
+          <w:rFonts w:ascii="Arvo" w:hAnsi="Arvo"/>
+          <w:sz w:val="20"/>
+          <w:szCs w:val="20"/>
+        </w:rPr>
+      </w:pPr>
+    </w:p>
+    <w:p>
+      <w:pPr>
+        <w:spacing w:line="276" w:lineRule="auto"/>
+        <w:rPr>
+          <w:rFonts w:ascii="Arvo" w:hAnsi="Arvo"/>
+          <w:b/>
+          <w:bCs/>
+          <w:sz w:val="20"/>
+          <w:szCs w:val="20"/>
+        </w:rPr>
+        <w:jc w:val="both"/>
+      </w:pPr>
+      <w:r>
+        <w:rPr>
+          <w:rFonts w:ascii="Arvo" w:hAnsi="Arvo"/>
+          <w:b/>
+          <w:bCs/>
+          <w:u w:val="single"/>
+          <w:sz w:val="20"/>
+          <w:szCs w:val="20"/>
+        </w:rPr>
+        <w:t xml:space="preserve">Honorários Propostos para os Escopos Contenciosos</w:t>
+      </w:r>
+    </w:p>
+    <w:p>
+      <w:pPr>
         <w:spacing w:line="276" w:lineRule="auto"/>
         <w:rPr>
           <w:rFonts w:ascii="Arvo" w:hAnsi="Arvo"/>

</xml_diff>

<commit_message>
feat: ajusta nota SLA e parágrafo em branco após Condições Específicas
- Nota azul do SLA: orienta sobre múltiplos escopos com SLAs distintos
- Adiciona parágrafo em branco entre título "Condições Específicas" e
  o texto descritivo, espelhando o tratamento do SLA
- Template e Markers regenerados; demo atualizado

https://claude.ai/code/session_012AQuGGrkZo1QrHGcyvhfSB
</commit_message>
<xml_diff>
--- a/Proposta_Demo_Multi_Escopo.docx
+++ b/Proposta_Demo_Multi_Escopo.docx
@@ -5346,6 +5346,16 @@
         </w:rPr>
         <w:t>Condições Específicas</w:t>
       </w:r>
+    </w:p>
+    <w:p>
+      <w:pPr>
+        <w:spacing w:line="276" w:lineRule="auto"/>
+        <w:rPr>
+          <w:rFonts w:ascii="Arvo" w:hAnsi="Arvo"/>
+          <w:sz w:val="20"/>
+          <w:szCs w:val="20"/>
+        </w:rPr>
+      </w:pPr>
     </w:p>
     <w:p>
       <w:pPr>

</xml_diff>